<commit_message>
Use the Zion 85 responses to Engel (Feldman, Barzilay) in chapter 1 and the Rola and Arab-press studies in chapter 3
Co-Authored-By: Claude Fable 5.1 <noreply@anthropic.com>
Claude-Session: https://claude.ai/code/session_014Ur3fhHcvLKdVTb2L63jaV
</commit_message>
<xml_diff>
--- a/seminar/מבוא ופרק ראשון - להגשה.docx
+++ b/seminar/מבוא ופרק ראשון - להגשה.docx
@@ -598,7 +598,23 @@
           <w:szCs w:val="24"/>
           <w:rtl/>
         </w:rPr>
-        <w:t xml:space="preserve">דוד אנגל טען, מנגד, שעצם השימוש במושג "אנטישמיות" כקטגוריה אנליטית מטשטש יותר משהוא מאיר. המושג כורך יחד חקיקה מפלה, אלימות המונים, תעמולה מפלגתית ודעות קדומות פרטיות, ומניח מראש קו רצף ביניהן במקום להסביר כל תופעה בהקשרה. אנגל הציע לזנוח את המושג ולחקור את יחסי היהודים עם סביבתם באופן קונקרטי. סוזנה השל השיבה שהוויתור על המושג עלול להעלים מן המחקר דווקא את הממדים הרגשיים והחושיים של השנאה, שאינם ניתנים לרדוקציה לנסיבות פוליטיות מקומיות (השל, תש"ף, עמ' 5-30; Engel, 2009, pp. 30-53). לוויכוח זה יש השלכה ישירה על הדיון בהרצל. גישתו של אנגל מחייבת להסביר את תגובתו בהקשר קונקרטי, הפוליטיקה הווינאית, מעמדו כעיתונאי, זהותו כיהודי מתבולל, ולא כתגובה ל"אנטישמיות" מופשטת שנתגלתה לו בפריז.</w:t>
+        <w:t xml:space="preserve">דוד אנגל טען, מנגד, שעצם השימוש במושג "אנטישמיות" כקטגוריה אנליטית מטשטש יותר משהוא מאיר. המושג כורך יחד חקיקה מפלה, אלימות המונים, תעמולה מפלגתית ודעות קדומות פרטיות, ומניח מראש קו רצף ביניהן במקום להסביר כל תופעה בהקשרה. אנגל הציע לזנוח את המושג ולחקור את יחסי היהודים עם סביבתם באופן קונקרטי. סוזנה השל השיבה שהוויתור על המושג עלול להעלים מן המחקר דווקא את הממדים הרגשיים והחושיים של השנאה, שאינם ניתנים לרדוקציה לנסיבות פוליטיות מקומיות (אנגל, תש"ף, עמ' 13-55; השל, תש"ף, עמ' 5-30; Engel, 2009, pp. 30-53). תגובות נוספות על אנגל, שפורסמו באותו גיליון של "ציון", מחדדות את הצד המתודולוגי של הוויכוח. דיוויד פלדמן קיבל את טענתו של אנגל שהמושג הוא הבניה חברתית ולא נתון מן הטבע, והזכיר שכאשר נכנס המונח לשימוש בגרמניה בראשית שנות השמונים הוא ציין רק את מי שטענו ששוויון הזכויות ליהודים היה טעות, ורק באמצע שנות התשעים התרחב לכלול כל עוינות כלפי יהודים בכל הדורות. פלדמן הוסיף שהמושג שימש את המשתמשים בו לא רק לתאר את העולם אלא להשפיע עליו, כאשר סופרים יהודים כרכו יחד את הביקורת הגרמנית על האמנציפציה, את הפרעות ברוסיה ואת עלילת הדם בהונגריה כדי לחזק את היהודים ולפגוע באמינות יריביהם (פלדמן, תש"ף, עמ' 295-296). צפריר ברזלי הזכיר שכל קטגוריה היסטורית היא שרירותית במידת מה, וטען שאפשר להמשיך להשתמש במושג כל עוד ברור שאינו מייצג את התמונה המלאה של יחסי יהודים ולא־יהודים. שני המאפיינים שדרש ממחקר עתידי, התייחסות לרמה המקומית ובחינת התפתחויות בחברת הרוב גם כשאינן קשורות ישירות ליהודים, ישמשו את הדיון בהרצל בפרקים הבאים (ברזלי, תש"ף, עמ' 195-196, 206-207).</w:t>
+      </w:r>
+    </w:p>
+    <w:p>
+      <w:pPr>
+        <w:bidi/>
+        <w:spacing w:after="120" w:line="360" w:lineRule="auto"/>
+        <w:jc w:val="right"/>
+      </w:pPr>
+      <w:r>
+        <w:rPr>
+          <w:rFonts w:ascii="David" w:cs="David" w:eastAsia="David" w:hAnsi="David"/>
+          <w:sz w:val="24"/>
+          <w:szCs w:val="24"/>
+          <w:rtl/>
+        </w:rPr>
+        <w:t xml:space="preserve">לוויכוח זה יש השלכה ישירה על הדיון בהרצל. גישתו של אנגל מחייבת להסביר את תגובתו בהקשר קונקרטי, הפוליטיקה הווינאית, מעמדו כעיתונאי, זהותו כיהודי מתבולל, ולא כתגובה ל"אנטישמיות" מופשטת שנתגלתה לו בפריז.</w:t>
       </w:r>
     </w:p>
     <w:p>
@@ -1038,7 +1054,7 @@
           <w:szCs w:val="24"/>
           <w:rtl/>
         </w:rPr>
-        <w:t xml:space="preserve">אטינגר, ש' (1978). </w:t>
+        <w:t xml:space="preserve">אנגל, ד' (תש"ף). גלגולי המושג "אנטישמיות" והשימוש בו כקטגוריה כוללת. בתוך ג' מירון וס' אורי (עורכים), אנטישמיות בין מושג היסטורי לשיח ציבורי, </w:t>
       </w:r>
       <w:r>
         <w:rPr>
@@ -1051,33 +1067,33 @@
           <w:szCs w:val="24"/>
           <w:rtl/>
         </w:rPr>
-        <w:t xml:space="preserve">האנטישמיות בעת החדשה: פרקי מחקר ועיון</w:t>
-      </w:r>
-      <w:r>
-        <w:rPr>
-          <w:rFonts w:ascii="David" w:cs="David" w:eastAsia="David" w:hAnsi="David"/>
-          <w:sz w:val="24"/>
-          <w:szCs w:val="24"/>
-          <w:rtl/>
-        </w:rPr>
-        <w:t xml:space="preserve">. תל אביב: מורשת וספרית פועלים.</w:t>
-      </w:r>
-    </w:p>
-    <w:p>
-      <w:pPr>
-        <w:bidi/>
-        <w:spacing w:after="240" w:line="240" w:lineRule="auto"/>
-        <w:ind w:left="720" w:hanging="720"/>
-        <w:jc w:val="right"/>
-      </w:pPr>
-      <w:r>
-        <w:rPr>
-          <w:rFonts w:ascii="David" w:cs="David" w:eastAsia="David" w:hAnsi="David"/>
-          <w:sz w:val="24"/>
-          <w:szCs w:val="24"/>
-          <w:rtl/>
-        </w:rPr>
-        <w:t xml:space="preserve">דרימון, א' (1886). צרפת המיוהדת. בתוך </w:t>
+        <w:t xml:space="preserve">ציון</w:t>
+      </w:r>
+      <w:r>
+        <w:rPr>
+          <w:rFonts w:ascii="David" w:cs="David" w:eastAsia="David" w:hAnsi="David"/>
+          <w:sz w:val="24"/>
+          <w:szCs w:val="24"/>
+          <w:rtl/>
+        </w:rPr>
+        <w:t xml:space="preserve">, פה, 13-55.</w:t>
+      </w:r>
+    </w:p>
+    <w:p>
+      <w:pPr>
+        <w:bidi/>
+        <w:spacing w:after="240" w:line="240" w:lineRule="auto"/>
+        <w:ind w:left="720" w:hanging="720"/>
+        <w:jc w:val="right"/>
+      </w:pPr>
+      <w:r>
+        <w:rPr>
+          <w:rFonts w:ascii="David" w:cs="David" w:eastAsia="David" w:hAnsi="David"/>
+          <w:sz w:val="24"/>
+          <w:szCs w:val="24"/>
+          <w:rtl/>
+        </w:rPr>
+        <w:t xml:space="preserve">אטינגר, ש' (1978). </w:t>
       </w:r>
       <w:r>
         <w:rPr>
@@ -1090,33 +1106,33 @@
           <w:szCs w:val="24"/>
           <w:rtl/>
         </w:rPr>
-        <w:t xml:space="preserve">מקראת הקורס האנטישמיות במאה ה-19</w:t>
-      </w:r>
-      <w:r>
-        <w:rPr>
-          <w:rFonts w:ascii="David" w:cs="David" w:eastAsia="David" w:hAnsi="David"/>
-          <w:sz w:val="24"/>
-          <w:szCs w:val="24"/>
-          <w:rtl/>
-        </w:rPr>
-        <w:t xml:space="preserve"> (עמ' 443-444). רעננה: האוניברסיטה הפתוחה.</w:t>
-      </w:r>
-    </w:p>
-    <w:p>
-      <w:pPr>
-        <w:bidi/>
-        <w:spacing w:after="240" w:line="240" w:lineRule="auto"/>
-        <w:ind w:left="720" w:hanging="720"/>
-        <w:jc w:val="right"/>
-      </w:pPr>
-      <w:r>
-        <w:rPr>
-          <w:rFonts w:ascii="David" w:cs="David" w:eastAsia="David" w:hAnsi="David"/>
-          <w:sz w:val="24"/>
-          <w:szCs w:val="24"/>
-          <w:rtl/>
-        </w:rPr>
-        <w:t xml:space="preserve">השל, ס' (תש"ף). לקראת היסטוריוגרפיה ארוטית: חקר הממדים החושיים והרגשיים של האנטישמיות. בתוך ג' מירון וס' אורי (עורכים), אנטישמיות בין מושג היסטורי לשיח ציבורי, </w:t>
+        <w:t xml:space="preserve">האנטישמיות בעת החדשה: פרקי מחקר ועיון</w:t>
+      </w:r>
+      <w:r>
+        <w:rPr>
+          <w:rFonts w:ascii="David" w:cs="David" w:eastAsia="David" w:hAnsi="David"/>
+          <w:sz w:val="24"/>
+          <w:szCs w:val="24"/>
+          <w:rtl/>
+        </w:rPr>
+        <w:t xml:space="preserve">. תל אביב: מורשת וספרית פועלים.</w:t>
+      </w:r>
+    </w:p>
+    <w:p>
+      <w:pPr>
+        <w:bidi/>
+        <w:spacing w:after="240" w:line="240" w:lineRule="auto"/>
+        <w:ind w:left="720" w:hanging="720"/>
+        <w:jc w:val="right"/>
+      </w:pPr>
+      <w:r>
+        <w:rPr>
+          <w:rFonts w:ascii="David" w:cs="David" w:eastAsia="David" w:hAnsi="David"/>
+          <w:sz w:val="24"/>
+          <w:szCs w:val="24"/>
+          <w:rtl/>
+        </w:rPr>
+        <w:t xml:space="preserve">ברזלי, צ' (תש"ף). המושג 'אנטישמיות' כקטגוריה לחקר ההיסטוריה של היהודים בימי הביניים. בתוך ג' מירון וס' אורי (עורכים), אנטישמיות בין מושג היסטורי לשיח ציבורי, </w:t>
       </w:r>
       <w:r>
         <w:rPr>
@@ -1138,24 +1154,24 @@
           <w:szCs w:val="24"/>
           <w:rtl/>
         </w:rPr>
-        <w:t xml:space="preserve">, פה, 5-30.</w:t>
-      </w:r>
-    </w:p>
-    <w:p>
-      <w:pPr>
-        <w:bidi/>
-        <w:spacing w:after="240" w:line="240" w:lineRule="auto"/>
-        <w:ind w:left="720" w:hanging="720"/>
-        <w:jc w:val="right"/>
-      </w:pPr>
-      <w:r>
-        <w:rPr>
-          <w:rFonts w:ascii="David" w:cs="David" w:eastAsia="David" w:hAnsi="David"/>
-          <w:sz w:val="24"/>
-          <w:szCs w:val="24"/>
-          <w:rtl/>
-        </w:rPr>
-        <w:t xml:space="preserve">וולקוב, ש' (2002). </w:t>
+        <w:t xml:space="preserve">, פה, 195-207.</w:t>
+      </w:r>
+    </w:p>
+    <w:p>
+      <w:pPr>
+        <w:bidi/>
+        <w:spacing w:after="240" w:line="240" w:lineRule="auto"/>
+        <w:ind w:left="720" w:hanging="720"/>
+        <w:jc w:val="right"/>
+      </w:pPr>
+      <w:r>
+        <w:rPr>
+          <w:rFonts w:ascii="David" w:cs="David" w:eastAsia="David" w:hAnsi="David"/>
+          <w:sz w:val="24"/>
+          <w:szCs w:val="24"/>
+          <w:rtl/>
+        </w:rPr>
+        <w:t xml:space="preserve">דרימון, א' (1886). צרפת המיוהדת. בתוך </w:t>
       </w:r>
       <w:r>
         <w:rPr>
@@ -1168,33 +1184,33 @@
           <w:szCs w:val="24"/>
           <w:rtl/>
         </w:rPr>
-        <w:t xml:space="preserve">במעגל המכושף: יהודים, אנטישמים וגרמנים אחרים</w:t>
-      </w:r>
-      <w:r>
-        <w:rPr>
-          <w:rFonts w:ascii="David" w:cs="David" w:eastAsia="David" w:hAnsi="David"/>
-          <w:sz w:val="24"/>
-          <w:szCs w:val="24"/>
-          <w:rtl/>
-        </w:rPr>
-        <w:t xml:space="preserve">. תל אביב: עם עובד.</w:t>
-      </w:r>
-    </w:p>
-    <w:p>
-      <w:pPr>
-        <w:bidi/>
-        <w:spacing w:after="240" w:line="240" w:lineRule="auto"/>
-        <w:ind w:left="720" w:hanging="720"/>
-        <w:jc w:val="right"/>
-      </w:pPr>
-      <w:r>
-        <w:rPr>
-          <w:rFonts w:ascii="David" w:cs="David" w:eastAsia="David" w:hAnsi="David"/>
-          <w:sz w:val="24"/>
-          <w:szCs w:val="24"/>
-          <w:rtl/>
-        </w:rPr>
-        <w:t xml:space="preserve">כ"ץ, י' (1979). </w:t>
+        <w:t xml:space="preserve">מקראת הקורס האנטישמיות במאה ה-19</w:t>
+      </w:r>
+      <w:r>
+        <w:rPr>
+          <w:rFonts w:ascii="David" w:cs="David" w:eastAsia="David" w:hAnsi="David"/>
+          <w:sz w:val="24"/>
+          <w:szCs w:val="24"/>
+          <w:rtl/>
+        </w:rPr>
+        <w:t xml:space="preserve"> (עמ' 443-444). רעננה: האוניברסיטה הפתוחה.</w:t>
+      </w:r>
+    </w:p>
+    <w:p>
+      <w:pPr>
+        <w:bidi/>
+        <w:spacing w:after="240" w:line="240" w:lineRule="auto"/>
+        <w:ind w:left="720" w:hanging="720"/>
+        <w:jc w:val="right"/>
+      </w:pPr>
+      <w:r>
+        <w:rPr>
+          <w:rFonts w:ascii="David" w:cs="David" w:eastAsia="David" w:hAnsi="David"/>
+          <w:sz w:val="24"/>
+          <w:szCs w:val="24"/>
+          <w:rtl/>
+        </w:rPr>
+        <w:t xml:space="preserve">השל, ס' (תש"ף). לקראת היסטוריוגרפיה ארוטית: חקר הממדים החושיים והרגשיים של האנטישמיות. בתוך ג' מירון וס' אורי (עורכים), אנטישמיות בין מושג היסטורי לשיח ציבורי, </w:t>
       </w:r>
       <w:r>
         <w:rPr>
@@ -1207,33 +1223,33 @@
           <w:szCs w:val="24"/>
           <w:rtl/>
         </w:rPr>
-        <w:t xml:space="preserve">שנאת ישראל: משנאת הדת לשלילת הגזע</w:t>
-      </w:r>
-      <w:r>
-        <w:rPr>
-          <w:rFonts w:ascii="David" w:cs="David" w:eastAsia="David" w:hAnsi="David"/>
-          <w:sz w:val="24"/>
-          <w:szCs w:val="24"/>
-          <w:rtl/>
-        </w:rPr>
-        <w:t xml:space="preserve">. תל אביב: עם עובד.</w:t>
-      </w:r>
-    </w:p>
-    <w:p>
-      <w:pPr>
-        <w:bidi/>
-        <w:spacing w:after="240" w:line="240" w:lineRule="auto"/>
-        <w:ind w:left="720" w:hanging="720"/>
-        <w:jc w:val="right"/>
-      </w:pPr>
-      <w:r>
-        <w:rPr>
-          <w:rFonts w:ascii="David" w:cs="David" w:eastAsia="David" w:hAnsi="David"/>
-          <w:sz w:val="24"/>
-          <w:szCs w:val="24"/>
-          <w:rtl/>
-        </w:rPr>
-        <w:t xml:space="preserve">מירון, ג' (2022). </w:t>
+        <w:t xml:space="preserve">ציון</w:t>
+      </w:r>
+      <w:r>
+        <w:rPr>
+          <w:rFonts w:ascii="David" w:cs="David" w:eastAsia="David" w:hAnsi="David"/>
+          <w:sz w:val="24"/>
+          <w:szCs w:val="24"/>
+          <w:rtl/>
+        </w:rPr>
+        <w:t xml:space="preserve">, פה, 5-30.</w:t>
+      </w:r>
+    </w:p>
+    <w:p>
+      <w:pPr>
+        <w:bidi/>
+        <w:spacing w:after="240" w:line="240" w:lineRule="auto"/>
+        <w:ind w:left="720" w:hanging="720"/>
+        <w:jc w:val="right"/>
+      </w:pPr>
+      <w:r>
+        <w:rPr>
+          <w:rFonts w:ascii="David" w:cs="David" w:eastAsia="David" w:hAnsi="David"/>
+          <w:sz w:val="24"/>
+          <w:szCs w:val="24"/>
+          <w:rtl/>
+        </w:rPr>
+        <w:t xml:space="preserve">וולקוב, ש' (2002). </w:t>
       </w:r>
       <w:r>
         <w:rPr>
@@ -1246,6 +1262,84 @@
           <w:szCs w:val="24"/>
           <w:rtl/>
         </w:rPr>
+        <w:t xml:space="preserve">במעגל המכושף: יהודים, אנטישמים וגרמנים אחרים</w:t>
+      </w:r>
+      <w:r>
+        <w:rPr>
+          <w:rFonts w:ascii="David" w:cs="David" w:eastAsia="David" w:hAnsi="David"/>
+          <w:sz w:val="24"/>
+          <w:szCs w:val="24"/>
+          <w:rtl/>
+        </w:rPr>
+        <w:t xml:space="preserve">. תל אביב: עם עובד.</w:t>
+      </w:r>
+    </w:p>
+    <w:p>
+      <w:pPr>
+        <w:bidi/>
+        <w:spacing w:after="240" w:line="240" w:lineRule="auto"/>
+        <w:ind w:left="720" w:hanging="720"/>
+        <w:jc w:val="right"/>
+      </w:pPr>
+      <w:r>
+        <w:rPr>
+          <w:rFonts w:ascii="David" w:cs="David" w:eastAsia="David" w:hAnsi="David"/>
+          <w:sz w:val="24"/>
+          <w:szCs w:val="24"/>
+          <w:rtl/>
+        </w:rPr>
+        <w:t xml:space="preserve">כ"ץ, י' (1979). </w:t>
+      </w:r>
+      <w:r>
+        <w:rPr>
+          <w:rFonts w:ascii="David" w:cs="David" w:eastAsia="David" w:hAnsi="David"/>
+          <w:b/>
+          <w:bCs/>
+          <w:i w:val="false"/>
+          <w:iCs w:val="false"/>
+          <w:sz w:val="24"/>
+          <w:szCs w:val="24"/>
+          <w:rtl/>
+        </w:rPr>
+        <w:t xml:space="preserve">שנאת ישראל: משנאת הדת לשלילת הגזע</w:t>
+      </w:r>
+      <w:r>
+        <w:rPr>
+          <w:rFonts w:ascii="David" w:cs="David" w:eastAsia="David" w:hAnsi="David"/>
+          <w:sz w:val="24"/>
+          <w:szCs w:val="24"/>
+          <w:rtl/>
+        </w:rPr>
+        <w:t xml:space="preserve">. תל אביב: עם עובד.</w:t>
+      </w:r>
+    </w:p>
+    <w:p>
+      <w:pPr>
+        <w:bidi/>
+        <w:spacing w:after="240" w:line="240" w:lineRule="auto"/>
+        <w:ind w:left="720" w:hanging="720"/>
+        <w:jc w:val="right"/>
+      </w:pPr>
+      <w:r>
+        <w:rPr>
+          <w:rFonts w:ascii="David" w:cs="David" w:eastAsia="David" w:hAnsi="David"/>
+          <w:sz w:val="24"/>
+          <w:szCs w:val="24"/>
+          <w:rtl/>
+        </w:rPr>
+        <w:t xml:space="preserve">מירון, ג' (2022). </w:t>
+      </w:r>
+      <w:r>
+        <w:rPr>
+          <w:rFonts w:ascii="David" w:cs="David" w:eastAsia="David" w:hAnsi="David"/>
+          <w:b/>
+          <w:bCs/>
+          <w:i w:val="false"/>
+          <w:iCs w:val="false"/>
+          <w:sz w:val="24"/>
+          <w:szCs w:val="24"/>
+          <w:rtl/>
+        </w:rPr>
         <w:t xml:space="preserve">האנטישמיות במאה ה-19: מדריך למידה</w:t>
       </w:r>
       <w:r>
@@ -1256,6 +1350,45 @@
           <w:rtl/>
         </w:rPr>
         <w:t xml:space="preserve">. רעננה: האוניברסיטה הפתוחה.</w:t>
+      </w:r>
+    </w:p>
+    <w:p>
+      <w:pPr>
+        <w:bidi/>
+        <w:spacing w:after="240" w:line="240" w:lineRule="auto"/>
+        <w:ind w:left="720" w:hanging="720"/>
+        <w:jc w:val="right"/>
+      </w:pPr>
+      <w:r>
+        <w:rPr>
+          <w:rFonts w:ascii="David" w:cs="David" w:eastAsia="David" w:hAnsi="David"/>
+          <w:sz w:val="24"/>
+          <w:szCs w:val="24"/>
+          <w:rtl/>
+        </w:rPr>
+        <w:t xml:space="preserve">פלדמן, ד' (תש"ף). אנטישמיות ואסלאמופוביה (ד' מגן, מתרגם). בתוך ג' מירון וס' אורי (עורכים), אנטישמיות בין מושג היסטורי לשיח ציבורי, </w:t>
+      </w:r>
+      <w:r>
+        <w:rPr>
+          <w:rFonts w:ascii="David" w:cs="David" w:eastAsia="David" w:hAnsi="David"/>
+          <w:b/>
+          <w:bCs/>
+          <w:i w:val="false"/>
+          <w:iCs w:val="false"/>
+          <w:sz w:val="24"/>
+          <w:szCs w:val="24"/>
+          <w:rtl/>
+        </w:rPr>
+        <w:t xml:space="preserve">ציון</w:t>
+      </w:r>
+      <w:r>
+        <w:rPr>
+          <w:rFonts w:ascii="David" w:cs="David" w:eastAsia="David" w:hAnsi="David"/>
+          <w:sz w:val="24"/>
+          <w:szCs w:val="24"/>
+          <w:rtl/>
+        </w:rPr>
+        <w:t xml:space="preserve">, פה, 295-307.</w:t>
       </w:r>
     </w:p>
     <w:p>

</xml_diff>

<commit_message>
Close the citation gaps: sources at the end of every content paragraph, third person, retrieval date for the Zola text
Co-Authored-By: Claude Fable 5.1 <noreply@anthropic.com>
Claude-Session: https://claude.ai/code/session_014Ur3fhHcvLKdVTb2L63jaV
</commit_message>
<xml_diff>
--- a/seminar/מבוא ופרק ראשון - להגשה.docx
+++ b/seminar/מבוא ופרק ראשון - להגשה.docx
@@ -364,7 +364,7 @@
           <w:szCs w:val="24"/>
           <w:rtl/>
         </w:rPr>
-        <w:t xml:space="preserve">המסקנה שאליה מגיעה העבודה היא שיש להבחין בין שני שלבים. בשלב לידת הרעיון, מסתיו 1894 ועד פברואר 1896, לא הייתה פרשת דרייפוס גורם מכריע: הרצל קיבל בזמן אמת את אשמתו של דרייפוס, לא הזכיר את הפרשה ברשימת הגורמים שערך ביומנו ביוני 1895, ולא הזכיר אותה ב"מדינת היהודים". הגורמים שהכריעו היו היכרותו הממושכת עם האנטישמיות הגרמנית והאוסטרית, עליית לואגר בווינה, מה שלמד בפריז מן הפוליטיקה ההמונית ומתעמולת אדואר דרימון, והמשבר האישי שהיה נתון בו. בשלב ההפצה והמיסוד של התנועה, משלהי 1897 ואילך, הפכה הפרשה למרכזית: כראיה לכישלון האמנציפציה גם בארץ זכויות האדם, וכסיפור מוצא שהרצל עצמו עיצב. המיתוס לא היה אמת ביוגרפית, אך הוא היה עובדה היסטורית בעלת השפעה על התנועה הציונית.</w:t>
+        <w:t xml:space="preserve">המסקנה שאליה מגיעה העבודה היא שיש להבחין בין שני שלבים. בשלב לידת הרעיון, מסתיו 1894 ועד פברואר 1896, לא הייתה פרשת דרייפוס גורם מכריע: הרצל קיבל בזמן אמת את אשמתו של דרייפוס, לא הזכיר את הפרשה ברשימת הגורמים שערך ביומנו ביוני 1895, ולא הזכיר אותה ב"מדינת היהודים". הגורמים שהכריעו היו היכרותו הממושכת עם האנטישמיות הגרמנית והאוסטרית, עליית לואגר בווינה, מה שלמד בפריז מן הפוליטיקה ההמונית ומתעמולת אדואר דרימון, והמשבר האישי שהיה נתון בו. בשלב ההפצה והמיסוד של התנועה, משלהי 1897 ואילך, הפכה הפרשה למרכזית: כראיה לכישלון האמנציפציה גם בארץ זכויות האדם, וכסיפור מוצא שהרצל עצמו עיצב. המיתוס לא היה אמת ביוגרפית, אך הוא היה עובדה היסטורית בעלת השפעה על התנועה הציונית (אבינרי, 2007, עמ' 84-108; Kornberg, 1993, pp. 183-202; Penslar, 2020, pp. 49-70).</w:t>
       </w:r>
     </w:p>
     <w:p>
@@ -614,7 +614,7 @@
           <w:szCs w:val="24"/>
           <w:rtl/>
         </w:rPr>
-        <w:t xml:space="preserve">לוויכוח זה יש השלכה ישירה על הדיון בהרצל. גישתו של אנגל מחייבת להסביר את תגובתו בהקשר קונקרטי, הפוליטיקה הווינאית, מעמדו כעיתונאי, זהותו כיהודי מתבולל, ולא כתגובה ל"אנטישמיות" מופשטת שנתגלתה לו בפריז.</w:t>
+        <w:t xml:space="preserve">לוויכוח זה יש השלכה ישירה על הדיון בהרצל. גישתו של אנגל מחייבת להסביר את תגובתו בהקשר קונקרטי, הפוליטיקה הווינאית, מעמדו כעיתונאי, זהותו כיהודי מתבולל, ולא כתגובה ל"אנטישמיות" מופשטת שנתגלתה לו בפריז (אנגל, תש"ף, עמ' 13-55; ברזלי, תש"ף, עמ' 206-207).</w:t>
       </w:r>
     </w:p>
     <w:p>
@@ -713,7 +713,7 @@
           <w:szCs w:val="24"/>
           <w:rtl/>
         </w:rPr>
-        <w:t xml:space="preserve">שולמית וולקוב הציעה מסגרת פרשנית להבנת התופעה. בשלהי המאה התשע עשרה הפכה האנטישמיות בגרמניה ל"קוד תרבותי": הצהרת עמדה אנטי־יהודית לא ביטאה בהכרח עמדה מגובשת בשאלת היהודים, אלא שימשה סימן היכר להשתייכות למחנה תרבותי־פוליטי שלם, שמרני, לאומי, אנטי־ליברלי, מתגעגע לחברה קדם־תעשייתית. ההתנגדות לאנטישמיות שימשה, באותה מידה, סימן להשתייכות למחנה הליברלי. כך הפכה "השאלה היהודית" לסמל במאבק על דמותה של גרמניה, גם כשמספר היהודים בה לא עלה על אחוז אחד מן האוכלוסייה (וולקוב, 2002, עמ' 71-98; Volkov, 1978, pp. 25-46). הרעיון מסביר מדוע יכול היה יהודי מתבולל כהרצל לחיות שנים בסביבה שבה האנטישמיות רווחת מבלי לראות בה איום קיומי. היא נתפשה כרטוריקה של מחנה, לא כתוכנית פעולה.</w:t>
+        <w:t xml:space="preserve">שולמית וולקוב הציעה מסגרת פרשנית להבנת התופעה. בשלהי המאה התשע עשרה הפכה האנטישמיות בגרמניה ל"קוד תרבותי": הצהרת עמדה אנטי־יהודית לא ביטאה בהכרח עמדה מגובשת בשאלת היהודים, אלא שימשה סימן היכר להשתייכות למחנה תרבותי־פוליטי שלם, שמרני, לאומי, אנטי־ליברלי, מתגעגע לחברה קדם־תעשייתית. ההתנגדות לאנטישמיות שימשה, באותה מידה, סימן להשתייכות למחנה הליברלי. כך הפכה "השאלה היהודית" לסמל במאבק על דמותה של גרמניה, גם כשמספר היהודים בה לא עלה על אחוז אחד מן האוכלוסייה. הרעיון מסביר מדוע יכול היה יהודי מתבולל כהרצל לחיות שנים בסביבה שבה האנטישמיות רווחת מבלי לראות בה איום קיומי. היא נתפשה כרטוריקה של מחנה, לא כתוכנית פעולה (וולקוב, 2002, עמ' 71-98; Volkov, 1978, pp. 25-46).</w:t>
       </w:r>
     </w:p>
     <w:p>
@@ -978,7 +978,7 @@
           <w:szCs w:val="24"/>
           <w:rtl/>
         </w:rPr>
-        <w:t xml:space="preserve">הרצל עצמו הגיע אל שנות התשעים כיהודי מתבולל שכבר הכיר את האנטישמיות הווינאית מקרוב, שסיקר את האנטישמיות הצרפתית כעיתונאי, ושהיה נתון במשבר אישי. על רקע זה יבחן הפרק הבא את הגורמים למהפך שלו שאינם קשורים לפרשת דרייפוס.</w:t>
+        <w:t xml:space="preserve">הרצל עצמו הגיע אל שנות התשעים כיהודי מתבולל שכבר הכיר את האנטישמיות הווינאית מקרוב, שסיקר את האנטישמיות הצרפתית כעיתונאי, ושהיה נתון במשבר אישי. על רקע זה יבחן הפרק הבא את הגורמים למהפך שלו שאינם קשורים לפרשת דרייפוס (אבינרי, 2007, עמ' 15-56; Hyman, 1998, pp. 111-114; Pulzer, 1988, pp. 47-57).</w:t>
       </w:r>
     </w:p>
     <w:p>

</xml_diff>

<commit_message>
Cite through footnotes as the department guidelines require, one note per paragraph with pages
Co-Authored-By: Claude Fable 5.1 <noreply@anthropic.com>
Claude-Session: https://claude.ai/code/session_014Ur3fhHcvLKdVTb2L63jaV
</commit_message>
<xml_diff>
--- a/seminar/מבוא ופרק ראשון - להגשה.docx
+++ b/seminar/מבוא ופרק ראשון - להגשה.docx
@@ -300,7 +300,28 @@
           <w:szCs w:val="24"/>
           <w:rtl/>
         </w:rPr>
-        <w:t xml:space="preserve">בחמישה בינואר 1895 נערך בחצר בית הספר הצבאי בפריז טקס הורדת הדרגות של הקפטן אלפרד דרייפוס, קצין יהודי ממוצא אלזסי שהורשע בבגידה. בין הכתבים שסיקרו את הטקס עמד תיאודור (בנימין זאב) הרצל, כתבו הפריזאי של העיתון הווינאי "נויה פרייה פרסה". ארבע שנים לאחר מכן, כשהוא כבר עומד בראש התנועה הציונית, כתב הרצל שמשפט דרייפוס הוא שעשה אותו לציוני (Herzl, 1899, pp. 1-8). אמירה זו הפכה לאחד מסיפורי היסוד של ההיסטוריה הציונית. ההיסטוריוגרפיה של העשורים האחרונים ערערה עליו מיסודו, והציעה במקומו תמונה שבה פרשת דרייפוס היא רק אחד מכמה גורמים שהביאו את הרצל אל הרעיון הציוני, ואולי לא החשוב שבהם (אבינרי, 2007, עמ' 84-108; Kornberg, 1993, pp. 183-202).</w:t>
+        <w:t xml:space="preserve">בחמישה בינואר 1895 נערך בחצר בית הספר הצבאי בפריז טקס הורדת הדרגות של הקפטן אלפרד דרייפוס, קצין יהודי ממוצא אלזסי שהורשע בבגידה. בין הכתבים שסיקרו את הטקס עמד תיאודור (בנימין זאב) הרצל, כתבו הפריזאי של העיתון הווינאי "נויה פרייה פרסה". ארבע שנים לאחר מכן, כשהוא כבר עומד בראש התנועה הציונית, כתב הרצל שמשפט דרייפוס הוא שעשה אותו לציוני .</w:t>
+      </w:r>
+      <w:r>
+        <w:rPr>
+          <w:rStyle w:val="FootnoteReference"/>
+        </w:rPr>
+        <w:footnoteReference w:id="1"/>
+      </w:r>
+      <w:r>
+        <w:rPr>
+          <w:rFonts w:ascii="David" w:cs="David" w:eastAsia="David" w:hAnsi="David"/>
+          <w:sz w:val="24"/>
+          <w:szCs w:val="24"/>
+          <w:rtl/>
+        </w:rPr>
+        <w:t xml:space="preserve"> אמירה זו הפכה לאחד מסיפורי היסוד של ההיסטוריה הציונית. ההיסטוריוגרפיה של העשורים האחרונים ערערה עליו מיסודו, והציעה במקומו תמונה שבה פרשת דרייפוס היא רק אחד מכמה גורמים שהביאו את הרצל אל הרעיון הציוני, ואולי לא החשוב שבהם .</w:t>
+      </w:r>
+      <w:r>
+        <w:rPr>
+          <w:rStyle w:val="FootnoteReference"/>
+        </w:rPr>
+        <w:footnoteReference w:id="2"/>
       </w:r>
     </w:p>
     <w:p>
@@ -332,7 +353,13 @@
           <w:szCs w:val="24"/>
           <w:rtl/>
         </w:rPr>
-        <w:t xml:space="preserve">חשיבותו של הנושא כפולה. מבחינה היסטורית, השאלה נוגעת לאחד הרגעים המכוננים של הלאומיות היהודית המודרנית ולאופן שבו נולדים רעיונות פוליטיים מתוך מפגש בין ביוגרפיה אישית לבין תמורות חברתיות. מבחינה היסטוריוגרפית, המקרה של הרצל הוא דוגמה מובהקת לפער שבין מה שאדם כותב בזמן אמת לבין מה שהוא מספר על עצמו בדיעבד, ולדרך שבה סיפור עצמי של מנהיג הופך לזיכרון קולקטיבי של תנועה. הדיון נוגע גם לוויכוח הרחב יותר שבמרכז הקורס, בין הגישה הרואה באנטישמיות תופעה רצופה שהיהודים "מגלים" אותה בכל דור, לבין הגישה הדורשת להסביר כל תגובה יהודית בהקשרה הקונקרטי (אטינגר, 1978, עמ' 1-28; Engel, 2009, pp. 30-53).</w:t>
+        <w:t xml:space="preserve">חשיבותו של הנושא כפולה. מבחינה היסטורית, השאלה נוגעת לאחד הרגעים המכוננים של הלאומיות היהודית המודרנית ולאופן שבו נולדים רעיונות פוליטיים מתוך מפגש בין ביוגרפיה אישית לבין תמורות חברתיות. מבחינה היסטוריוגרפית, המקרה של הרצל הוא דוגמה מובהקת לפער שבין מה שאדם כותב בזמן אמת לבין מה שהוא מספר על עצמו בדיעבד, ולדרך שבה סיפור עצמי של מנהיג הופך לזיכרון קולקטיבי של תנועה. הדיון נוגע גם לוויכוח הרחב יותר שבמרכז הקורס, בין הגישה הרואה באנטישמיות תופעה רצופה שהיהודים "מגלים" אותה בכל דור, לבין הגישה הדורשת להסביר כל תגובה יהודית בהקשרה הקונקרטי .</w:t>
+      </w:r>
+      <w:r>
+        <w:rPr>
+          <w:rStyle w:val="FootnoteReference"/>
+        </w:rPr>
+        <w:footnoteReference w:id="3"/>
       </w:r>
     </w:p>
     <w:p>
@@ -364,7 +391,13 @@
           <w:szCs w:val="24"/>
           <w:rtl/>
         </w:rPr>
-        <w:t xml:space="preserve">המסקנה שאליה מגיעה העבודה היא שיש להבחין בין שני שלבים. בשלב לידת הרעיון, מסתיו 1894 ועד פברואר 1896, לא הייתה פרשת דרייפוס גורם מכריע: הרצל קיבל בזמן אמת את אשמתו של דרייפוס, לא הזכיר את הפרשה ברשימת הגורמים שערך ביומנו ביוני 1895, ולא הזכיר אותה ב"מדינת היהודים". הגורמים שהכריעו היו היכרותו הממושכת עם האנטישמיות הגרמנית והאוסטרית, עליית לואגר בווינה, מה שלמד בפריז מן הפוליטיקה ההמונית ומתעמולת אדואר דרימון, והמשבר האישי שהיה נתון בו. בשלב ההפצה והמיסוד של התנועה, משלהי 1897 ואילך, הפכה הפרשה למרכזית: כראיה לכישלון האמנציפציה גם בארץ זכויות האדם, וכסיפור מוצא שהרצל עצמו עיצב. המיתוס לא היה אמת ביוגרפית, אך הוא היה עובדה היסטורית בעלת השפעה על התנועה הציונית (אבינרי, 2007, עמ' 84-108; Kornberg, 1993, pp. 183-202; Penslar, 2020, pp. 49-70).</w:t>
+        <w:t xml:space="preserve">המסקנה שאליה מגיעה העבודה היא שיש להבחין בין שני שלבים. בשלב לידת הרעיון, מסתיו 1894 ועד פברואר 1896, לא הייתה פרשת דרייפוס גורם מכריע: הרצל קיבל בזמן אמת את אשמתו של דרייפוס, לא הזכיר את הפרשה ברשימת הגורמים שערך ביומנו ביוני 1895, ולא הזכיר אותה ב"מדינת היהודים". הגורמים שהכריעו היו היכרותו הממושכת עם האנטישמיות הגרמנית והאוסטרית, עליית לואגר בווינה, מה שלמד בפריז מן הפוליטיקה ההמונית ומתעמולת אדואר דרימון, והמשבר האישי שהיה נתון בו. בשלב ההפצה והמיסוד של התנועה, משלהי 1897 ואילך, הפכה הפרשה למרכזית: כראיה לכישלון האמנציפציה גם בארץ זכויות האדם, וכסיפור מוצא שהרצל עצמו עיצב. המיתוס לא היה אמת ביוגרפית, אך הוא היה עובדה היסטורית בעלת השפעה על התנועה הציונית .</w:t>
+      </w:r>
+      <w:r>
+        <w:rPr>
+          <w:rStyle w:val="FootnoteReference"/>
+        </w:rPr>
+        <w:footnoteReference w:id="4"/>
       </w:r>
     </w:p>
     <w:p>
@@ -435,7 +468,13 @@
           <w:szCs w:val="24"/>
           <w:rtl/>
         </w:rPr>
-        <w:t xml:space="preserve">תיאודור הרצל נולד בבודפשט ב-2 במאי 1860 למשפחה יהודית אמידה. אביו יעקב היה סוחר ובנקאי, ואמו ז'נט באה ממשפחה שהעריצה את הספרות הגרמנית הקלאסית. הבית היה דובר גרמנית, והיהדות שבו הייתה מסורת משפחתית רופפת ולא אמונה: הרצל למד זמן קצר בבית ספר יהודי וחגג בר מצווה, אך חינוכו התרבותי היה גרמני. בשנת 1878, לאחר מות אחותו פאולינה, עברה המשפחה לווינה, והרצל נרשם ללימודי משפטים באוניברסיטה. את הדוקטורט קיבל בשנת 1884, ולאחר התמחות קצרה זנח את המשפטים לטובת הספרות והעיתונות (אבינרי, 2007, עמ' 15-33; Bein, 1941, pp. 1-40).</w:t>
+        <w:t xml:space="preserve">תיאודור הרצל נולד בבודפשט ב-2 במאי 1860 למשפחה יהודית אמידה. אביו יעקב היה סוחר ובנקאי, ואמו ז'נט באה ממשפחה שהעריצה את הספרות הגרמנית הקלאסית. הבית היה דובר גרמנית, והיהדות שבו הייתה מסורת משפחתית רופפת ולא אמונה: הרצל למד זמן קצר בבית ספר יהודי וחגג בר מצווה, אך חינוכו התרבותי היה גרמני. בשנת 1878, לאחר מות אחותו פאולינה, עברה המשפחה לווינה, והרצל נרשם ללימודי משפטים באוניברסיטה. את הדוקטורט קיבל בשנת 1884, ולאחר התמחות קצרה זנח את המשפטים לטובת הספרות והעיתונות .</w:t>
+      </w:r>
+      <w:r>
+        <w:rPr>
+          <w:rStyle w:val="FootnoteReference"/>
+        </w:rPr>
+        <w:footnoteReference w:id="5"/>
       </w:r>
     </w:p>
     <w:p>
@@ -451,7 +490,13 @@
           <w:szCs w:val="24"/>
           <w:rtl/>
         </w:rPr>
-        <w:t xml:space="preserve">הרצל הצעיר היה יהודי מתבולל במלוא מובן המילה. הוא ראה את עצמו כאיש תרבות אירופי שדתו היא עניין של מוצא, שאף להיות מחזאי גרמני מצליח, והופעתו המוקפדת ואהדתו לאצולה שיקפו רצון להיטמע בחברה הגבוהה הווינאית. ז'ק קורנברג הראה שהתבוללות זו לא הייתה נטולת מתחים. הרצל הפנים במידה רבה את הדימויים השליליים של היהודים שרווחו בסביבתו, היהודי כמתחנף וכחסר כבוד, וביקש להתרחק מהם. קורנברג כינה זאת "שנאה עצמית יהודית", מונח שנוי במחלוקת, אך המתח בין הרצון להיות "כמו כולם" לבין ההכרה שהסביבה אינה מאפשרת זאת עמד ביסוד התפתחותו (Kornberg, 1980, pp. 226-252; Kornberg, 1993, pp. 1-41).</w:t>
+        <w:t xml:space="preserve">הרצל הצעיר היה יהודי מתבולל במלוא מובן המילה. הוא ראה את עצמו כאיש תרבות אירופי שדתו היא עניין של מוצא, שאף להיות מחזאי גרמני מצליח, והופעתו המוקפדת ואהדתו לאצולה שיקפו רצון להיטמע בחברה הגבוהה הווינאית. ז'ק קורנברג הראה שהתבוללות זו לא הייתה נטולת מתחים. הרצל הפנים במידה רבה את הדימויים השליליים של היהודים שרווחו בסביבתו, היהודי כמתחנף וכחסר כבוד, וביקש להתרחק מהם. קורנברג כינה זאת "שנאה עצמית יהודית", מונח שנוי במחלוקת, אך המתח בין הרצון להיות "כמו כולם" לבין ההכרה שהסביבה אינה מאפשרת זאת עמד ביסוד התפתחותו .</w:t>
+      </w:r>
+      <w:r>
+        <w:rPr>
+          <w:rStyle w:val="FootnoteReference"/>
+        </w:rPr>
+        <w:footnoteReference w:id="6"/>
       </w:r>
     </w:p>
     <w:p>
@@ -467,7 +512,13 @@
           <w:szCs w:val="24"/>
           <w:rtl/>
         </w:rPr>
-        <w:t xml:space="preserve">מפגשו של הרצל עם האנטישמיות המודרנית לא החל בפריז אלא בווינה של שנות לימודיו. בפברואר 1882 קרא את ספרו של אויגן דירינג על "השאלה היהודית", ורשם ביומן נעוריו הערות ארוכות שבהן דחה את פתרונו הגזעי של דירינג אך קיבל חלק מביקורתו על "פגמי" היהודים. בשנת 1883 פרש מאגודת הסטודנטים "אלביה", לאחר שזו התייצבה מאחורי נאום אנטישמי בעצרת זיכרון לריכרד ואגנר. שתי ההתנסויות יידונו בפרק השני כגורמים למהפך; כאן די לציין שהמסקנה שהסיק מהן הרצל בשנות השמונים לא הייתה לאומית. הוא האמין שהאנטישמיות היא שריד של ימי הביניים שייעלם עם התקדמות הנאורות, ושעל היהודים עצמם לזרז את היעלמותה בחינוך ובנימוסים (אבינרי, 2007, עמ' 34-56; Elon, 1975, pp. 55-66).</w:t>
+        <w:t xml:space="preserve">מפגשו של הרצל עם האנטישמיות המודרנית לא החל בפריז אלא בווינה של שנות לימודיו. בפברואר 1882 קרא את ספרו של אויגן דירינג על "השאלה היהודית", ורשם ביומן נעוריו הערות ארוכות שבהן דחה את פתרונו הגזעי של דירינג אך קיבל חלק מביקורתו על "פגמי" היהודים. בשנת 1883 פרש מאגודת הסטודנטים "אלביה", לאחר שזו התייצבה מאחורי נאום אנטישמי בעצרת זיכרון לריכרד ואגנר. שתי ההתנסויות יידונו בפרק השני כגורמים למהפך; כאן די לציין שהמסקנה שהסיק מהן הרצל בשנות השמונים לא הייתה לאומית. הוא האמין שהאנטישמיות היא שריד של ימי הביניים שייעלם עם התקדמות הנאורות, ושעל היהודים עצמם לזרז את היעלמותה בחינוך ובנימוסים .</w:t>
+      </w:r>
+      <w:r>
+        <w:rPr>
+          <w:rStyle w:val="FootnoteReference"/>
+        </w:rPr>
+        <w:footnoteReference w:id="7"/>
       </w:r>
     </w:p>
     <w:p>
@@ -483,7 +534,13 @@
           <w:szCs w:val="24"/>
           <w:rtl/>
         </w:rPr>
-        <w:t xml:space="preserve">במשך שנות השמונים בנה הרצל קריירה של פיליטוניסט. הוא פרסם רשימות קלילות ומלוטשות בעיתוני וינה וברלין, נסע ברחבי אירופה וכתב רשמי מסע, ומחזותיו הקומיים הוצגו בבורגתיאטר ובבמות גרמניות. השאלה היהודית הופיעה בכתביו רק בשוליים ובנימה אירונית. הפיליטון, הז'אנר שבו הצטיין, דרש קלילות, שנינות ומרחק, והוא עיצב גם את דרך ההסתכלות שלו: הרצל למד לראות את המציאות כחומר לתיאור ספרותי ולא כזירה למעורבות. תכונה זו תסביר, בפרק השלישי, מדוע הרושם הראשוני שלו מפרשת דרייפוס היה רושם של כתב המסקר דרמה ולא של יהודי שנפגע (אבינרי, 2007, עמ' 42-56; Beller, 1991, pp. 9-19).</w:t>
+        <w:t xml:space="preserve">במשך שנות השמונים בנה הרצל קריירה של פיליטוניסט. הוא פרסם רשימות קלילות ומלוטשות בעיתוני וינה וברלין, נסע ברחבי אירופה וכתב רשמי מסע, ומחזותיו הקומיים הוצגו בבורגתיאטר ובבמות גרמניות. השאלה היהודית הופיעה בכתביו רק בשוליים ובנימה אירונית. הפיליטון, הז'אנר שבו הצטיין, דרש קלילות, שנינות ומרחק, והוא עיצב גם את דרך ההסתכלות שלו: הרצל למד לראות את המציאות כחומר לתיאור ספרותי ולא כזירה למעורבות. תכונה זו תסביר, בפרק השלישי, מדוע הרושם הראשוני שלו מפרשת דרייפוס היה רושם של כתב המסקר דרמה ולא של יהודי שנפגע .</w:t>
+      </w:r>
+      <w:r>
+        <w:rPr>
+          <w:rStyle w:val="FootnoteReference"/>
+        </w:rPr>
+        <w:footnoteReference w:id="8"/>
       </w:r>
     </w:p>
     <w:p>
@@ -499,7 +556,13 @@
           <w:szCs w:val="24"/>
           <w:rtl/>
         </w:rPr>
-        <w:t xml:space="preserve">באוקטובר 1891 מונה הרצל לכתב הפריזאי של "נויה פרייה פרסה", העיתון הליברלי החשוב ביותר בווינה. במשך ארבע שנים סיקר את הפוליטיקה הצרפתית: את ישיבות בית הנבחרים, את שערוריית פנמה, את גל הטרור האנרכיסטי ואת נפילת הממשלות. מאמריו מתקופה זו מלמדים על משקיף חד וסקפטי, שלמד להכיר את מנגנוני הפוליטיקה הפרלמנטרית ואת מגבלותיה, את כוחם של ההמונים ואת כוחה של העיתונות. בפריז נחשף גם לאנטישמיות הצרפתית של דרימון, ובשנת 1892 פרסם מאמר על "האנטישמיות הצרפתית" שבו ניתח את התופעה בקור רוח ואף הביע הבנה למניעיה החברתיים (Elon, 1975, pp. 87-113; Penslar, 2020, pp. 31-48).</w:t>
+        <w:t xml:space="preserve">באוקטובר 1891 מונה הרצל לכתב הפריזאי של "נויה פרייה פרסה", העיתון הליברלי החשוב ביותר בווינה. במשך ארבע שנים סיקר את הפוליטיקה הצרפתית: את ישיבות בית הנבחרים, את שערוריית פנמה, את גל הטרור האנרכיסטי ואת נפילת הממשלות. מאמריו מתקופה זו מלמדים על משקיף חד וסקפטי, שלמד להכיר את מנגנוני הפוליטיקה הפרלמנטרית ואת מגבלותיה, את כוחם של ההמונים ואת כוחה של העיתונות. בפריז נחשף גם לאנטישמיות הצרפתית של דרימון, ובשנת 1892 פרסם מאמר על "האנטישמיות הצרפתית" שבו ניתח את התופעה בקור רוח ואף הביע הבנה למניעיה החברתיים .</w:t>
+      </w:r>
+      <w:r>
+        <w:rPr>
+          <w:rStyle w:val="FootnoteReference"/>
+        </w:rPr>
+        <w:footnoteReference w:id="9"/>
       </w:r>
     </w:p>
     <w:p>
@@ -515,7 +578,13 @@
           <w:szCs w:val="24"/>
           <w:rtl/>
         </w:rPr>
-        <w:t xml:space="preserve">השנים 1893-1895 היו גם שנות משבר אישי. נישואיו ליוליה נשאואר, בת למשפחה עשירה, היו אומללים והתנהלו על סף פירוד; מחזותיו לא זכו להצלחה שקיווה לה; והוא התקרב לגיל שלושים וחמש בתחושה שלא הגשים את ייעודו. בסתיו 1894, בשבועות שבהם נעצר דרייפוס, כתב בסערת רוח את המחזה "הגטו החדש", יצירתו הראשונה שהוקדשה לשאלה היהודית. ביוני 1895 החל לנהל את יומנו הציוני, ובפברואר 1896 פרסם את "מדינת היהודים". על הדרך מן המחזה אל החוברת ידובר בפרקים הבאים; כאן חשוב לזכור את סדר הזמנים, שכן הוא מכריע בשאלת המחקר (Kornberg, 1993, pp. 134-158; Pawel, 1989, pp. 189-240).</w:t>
+        <w:t xml:space="preserve">השנים 1893-1895 היו גם שנות משבר אישי. נישואיו ליוליה נשאואר, בת למשפחה עשירה, היו אומללים והתנהלו על סף פירוד; מחזותיו לא זכו להצלחה שקיווה לה; והוא התקרב לגיל שלושים וחמש בתחושה שלא הגשים את ייעודו. בסתיו 1894, בשבועות שבהם נעצר דרייפוס, כתב בסערת רוח את המחזה "הגטו החדש", יצירתו הראשונה שהוקדשה לשאלה היהודית. ביוני 1895 החל לנהל את יומנו הציוני, ובפברואר 1896 פרסם את "מדינת היהודים". על הדרך מן המחזה אל החוברת ידובר בפרקים הבאים; כאן חשוב לזכור את סדר הזמנים, שכן הוא מכריע בשאלת המחקר .</w:t>
+      </w:r>
+      <w:r>
+        <w:rPr>
+          <w:rStyle w:val="FootnoteReference"/>
+        </w:rPr>
+        <w:footnoteReference w:id="10"/>
       </w:r>
     </w:p>
     <w:p>
@@ -550,7 +619,13 @@
           <w:szCs w:val="24"/>
           <w:rtl/>
         </w:rPr>
-        <w:t xml:space="preserve">המונח "אנטישמיות" נכנס לשיח הציבורי בגרמניה בשנת 1879, כאשר הפובליציסט וילהלם מאר פרסם את חיבורו על "ניצחון היהדות על הגרמניות" וייסד את "ליגת האנטישמים". המונח נועד להבדיל את שנאת היהודים החדשה, שהתיימרה להיות "מדעית" וחילונית, מן השנאה הדתית הנוצרית: לא יהודים הנשנאים בשל דתם, אלא "שמים" הנתפשים כגזע זר שתכונותיו קבועות ואינן ניתנות לשינוי גם בהמרת דת או בהתבוללות. יעקב כ"ץ הראה שהמעבר משנאת הדת לשלילת הגזע לא היה חד. האנטישמים המודרניים שאבו מן המאגר של דימויים נוצריים ותיקים, היהודי כרמאי, כמלווה בריבית וכגורם מפורר, והלבישו אותם בלבוש של מדע הגזע, של כלכלה פוליטית ושל לאומיות (כ"ץ, 1979, עמ' 9-17, 245-260; Pulzer, 1988, pp. 47-57).</w:t>
+        <w:t xml:space="preserve">המונח "אנטישמיות" נכנס לשיח הציבורי בגרמניה בשנת 1879, כאשר הפובליציסט וילהלם מאר פרסם את חיבורו על "ניצחון היהדות על הגרמניות" וייסד את "ליגת האנטישמים". המונח נועד להבדיל את שנאת היהודים החדשה, שהתיימרה להיות "מדעית" וחילונית, מן השנאה הדתית הנוצרית: לא יהודים הנשנאים בשל דתם, אלא "שמים" הנתפשים כגזע זר שתכונותיו קבועות ואינן ניתנות לשינוי גם בהמרת דת או בהתבוללות. יעקב כ"ץ הראה שהמעבר משנאת הדת לשלילת הגזע לא היה חד. האנטישמים המודרניים שאבו מן המאגר של דימויים נוצריים ותיקים, היהודי כרמאי, כמלווה בריבית וכגורם מפורר, והלבישו אותם בלבוש של מדע הגזע, של כלכלה פוליטית ושל לאומיות .</w:t>
+      </w:r>
+      <w:r>
+        <w:rPr>
+          <w:rStyle w:val="FootnoteReference"/>
+        </w:rPr>
+        <w:footnoteReference w:id="11"/>
       </w:r>
     </w:p>
     <w:p>
@@ -566,7 +641,13 @@
           <w:szCs w:val="24"/>
           <w:rtl/>
         </w:rPr>
-        <w:t xml:space="preserve">עיתוי הופעת המונח לא היה מקרי. שנת 1879 הייתה שנת מפנה בכמה ארצות בעת ובעונה אחת. בגרמניה נוסדה תנועת שטקר והתפרסם מאמרו של טרייצ'קה; בהונגריה החלה תסיסה שהגיעה לשיאה בעלילת הדם בטיסה־אסלר (1882); וברוסיה פרצו כעבור שנתיים, לאחר רצח הצאר אלכסנדר השני, פרעות "הסופות בנגב", שהניעו הגירה יהודית המונית מערבה. ההגירה מן המזרח הזינה מצדה את הטענה בדבר "הצפה" יהודית במרכז אירופה ובמערבה. כ"ץ ראה בבו־זמניות זו ראיה לכך שהאנטישמיות המודרנית הייתה תופעה כלל־אירופית שצמחה ממשבר החברה הליברלית, ולא מנסיבות מקומיות בלבד (כ"ץ, 1979, עמ' 227-244).</w:t>
+        <w:t xml:space="preserve">עיתוי הופעת המונח לא היה מקרי. שנת 1879 הייתה שנת מפנה בכמה ארצות בעת ובעונה אחת. בגרמניה נוסדה תנועת שטקר והתפרסם מאמרו של טרייצ'קה; בהונגריה החלה תסיסה שהגיעה לשיאה בעלילת הדם בטיסה־אסלר (1882); וברוסיה פרצו כעבור שנתיים, לאחר רצח הצאר אלכסנדר השני, פרעות "הסופות בנגב", שהניעו הגירה יהודית המונית מערבה. ההגירה מן המזרח הזינה מצדה את הטענה בדבר "הצפה" יהודית במרכז אירופה ובמערבה. כ"ץ ראה בבו־זמניות זו ראיה לכך שהאנטישמיות המודרנית הייתה תופעה כלל־אירופית שצמחה ממשבר החברה הליברלית, ולא מנסיבות מקומיות בלבד .</w:t>
+      </w:r>
+      <w:r>
+        <w:rPr>
+          <w:rStyle w:val="FootnoteReference"/>
+        </w:rPr>
+        <w:footnoteReference w:id="12"/>
       </w:r>
     </w:p>
     <w:p>
@@ -582,7 +663,13 @@
           <w:szCs w:val="24"/>
           <w:rtl/>
         </w:rPr>
-        <w:t xml:space="preserve">השאלה אם האנטישמיות המודרנית היא תופעה חדשה או המשך של שנאת היהודים לדורותיה עומדת במרכז ויכוח היסטוריוגרפי ותיק. שמואל אטינגר ראה בשנאת היהודים קו רצף היסטורי: הדימוי השלילי של היהודי, שהתגבש בעולם ההלניסטי ובנצרות הקדומה, עבר מדור לדור כמסורת תרבותית שאינה תלויה במציאות החברתית של היהודים בכל תקופה, ובכל משבר היא נשלפת מחדש ומולבשת על נסיבות הזמן. עם זאת, גם אטינגר הכיר בייחודה של האנטישמיות המודרנית. היא הופיעה לאחר האמנציפציה, כתגובה על השתלבות היהודים ולא על בידודם; היא הייתה תנועה פוליטית מאורגנת; והיא הציגה את היהודים לא כמיעוט דתי אלא ככוח מסתורי השולט בכלכלה, בעיתונות ובפוליטיקה (אטינגר, 1978, עמ' 1-46).</w:t>
+        <w:t xml:space="preserve">השאלה אם האנטישמיות המודרנית היא תופעה חדשה או המשך של שנאת היהודים לדורותיה עומדת במרכז ויכוח היסטוריוגרפי ותיק. שמואל אטינגר ראה בשנאת היהודים קו רצף היסטורי: הדימוי השלילי של היהודי, שהתגבש בעולם ההלניסטי ובנצרות הקדומה, עבר מדור לדור כמסורת תרבותית שאינה תלויה במציאות החברתית של היהודים בכל תקופה, ובכל משבר היא נשלפת מחדש ומולבשת על נסיבות הזמן. עם זאת, גם אטינגר הכיר בייחודה של האנטישמיות המודרנית. היא הופיעה לאחר האמנציפציה, כתגובה על השתלבות היהודים ולא על בידודם; היא הייתה תנועה פוליטית מאורגנת; והיא הציגה את היהודים לא כמיעוט דתי אלא ככוח מסתורי השולט בכלכלה, בעיתונות ובפוליטיקה .</w:t>
+      </w:r>
+      <w:r>
+        <w:rPr>
+          <w:rStyle w:val="FootnoteReference"/>
+        </w:rPr>
+        <w:footnoteReference w:id="13"/>
       </w:r>
     </w:p>
     <w:p>
@@ -598,7 +685,43 @@
           <w:szCs w:val="24"/>
           <w:rtl/>
         </w:rPr>
-        <w:t xml:space="preserve">דוד אנגל טען, מנגד, שעצם השימוש במושג "אנטישמיות" כקטגוריה אנליטית מטשטש יותר משהוא מאיר. המושג כורך יחד חקיקה מפלה, אלימות המונים, תעמולה מפלגתית ודעות קדומות פרטיות, ומניח מראש קו רצף ביניהן במקום להסביר כל תופעה בהקשרה. אנגל הציע לזנוח את המושג ולחקור את יחסי היהודים עם סביבתם באופן קונקרטי. סוזנה השל השיבה שהוויתור על המושג עלול להעלים מן המחקר דווקא את הממדים הרגשיים והחושיים של השנאה, שאינם ניתנים לרדוקציה לנסיבות פוליטיות מקומיות (אנגל, תש"ף, עמ' 13-55; השל, תש"ף, עמ' 5-30; Engel, 2009, pp. 30-53). תגובות נוספות על אנגל, שפורסמו באותו גיליון של "ציון", מחדדות את הצד המתודולוגי של הוויכוח. דיוויד פלדמן קיבל את טענתו של אנגל שהמושג הוא הבניה חברתית ולא נתון מן הטבע, והזכיר שכאשר נכנס המונח לשימוש בגרמניה בראשית שנות השמונים הוא ציין רק את מי שטענו ששוויון הזכויות ליהודים היה טעות, ורק באמצע שנות התשעים התרחב לכלול כל עוינות כלפי יהודים בכל הדורות. פלדמן הוסיף שהמושג שימש את המשתמשים בו לא רק לתאר את העולם אלא להשפיע עליו, כאשר סופרים יהודים כרכו יחד את הביקורת הגרמנית על האמנציפציה, את הפרעות ברוסיה ואת עלילת הדם בהונגריה כדי לחזק את היהודים ולפגוע באמינות יריביהם (פלדמן, תש"ף, עמ' 295-296). צפריר ברזלי הזכיר שכל קטגוריה היסטורית היא שרירותית במידת מה, וטען שאפשר להמשיך להשתמש במושג כל עוד ברור שאינו מייצג את התמונה המלאה של יחסי יהודים ולא־יהודים. שני המאפיינים שדרש ממחקר עתידי, התייחסות לרמה המקומית ובחינת התפתחויות בחברת הרוב גם כשאינן קשורות ישירות ליהודים, ישמשו את הדיון בהרצל בפרקים הבאים (ברזלי, תש"ף, עמ' 195-196, 206-207).</w:t>
+        <w:t xml:space="preserve">דוד אנגל טען, מנגד, שעצם השימוש במושג "אנטישמיות" כקטגוריה אנליטית מטשטש יותר משהוא מאיר. המושג כורך יחד חקיקה מפלה, אלימות המונים, תעמולה מפלגתית ודעות קדומות פרטיות, ומניח מראש קו רצף ביניהן במקום להסביר כל תופעה בהקשרה. אנגל הציע לזנוח את המושג ולחקור את יחסי היהודים עם סביבתם באופן קונקרטי. סוזנה השל השיבה שהוויתור על המושג עלול להעלים מן המחקר דווקא את הממדים הרגשיים והחושיים של השנאה, שאינם ניתנים לרדוקציה לנסיבות פוליטיות מקומיות .</w:t>
+      </w:r>
+      <w:r>
+        <w:rPr>
+          <w:rStyle w:val="FootnoteReference"/>
+        </w:rPr>
+        <w:footnoteReference w:id="14"/>
+      </w:r>
+      <w:r>
+        <w:rPr>
+          <w:rFonts w:ascii="David" w:cs="David" w:eastAsia="David" w:hAnsi="David"/>
+          <w:sz w:val="24"/>
+          <w:szCs w:val="24"/>
+          <w:rtl/>
+        </w:rPr>
+        <w:t xml:space="preserve"> תגובות נוספות על אנגל, שפורסמו באותו גיליון של "ציון", מחדדות את הצד המתודולוגי של הוויכוח. דיוויד פלדמן קיבל את טענתו של אנגל שהמושג הוא הבניה חברתית ולא נתון מן הטבע, והזכיר שכאשר נכנס המונח לשימוש בגרמניה בראשית שנות השמונים הוא ציין רק את מי שטענו ששוויון הזכויות ליהודים היה טעות, ורק באמצע שנות התשעים התרחב לכלול כל עוינות כלפי יהודים בכל הדורות. פלדמן הוסיף שהמושג שימש את המשתמשים בו לא רק לתאר את העולם אלא להשפיע עליו, כאשר סופרים יהודים כרכו יחד את הביקורת הגרמנית על האמנציפציה, את הפרעות ברוסיה ואת עלילת הדם בהונגריה כדי לחזק את היהודים ולפגוע באמינות יריביהם .</w:t>
+      </w:r>
+      <w:r>
+        <w:rPr>
+          <w:rStyle w:val="FootnoteReference"/>
+        </w:rPr>
+        <w:footnoteReference w:id="15"/>
+      </w:r>
+      <w:r>
+        <w:rPr>
+          <w:rFonts w:ascii="David" w:cs="David" w:eastAsia="David" w:hAnsi="David"/>
+          <w:sz w:val="24"/>
+          <w:szCs w:val="24"/>
+          <w:rtl/>
+        </w:rPr>
+        <w:t xml:space="preserve"> צפריר ברזלי הזכיר שכל קטגוריה היסטורית היא שרירותית במידת מה, וטען שאפשר להמשיך להשתמש במושג כל עוד ברור שאינו מייצג את התמונה המלאה של יחסי יהודים ולא־יהודים. שני המאפיינים שדרש ממחקר עתידי, התייחסות לרמה המקומית ובחינת התפתחויות בחברת הרוב גם כשאינן קשורות ישירות ליהודים, ישמשו את הדיון בהרצל בפרקים הבאים .</w:t>
+      </w:r>
+      <w:r>
+        <w:rPr>
+          <w:rStyle w:val="FootnoteReference"/>
+        </w:rPr>
+        <w:footnoteReference w:id="16"/>
       </w:r>
     </w:p>
     <w:p>
@@ -614,7 +737,13 @@
           <w:szCs w:val="24"/>
           <w:rtl/>
         </w:rPr>
-        <w:t xml:space="preserve">לוויכוח זה יש השלכה ישירה על הדיון בהרצל. גישתו של אנגל מחייבת להסביר את תגובתו בהקשר קונקרטי, הפוליטיקה הווינאית, מעמדו כעיתונאי, זהותו כיהודי מתבולל, ולא כתגובה ל"אנטישמיות" מופשטת שנתגלתה לו בפריז (אנגל, תש"ף, עמ' 13-55; ברזלי, תש"ף, עמ' 206-207).</w:t>
+        <w:t xml:space="preserve">לוויכוח זה יש השלכה ישירה על הדיון בהרצל. גישתו של אנגל מחייבת להסביר את תגובתו בהקשר קונקרטי, הפוליטיקה הווינאית, מעמדו כעיתונאי, זהותו כיהודי מתבולל, ולא כתגובה ל"אנטישמיות" מופשטת שנתגלתה לו בפריז .</w:t>
+      </w:r>
+      <w:r>
+        <w:rPr>
+          <w:rStyle w:val="FootnoteReference"/>
+        </w:rPr>
+        <w:footnoteReference w:id="17"/>
       </w:r>
     </w:p>
     <w:p>
@@ -649,7 +778,13 @@
           <w:szCs w:val="24"/>
           <w:rtl/>
         </w:rPr>
-        <w:t xml:space="preserve">האנטישמיות הפוליטית הופיעה בגרמניה בשלהי שנות השבעים, על רקע המשבר הכלכלי שפרץ בשנת 1873 ומשבר הליברליזם הגרמני. בשנת 1878 ייסד הכומר החצרוני אדולף שטקר את "מפלגת הפועלים הנוצרית־סוציאלית", שפנתה אל המעמד הבינוני הנמוך בברלין בסיסמאות נגד "ההון היהודי" ו"העיתונות היהודית". בנובמבר 1879 פרסם ההיסטוריון היינריך פון טרייצ'קה מאמר שבו קבע כי "היהודים הם אסוננו", משפט שהעניק לאנטישמיות לגיטימציה בקרב המשכילים והצית את "ויכוח האנטישמיות של ברלין". בשנים 1880-1881 הוגשה לביסמרק "עצומת האנטישמים", שדרשה להגביל את הגירת היהודים ואת גישתם למשרות ציבוריות, ועליה חתמו כרבע מיליון איש (כ"ץ, 1979, עמ' 261-289; Pulzer, 1988, pp. 88-105).</w:t>
+        <w:t xml:space="preserve">האנטישמיות הפוליטית הופיעה בגרמניה בשלהי שנות השבעים, על רקע המשבר הכלכלי שפרץ בשנת 1873 ומשבר הליברליזם הגרמני. בשנת 1878 ייסד הכומר החצרוני אדולף שטקר את "מפלגת הפועלים הנוצרית־סוציאלית", שפנתה אל המעמד הבינוני הנמוך בברלין בסיסמאות נגד "ההון היהודי" ו"העיתונות היהודית". בנובמבר 1879 פרסם ההיסטוריון היינריך פון טרייצ'קה מאמר שבו קבע כי "היהודים הם אסוננו", משפט שהעניק לאנטישמיות לגיטימציה בקרב המשכילים והצית את "ויכוח האנטישמיות של ברלין". בשנים 1880-1881 הוגשה לביסמרק "עצומת האנטישמים", שדרשה להגביל את הגירת היהודים ואת גישתם למשרות ציבוריות, ועליה חתמו כרבע מיליון איש .</w:t>
+      </w:r>
+      <w:r>
+        <w:rPr>
+          <w:rStyle w:val="FootnoteReference"/>
+        </w:rPr>
+        <w:footnoteReference w:id="18"/>
       </w:r>
     </w:p>
     <w:p>
@@ -665,7 +800,13 @@
           <w:szCs w:val="24"/>
           <w:rtl/>
         </w:rPr>
-        <w:t xml:space="preserve">לצד התנועה הפוליטית התפתחה גם תורה. בשנת 1881 פרסם הפילוסוף אויגן דירינג את חיבורו "השאלה היהודית כשאלה של גזע, מוסר ותרבות", שהציג את היהודים כגזע נחות ומזיק שאין לו תקנה, ושלל במפורש את המרת הדת כפתרון. דירינג הפך את האנטישמיות מעמדה דתית או כלכלית לתורה ביולוגית סגורה, וזהו החיבור שהרצל קרא בשנת 1882. באותה שנה התלוותה לתעמולה גם אלימות: בקיץ 1881 פרצו התפרעויות נגד יהודים בנוישטטין שבפומרניה ובעיירות סמוכות, לאחר שריפת בית הכנסת המקומי, והן היו הראשונות בגרמניה המאוחדת (כ"ץ, 1979, עמ' 290-308; Pulzer, 1988, pp. 49-52, 92-95).</w:t>
+        <w:t xml:space="preserve">לצד התנועה הפוליטית התפתחה גם תורה. בשנת 1881 פרסם הפילוסוף אויגן דירינג את חיבורו "השאלה היהודית כשאלה של גזע, מוסר ותרבות", שהציג את היהודים כגזע נחות ומזיק שאין לו תקנה, ושלל במפורש את המרת הדת כפתרון. דירינג הפך את האנטישמיות מעמדה דתית או כלכלית לתורה ביולוגית סגורה, וזהו החיבור שהרצל קרא בשנת 1882. באותה שנה התלוותה לתעמולה גם אלימות: בקיץ 1881 פרצו התפרעויות נגד יהודים בנוישטטין שבפומרניה ובעיירות סמוכות, לאחר שריפת בית הכנסת המקומי, והן היו הראשונות בגרמניה המאוחדת .</w:t>
+      </w:r>
+      <w:r>
+        <w:rPr>
+          <w:rStyle w:val="FootnoteReference"/>
+        </w:rPr>
+        <w:footnoteReference w:id="19"/>
       </w:r>
     </w:p>
     <w:p>
@@ -681,7 +822,13 @@
           <w:szCs w:val="24"/>
           <w:rtl/>
         </w:rPr>
-        <w:t xml:space="preserve">בשנות התשעים, השנים שבהן שהה הרצל בפריז, הגיעה האנטישמיות המפלגתית בגרמניה לשיאה. המורה אוטו בקל נבחר לרייכסטאג בשנת 1887 כציר האנטישמי הראשון, על מצע של איכרים בהסן נגד סוחרי הבקר היהודים; הרמן אלוורדט, מנהל בית ספר שהורשע בהוצאת דיבה, נבחר בשנת 1892; ובבחירות 1893 זכו המפלגות האנטישמיות בשישה עשר מושבים. באותה שנה אימצה המפלגה השמרנית, בתוכנית טיבולי, סעיף נגד "ההשפעה היהודית ההרסנית". ההצלחה הייתה מוגבלת: המפלגות האנטישמיות נותרו בשולי המערכת, התפצלו ושקעו לפני מלחמת העולם הראשונה. אך הן הראו שאנטישמיות יכולה לשמש מצע לגיוס פוליטי, ושהמפלגות הממוסדות מוכנות לאמץ את שפתה (Pulzer, 1988, pp. 106-130).</w:t>
+        <w:t xml:space="preserve">בשנות התשעים, השנים שבהן שהה הרצל בפריז, הגיעה האנטישמיות המפלגתית בגרמניה לשיאה. המורה אוטו בקל נבחר לרייכסטאג בשנת 1887 כציר האנטישמי הראשון, על מצע של איכרים בהסן נגד סוחרי הבקר היהודים; הרמן אלוורדט, מנהל בית ספר שהורשע בהוצאת דיבה, נבחר בשנת 1892; ובבחירות 1893 זכו המפלגות האנטישמיות בשישה עשר מושבים. באותה שנה אימצה המפלגה השמרנית, בתוכנית טיבולי, סעיף נגד "ההשפעה היהודית ההרסנית". ההצלחה הייתה מוגבלת: המפלגות האנטישמיות נותרו בשולי המערכת, התפצלו ושקעו לפני מלחמת העולם הראשונה. אך הן הראו שאנטישמיות יכולה לשמש מצע לגיוס פוליטי, ושהמפלגות הממוסדות מוכנות לאמץ את שפתה .</w:t>
+      </w:r>
+      <w:r>
+        <w:rPr>
+          <w:rStyle w:val="FootnoteReference"/>
+        </w:rPr>
+        <w:footnoteReference w:id="20"/>
       </w:r>
     </w:p>
     <w:p>
@@ -697,7 +844,13 @@
           <w:szCs w:val="24"/>
           <w:rtl/>
         </w:rPr>
-        <w:t xml:space="preserve">התגובה על האנטישמיות בגרמניה מלמדת על מקומה בתרבות הפוליטית. בשנת 1880 חתמו שבעים וחמישה אישי ציבור, ובהם ההיסטוריון תיאודור מומזן, על הצהרה נגד "ויכוח האנטישמיות"; בשנת 1891 נוסדה "האגודה להדיפת האנטישמיות", שרוב חבריה היו נוצרים ליברלים; ובשנת 1893 הקימו יהודי גרמניה את "האגודה המרכזית של אזרחים גרמנים בני הדת היהודית", שנועדה להיאבק באנטישמיות בכלים משפטיים ולהדגיש את הגרמניות של היהודים. ההתארגנות היהודית הזאת, שראתה בהגנה על האמנציפציה ולא ביציאה ממנה את התשובה, היא הרקע שעל פניו יבלוט הפתרון של הרצל (כ"ץ, 1979, עמ' 309-320; Pulzer, 1988, pp. 121-130).</w:t>
+        <w:t xml:space="preserve">התגובה על האנטישמיות בגרמניה מלמדת על מקומה בתרבות הפוליטית. בשנת 1880 חתמו שבעים וחמישה אישי ציבור, ובהם ההיסטוריון תיאודור מומזן, על הצהרה נגד "ויכוח האנטישמיות"; בשנת 1891 נוסדה "האגודה להדיפת האנטישמיות", שרוב חבריה היו נוצרים ליברלים; ובשנת 1893 הקימו יהודי גרמניה את "האגודה המרכזית של אזרחים גרמנים בני הדת היהודית", שנועדה להיאבק באנטישמיות בכלים משפטיים ולהדגיש את הגרמניות של היהודים. ההתארגנות היהודית הזאת, שראתה בהגנה על האמנציפציה ולא ביציאה ממנה את התשובה, היא הרקע שעל פניו יבלוט הפתרון של הרצל .</w:t>
+      </w:r>
+      <w:r>
+        <w:rPr>
+          <w:rStyle w:val="FootnoteReference"/>
+        </w:rPr>
+        <w:footnoteReference w:id="21"/>
       </w:r>
     </w:p>
     <w:p>
@@ -713,7 +866,13 @@
           <w:szCs w:val="24"/>
           <w:rtl/>
         </w:rPr>
-        <w:t xml:space="preserve">שולמית וולקוב הציעה מסגרת פרשנית להבנת התופעה. בשלהי המאה התשע עשרה הפכה האנטישמיות בגרמניה ל"קוד תרבותי": הצהרת עמדה אנטי־יהודית לא ביטאה בהכרח עמדה מגובשת בשאלת היהודים, אלא שימשה סימן היכר להשתייכות למחנה תרבותי־פוליטי שלם, שמרני, לאומי, אנטי־ליברלי, מתגעגע לחברה קדם־תעשייתית. ההתנגדות לאנטישמיות שימשה, באותה מידה, סימן להשתייכות למחנה הליברלי. כך הפכה "השאלה היהודית" לסמל במאבק על דמותה של גרמניה, גם כשמספר היהודים בה לא עלה על אחוז אחד מן האוכלוסייה. הרעיון מסביר מדוע יכול היה יהודי מתבולל כהרצל לחיות שנים בסביבה שבה האנטישמיות רווחת מבלי לראות בה איום קיומי. היא נתפשה כרטוריקה של מחנה, לא כתוכנית פעולה (וולקוב, 2002, עמ' 71-98; Volkov, 1978, pp. 25-46).</w:t>
+        <w:t xml:space="preserve">שולמית וולקוב הציעה מסגרת פרשנית להבנת התופעה. בשלהי המאה התשע עשרה הפכה האנטישמיות בגרמניה ל"קוד תרבותי": הצהרת עמדה אנטי־יהודית לא ביטאה בהכרח עמדה מגובשת בשאלת היהודים, אלא שימשה סימן היכר להשתייכות למחנה תרבותי־פוליטי שלם, שמרני, לאומי, אנטי־ליברלי, מתגעגע לחברה קדם־תעשייתית. ההתנגדות לאנטישמיות שימשה, באותה מידה, סימן להשתייכות למחנה הליברלי. כך הפכה "השאלה היהודית" לסמל במאבק על דמותה של גרמניה, גם כשמספר היהודים בה לא עלה על אחוז אחד מן האוכלוסייה. הרעיון מסביר מדוע יכול היה יהודי מתבולל כהרצל לחיות שנים בסביבה שבה האנטישמיות רווחת מבלי לראות בה איום קיומי. היא נתפשה כרטוריקה של מחנה, לא כתוכנית פעולה .</w:t>
+      </w:r>
+      <w:r>
+        <w:rPr>
+          <w:rStyle w:val="FootnoteReference"/>
+        </w:rPr>
+        <w:footnoteReference w:id="22"/>
       </w:r>
     </w:p>
     <w:p>
@@ -748,7 +907,13 @@
           <w:szCs w:val="24"/>
           <w:rtl/>
         </w:rPr>
-        <w:t xml:space="preserve">באוסטריה לבשה האנטישמיות הפוליטית צורה חריפה יותר, ובעיר הבירה וינה, שבה חיו כתשעה אחוזים יהודים, היא הגיעה להישג שלא היה לה בשום מקום אחר באירופה. גיאורג פון שנרר, מנהיג התנועה הפאן־גרמנית, הציג למן שנות השמונים תפישה גזעית מובהקת שלפיה אין יהודי יכול להיות גרמני, ובשנת 1885 הוסיף ל"תוכנית לינץ" של תנועתו סעיף הדורש להרחיק את "ההשפעה היהודית" מכל תחומי החיים הציבוריים. בנאומיו בפרלמנט האוסטרי בשנים 1882 ו-1887 דרש חקיקה מיוחדת נגד היהודים והציג היררכיה של "גרמניות" שבה היהודים עומדים בתחתית (מירון, 2022, עמ' 54-56; Pulzer, 1988, pp. 148-155).</w:t>
+        <w:t xml:space="preserve">באוסטריה לבשה האנטישמיות הפוליטית צורה חריפה יותר, ובעיר הבירה וינה, שבה חיו כתשעה אחוזים יהודים, היא הגיעה להישג שלא היה לה בשום מקום אחר באירופה. גיאורג פון שנרר, מנהיג התנועה הפאן־גרמנית, הציג למן שנות השמונים תפישה גזעית מובהקת שלפיה אין יהודי יכול להיות גרמני, ובשנת 1885 הוסיף ל"תוכנית לינץ" של תנועתו סעיף הדורש להרחיק את "ההשפעה היהודית" מכל תחומי החיים הציבוריים. בנאומיו בפרלמנט האוסטרי בשנים 1882 ו-1887 דרש חקיקה מיוחדת נגד היהודים והציג היררכיה של "גרמניות" שבה היהודים עומדים בתחתית .</w:t>
+      </w:r>
+      <w:r>
+        <w:rPr>
+          <w:rStyle w:val="FootnoteReference"/>
+        </w:rPr>
+        <w:footnoteReference w:id="23"/>
       </w:r>
     </w:p>
     <w:p>
@@ -764,7 +929,13 @@
           <w:szCs w:val="24"/>
           <w:rtl/>
         </w:rPr>
-        <w:t xml:space="preserve">עוצמת הזעזוע שחוללה האנטישמיות בווינה מובנת רק על רקע מה שקדם לה. חוקת 1867 העניקה ליהודי אוסטריה שוויון זכויות מלא, ובעשורים שלאחריה גדלה הקהילה היהודית של וינה מכעשרת אלפים נפש לכמאה וארבעים אלף, רובם מהגרים ממורביה, מבוהמיה, מהונגריה ומגליציה. יהודי וינה זיהו את עצמם עם המפלגה הליברלית, עם התרבות הגרמנית ועם הקיסר, ומילאו תפקיד בולט בעיתונות, בבנקאות, ברפואה ובאמנויות. משבר הבורסה של 1873 ושקיעת הליברליזם הפוליטי מאז שנות השמונים הפכו את ההזדהות הזאת לנטל, שכן היהודים זוהו עתה עם המחנה המפסיד ועם המערכת שנתפשה כמושחתת (Wistrich, 1989, pp. 3-61).</w:t>
+        <w:t xml:space="preserve">עוצמת הזעזוע שחוללה האנטישמיות בווינה מובנת רק על רקע מה שקדם לה. חוקת 1867 העניקה ליהודי אוסטריה שוויון זכויות מלא, ובעשורים שלאחריה גדלה הקהילה היהודית של וינה מכעשרת אלפים נפש לכמאה וארבעים אלף, רובם מהגרים ממורביה, מבוהמיה, מהונגריה ומגליציה. יהודי וינה זיהו את עצמם עם המפלגה הליברלית, עם התרבות הגרמנית ועם הקיסר, ומילאו תפקיד בולט בעיתונות, בבנקאות, ברפואה ובאמנויות. משבר הבורסה של 1873 ושקיעת הליברליזם הפוליטי מאז שנות השמונים הפכו את ההזדהות הזאת לנטל, שכן היהודים זוהו עתה עם המחנה המפסיד ועם המערכת שנתפשה כמושחתת .</w:t>
+      </w:r>
+      <w:r>
+        <w:rPr>
+          <w:rStyle w:val="FootnoteReference"/>
+        </w:rPr>
+        <w:footnoteReference w:id="24"/>
       </w:r>
     </w:p>
     <w:p>
@@ -780,7 +951,13 @@
           <w:szCs w:val="24"/>
           <w:rtl/>
         </w:rPr>
-        <w:t xml:space="preserve">ההצלחה הפוליטית הגדולה נפלה בחלקו של קרל לואגר ומפלגתו הנוצרית־סוציאלית. לואגר שילב אנטישמיות עממית עם קתוליות שמרנית ועם רפורמות מוניציפליות, ופנה אל בעלי המלאכה, הזעיר־בורגנים והפקידים הזוטרים של וינה, שחשו מאוימים מן הקפיטליזם ומן הליברליזם שזוהו בעיניהם עם היהודים. בבחירות לעיריית וינה באביב 1895 זכתה מפלגתו ברוב, ולואגר נבחר לראש העירייה. הקיסר פרנץ יוזף סירב לאשר את הבחירה במשך שנתיים, עד שנכנע באפריל 1897. היסטוריונים דנו בשאלת "האותנטיות" של האנטישמיות של לואגר, אך מבחינת יהודי וינה לא הייתה לשאלה חשיבות: לראשונה בתולדות אירופה המודרנית זכתה מפלגה שדגלה בגלוי באנטישמיות בשלטון בעיר בירה (מירון, 2022, עמ' 56-59; Wistrich, 1989, pp. 205-256).</w:t>
+        <w:t xml:space="preserve">ההצלחה הפוליטית הגדולה נפלה בחלקו של קרל לואגר ומפלגתו הנוצרית־סוציאלית. לואגר שילב אנטישמיות עממית עם קתוליות שמרנית ועם רפורמות מוניציפליות, ופנה אל בעלי המלאכה, הזעיר־בורגנים והפקידים הזוטרים של וינה, שחשו מאוימים מן הקפיטליזם ומן הליברליזם שזוהו בעיניהם עם היהודים. בבחירות לעיריית וינה באביב 1895 זכתה מפלגתו ברוב, ולואגר נבחר לראש העירייה. הקיסר פרנץ יוזף סירב לאשר את הבחירה במשך שנתיים, עד שנכנע באפריל 1897. היסטוריונים דנו בשאלת "האותנטיות" של האנטישמיות של לואגר, אך מבחינת יהודי וינה לא הייתה לשאלה חשיבות: לראשונה בתולדות אירופה המודרנית זכתה מפלגה שדגלה בגלוי באנטישמיות בשלטון בעיר בירה .</w:t>
+      </w:r>
+      <w:r>
+        <w:rPr>
+          <w:rStyle w:val="FootnoteReference"/>
+        </w:rPr>
+        <w:footnoteReference w:id="25"/>
       </w:r>
     </w:p>
     <w:p>
@@ -796,7 +973,13 @@
           <w:szCs w:val="24"/>
           <w:rtl/>
         </w:rPr>
-        <w:t xml:space="preserve">עליית לואגר השפיעה גם על החברה היהודית בווינה עצמה. לצד הרוב שהמשיך לדבוק בליברליזם קמו בשנות השמונים והתשעים אגודות סטודנטים יהודיות־לאומיות, ובראשן "קדימה" (1882), שדחו את ההתבוללות וקדמו להופעתו של הרצל בשנים רבות. הרעיון הלאומי היהודי היה "באוויר" של וינה בטרם ניסח אותו הרצל. קרל שורסקה תיאר את שנרר, לואגר והרצל כ"שלישייה אוסטרית" שיצרה "פוליטיקה בסולם חדש", פוליטיקה של המונים, של רגש ושל סמלים, שבאה במקום הפוליטיקה הפרלמנטרית של הליברליזם. לפי קריאתו, הרצל לא רק הגיב על האנטישמים הווינאים אלא למד מהם את שפת ההמונים ואת כוחו של המנהיג הכריזמטי (מירון, 2022, עמ' 58-59; Schorske, 1980, pp. 116-180).</w:t>
+        <w:t xml:space="preserve">עליית לואגר השפיעה גם על החברה היהודית בווינה עצמה. לצד הרוב שהמשיך לדבוק בליברליזם קמו בשנות השמונים והתשעים אגודות סטודנטים יהודיות־לאומיות, ובראשן "קדימה" (1882), שדחו את ההתבוללות וקדמו להופעתו של הרצל בשנים רבות. הרעיון הלאומי היהודי היה "באוויר" של וינה בטרם ניסח אותו הרצל. קרל שורסקה תיאר את שנרר, לואגר והרצל כ"שלישייה אוסטרית" שיצרה "פוליטיקה בסולם חדש", פוליטיקה של המונים, של רגש ושל סמלים, שבאה במקום הפוליטיקה הפרלמנטרית של הליברליזם. לפי קריאתו, הרצל לא רק הגיב על האנטישמים הווינאים אלא למד מהם את שפת ההמונים ואת כוחו של המנהיג הכריזמטי .</w:t>
+      </w:r>
+      <w:r>
+        <w:rPr>
+          <w:rStyle w:val="FootnoteReference"/>
+        </w:rPr>
+        <w:footnoteReference w:id="26"/>
       </w:r>
     </w:p>
     <w:p>
@@ -831,7 +1014,13 @@
           <w:szCs w:val="24"/>
           <w:rtl/>
         </w:rPr>
-        <w:t xml:space="preserve">צרפת נחשבת בצדק למולדת האמנציפציה היהודית. יהודיה זכו בשוויון זכויות בשנים 1790-1791, ומעמדם המשפטי נותר יציב לאורך המאה התשע עשרה חרף חילופי המשטר. השתלבותם במדינה הייתה עמוקה מבכל ארץ אחרת: יהודים שימשו קצינים בצבא, פקידים בכירים ופרופסורים, משרות שבגרמניה נמנעו מיהודים שלא המירו את דתם. פולה היימן הראתה שיהודי צרפת ראו במהפכה את "מעמד הר סיני" השני שלהם, ובשנת 1889, ביובל המאה למהפכה, חגגו את השתלבותם המלאה באומה מתוך תחושת ביטחון (מירון, 2022, עמ' 60-62; Hyman, 1998, pp. 89-95).</w:t>
+        <w:t xml:space="preserve">צרפת נחשבת בצדק למולדת האמנציפציה היהודית. יהודיה זכו בשוויון זכויות בשנים 1790-1791, ומעמדם המשפטי נותר יציב לאורך המאה התשע עשרה חרף חילופי המשטר. השתלבותם במדינה הייתה עמוקה מבכל ארץ אחרת: יהודים שימשו קצינים בצבא, פקידים בכירים ופרופסורים, משרות שבגרמניה נמנעו מיהודים שלא המירו את דתם. פולה היימן הראתה שיהודי צרפת ראו במהפכה את "מעמד הר סיני" השני שלהם, ובשנת 1889, ביובל המאה למהפכה, חגגו את השתלבותם המלאה באומה מתוך תחושת ביטחון .</w:t>
+      </w:r>
+      <w:r>
+        <w:rPr>
+          <w:rStyle w:val="FootnoteReference"/>
+        </w:rPr>
+        <w:footnoteReference w:id="27"/>
       </w:r>
     </w:p>
     <w:p>
@@ -847,7 +1036,13 @@
           <w:szCs w:val="24"/>
           <w:rtl/>
         </w:rPr>
-        <w:t xml:space="preserve">דווקא בצרפת הופיעה בשנות השמונים תעמולה אנטישמית מן החריפות באירופה. הרפובליקה השלישית, שנוסדה בשנת 1870 בעקבות התבוסה לפרוסיה, הייתה משטר שנוי במחלוקת. מול הממסד הרפובליקני, החילוני והליברלי, עמד מחנה שמרני, קתולי ומונרכיסטי, שראה במהפכה חטא קדמון ובקתוליות חלק מהותי מן הזהות הצרפתית. במאבק על אופייה "האמיתי" של צרפת נעשו היהודים לסמל של כל מה ששנאו מתנגדי הרפובליקה: החילוניות, הקפיטליזם, הפרלמנטריזם, ואף הזיקה לאויב הגרמני, שכן רבים מיהודי צרפת, ובהם משפחת דרייפוס, באו מאלזס־לורן שסופחה לגרמניה בשנת 1871 (Hyman, 1998, pp. 95-99; Wilson, 1982, pp. 3-35).</w:t>
+        <w:t xml:space="preserve">דווקא בצרפת הופיעה בשנות השמונים תעמולה אנטישמית מן החריפות באירופה. הרפובליקה השלישית, שנוסדה בשנת 1870 בעקבות התבוסה לפרוסיה, הייתה משטר שנוי במחלוקת. מול הממסד הרפובליקני, החילוני והליברלי, עמד מחנה שמרני, קתולי ומונרכיסטי, שראה במהפכה חטא קדמון ובקתוליות חלק מהותי מן הזהות הצרפתית. במאבק על אופייה "האמיתי" של צרפת נעשו היהודים לסמל של כל מה ששנאו מתנגדי הרפובליקה: החילוניות, הקפיטליזם, הפרלמנטריזם, ואף הזיקה לאויב הגרמני, שכן רבים מיהודי צרפת, ובהם משפחת דרייפוס, באו מאלזס־לורן שסופחה לגרמניה בשנת 1871 .</w:t>
+      </w:r>
+      <w:r>
+        <w:rPr>
+          <w:rStyle w:val="FootnoteReference"/>
+        </w:rPr>
+        <w:footnoteReference w:id="28"/>
       </w:r>
     </w:p>
     <w:p>
@@ -863,7 +1058,13 @@
           <w:szCs w:val="24"/>
           <w:rtl/>
         </w:rPr>
-        <w:t xml:space="preserve">הביטוי המובהק לתעמולה זו היה ספרו של אדואר דרימון "צרפת המיוהדת" (1886), שזכה ליותר ממאה מהדורות בתוך שנים ספורות. דרימון שילב את השנאה הקתולית המסורתית, את הביקורת הסוציאלית על ההון הפיננסי ואת תורת הגזע החדשה. הוא תיאר את היהודים כגזע שמי בעל תכונות קבועות, חמדנות, ערמומיות וחוסר כושר יצירה, המנוגד לגזע הארי הצרפתי, ואת תולדות צרפת מאז המהפכה כסיפור של השתלטות יהודית הדרגתית על הכלכלה, על העיתונות ועל השלטון. הפתרון שהציע, הפקעת רכוש היהודים והרחקתם מן החיים הציבוריים, נוסח מתוך פסימיות ביחס לסיכויי הגשמתו, אך הוא הכין את הקרקע לתפישה שיהודי אינו יכול להיות צרפתי נאמן (דרימון, 1886, עמ' 443-444; Hyman, 1998, pp. 96-98).</w:t>
+        <w:t xml:space="preserve">הביטוי המובהק לתעמולה זו היה ספרו של אדואר דרימון "צרפת המיוהדת" (1886), שזכה ליותר ממאה מהדורות בתוך שנים ספורות. דרימון שילב את השנאה הקתולית המסורתית, את הביקורת הסוציאלית על ההון הפיננסי ואת תורת הגזע החדשה. הוא תיאר את היהודים כגזע שמי בעל תכונות קבועות, חמדנות, ערמומיות וחוסר כושר יצירה, המנוגד לגזע הארי הצרפתי, ואת תולדות צרפת מאז המהפכה כסיפור של השתלטות יהודית הדרגתית על הכלכלה, על העיתונות ועל השלטון. הפתרון שהציע, הפקעת רכוש היהודים והרחקתם מן החיים הציבוריים, נוסח מתוך פסימיות ביחס לסיכויי הגשמתו, אך הוא הכין את הקרקע לתפישה שיהודי אינו יכול להיות צרפתי נאמן .</w:t>
+      </w:r>
+      <w:r>
+        <w:rPr>
+          <w:rStyle w:val="FootnoteReference"/>
+        </w:rPr>
+        <w:footnoteReference w:id="29"/>
       </w:r>
     </w:p>
     <w:p>
@@ -879,7 +1080,13 @@
           <w:szCs w:val="24"/>
           <w:rtl/>
         </w:rPr>
-        <w:t xml:space="preserve">בין הופעת ספרו של דרימון לבין פרשת דרייפוס עברה על צרפת גם תנועת בולנז'ה (1887-1889), שבה התלכדו סביב הגנרל ז'ורז' בולנז'ה מונרכיסטים, בונפרטיסטים ורדיקלים ממורמרים בדרישה לרוויזיה של החוקה ולנקמה בגרמניה. התנועה נכשלה, אך היא הראתה שאפשר לגייס המונים נגד הרפובליקה הפרלמנטרית בשם האומה, ובשוליה נוצר החיבור בין לאומנות עממית לאנטישמיות שיאפיין את המחנה האנטי־דרייפוסארי. סטיבן וילסון ראה בשנים אלה את התקופה שבה עברה האנטישמיות הצרפתית מן הספר אל הרחוב (Wilson, 1982, pp. 36-70; Cahm, 1996, pp. 1-24).</w:t>
+        <w:t xml:space="preserve">בין הופעת ספרו של דרימון לבין פרשת דרייפוס עברה על צרפת גם תנועת בולנז'ה (1887-1889), שבה התלכדו סביב הגנרל ז'ורז' בולנז'ה מונרכיסטים, בונפרטיסטים ורדיקלים ממורמרים בדרישה לרוויזיה של החוקה ולנקמה בגרמניה. התנועה נכשלה, אך היא הראתה שאפשר לגייס המונים נגד הרפובליקה הפרלמנטרית בשם האומה, ובשוליה נוצר החיבור בין לאומנות עממית לאנטישמיות שיאפיין את המחנה האנטי־דרייפוסארי. סטיבן וילסון ראה בשנים אלה את התקופה שבה עברה האנטישמיות הצרפתית מן הספר אל הרחוב .</w:t>
+      </w:r>
+      <w:r>
+        <w:rPr>
+          <w:rStyle w:val="FootnoteReference"/>
+        </w:rPr>
+        <w:footnoteReference w:id="30"/>
       </w:r>
     </w:p>
     <w:p>
@@ -895,7 +1102,13 @@
           <w:szCs w:val="24"/>
           <w:rtl/>
         </w:rPr>
-        <w:t xml:space="preserve">בשנות התשעים התמסדה האנטישמיות הצרפתית לתנועה. בשנת 1892 ייסד דרימון את היומון "לה ליבר פארול", שהיה לשופר האנטישמיות ושמילא תפקיד מרכזי בפרשת דרייפוס. באותה שנה סיפקה שערוריית פנמה, פרשת שחיתות שבה היו מעורבים כמה מתווכים יהודים, חומר בעירה לתעמולתו. היומון הקתולי "לה קרואה" של מסדר האסומפציוניסטים הכריז על עצמו "העיתון האנטי־יהודי ביותר בצרפת"; המרקיז דה מורס ארגן כנופיות של סבלים משוק הבשר להפגנות ולתגרות; ובשנת 1897 ייסד ז'ול גראן את "הליגה האנטישמית של צרפת". באלג'יריה הצרפתית, שבה קיבלו היהודים אזרחות בצו כרמייה (1870), צמחה תנועה אנטישמית עממית שהגיעה לשיאה בבחירת מקס רז'יס לראשות עיריית אלג'יר ובמהומות הדמים של 1898 (Wilson, 1982, pp. 106-124, 171-200; Birnbaum, 2003, pp. 1-22).</w:t>
+        <w:t xml:space="preserve">בשנות התשעים התמסדה האנטישמיות הצרפתית לתנועה. בשנת 1892 ייסד דרימון את היומון "לה ליבר פארול", שהיה לשופר האנטישמיות ושמילא תפקיד מרכזי בפרשת דרייפוס. באותה שנה סיפקה שערוריית פנמה, פרשת שחיתות שבה היו מעורבים כמה מתווכים יהודים, חומר בעירה לתעמולתו. היומון הקתולי "לה קרואה" של מסדר האסומפציוניסטים הכריז על עצמו "העיתון האנטי־יהודי ביותר בצרפת"; המרקיז דה מורס ארגן כנופיות של סבלים משוק הבשר להפגנות ולתגרות; ובשנת 1897 ייסד ז'ול גראן את "הליגה האנטישמית של צרפת". באלג'יריה הצרפתית, שבה קיבלו היהודים אזרחות בצו כרמייה (1870), צמחה תנועה אנטישמית עממית שהגיעה לשיאה בבחירת מקס רז'יס לראשות עיריית אלג'יר ובמהומות הדמים של 1898 .</w:t>
+      </w:r>
+      <w:r>
+        <w:rPr>
+          <w:rStyle w:val="FootnoteReference"/>
+        </w:rPr>
+        <w:footnoteReference w:id="31"/>
       </w:r>
     </w:p>
     <w:p>
@@ -911,7 +1124,13 @@
           <w:szCs w:val="24"/>
           <w:rtl/>
         </w:rPr>
-        <w:t xml:space="preserve">התגובה היהודית לתעמולה זו הייתה מאופקת. ההנהגה הקהילתית, ובראשה הקונסיסטוריה, בחרה בשתיקה ובהסתמכות על המדינה, מחשש שכל פעולה יהודית קולקטיבית תאשר את האשמת "הסינדיקט" היהודי. מייקל מרוס ראה בהתנהגות זו כישלון של אסטרטגיית ההתבוללות; היימן הציעה קריאה סלחנית יותר, שלפיה האיפוק היה בחירה רציונלית של קהילה שביטחונה נשען על הרפובליקה. יוצא דופן היה ברנאר לאזאר, פובליציסט אנרכיסט ממוצא יהודי, שפרסם בשנת 1894 את ספרו "האנטישמיות: תולדותיה וסיבותיה", ובו ניסה להסביר את השנאה במונחים סוציולוגיים ואף הטיל חלק מן האחריות על היהודים עצמם. שנתיים לאחר מכן יהיה לאזאר הראשון שיילחם בפומבי למען דרייפוס (Hyman, 1998, pp. 104-106; Marrus, 1971, pp. 196-242).</w:t>
+        <w:t xml:space="preserve">התגובה היהודית לתעמולה זו הייתה מאופקת. ההנהגה הקהילתית, ובראשה הקונסיסטוריה, בחרה בשתיקה ובהסתמכות על המדינה, מחשש שכל פעולה יהודית קולקטיבית תאשר את האשמת "הסינדיקט" היהודי. מייקל מרוס ראה בהתנהגות זו כישלון של אסטרטגיית ההתבוללות; היימן הציעה קריאה סלחנית יותר, שלפיה האיפוק היה בחירה רציונלית של קהילה שביטחונה נשען על הרפובליקה. יוצא דופן היה ברנאר לאזאר, פובליציסט אנרכיסט ממוצא יהודי, שפרסם בשנת 1894 את ספרו "האנטישמיות: תולדותיה וסיבותיה", ובו ניסה להסביר את השנאה במונחים סוציולוגיים ואף הטיל חלק מן האחריות על היהודים עצמם. שנתיים לאחר מכן יהיה לאזאר הראשון שיילחם בפומבי למען דרייפוס .</w:t>
+      </w:r>
+      <w:r>
+        <w:rPr>
+          <w:rStyle w:val="FootnoteReference"/>
+        </w:rPr>
+        <w:footnoteReference w:id="32"/>
       </w:r>
     </w:p>
     <w:p>
@@ -927,7 +1146,13 @@
           <w:szCs w:val="24"/>
           <w:rtl/>
         </w:rPr>
-        <w:t xml:space="preserve">היימן הצביעה על פער בין ההצלחה הרטורית של האנטישמיות הצרפתית לבין הצלחתה הפוליטית. בניגוד לגרמניה ולאוסטריה, לא קמה בצרפת מפלגה אנטישמית של ממש, ובבחירות 1898, בשיא הפרשה, נבחרו כעשרים ושניים צירים על מצע אנטישמי, רבים מהם מאלג'יריה. ההסבר טמון בעוצמת המסורת הרפובליקנית ובכך שהאנטישמיות הצרפתית נותרה תופעה של אופוזיציה, של מי שדחו את הרפובליקה עצמה. אך דווקא משום כך יכלה פרשת דרייפוס להפוך למאבק על עצם קיומה של הרפובליקה ולעמוד במוקד הפוליטיקה הצרפתית במשך שנים, בניגוד לאנטישמיות הגרמנית שנותרה בשוליים (מירון, 2022, עמ' 63; Hyman, 1998, pp. 98-99, 111-114).</w:t>
+        <w:t xml:space="preserve">היימן הצביעה על פער בין ההצלחה הרטורית של האנטישמיות הצרפתית לבין הצלחתה הפוליטית. בניגוד לגרמניה ולאוסטריה, לא קמה בצרפת מפלגה אנטישמית של ממש, ובבחירות 1898, בשיא הפרשה, נבחרו כעשרים ושניים צירים על מצע אנטישמי, רבים מהם מאלג'יריה. ההסבר טמון בעוצמת המסורת הרפובליקנית ובכך שהאנטישמיות הצרפתית נותרה תופעה של אופוזיציה, של מי שדחו את הרפובליקה עצמה. אך דווקא משום כך יכלה פרשת דרייפוס להפוך למאבק על עצם קיומה של הרפובליקה ולעמוד במוקד הפוליטיקה הצרפתית במשך שנים, בניגוד לאנטישמיות הגרמנית שנותרה בשוליים .</w:t>
+      </w:r>
+      <w:r>
+        <w:rPr>
+          <w:rStyle w:val="FootnoteReference"/>
+        </w:rPr>
+        <w:footnoteReference w:id="33"/>
       </w:r>
     </w:p>
     <w:p>
@@ -962,7 +1187,13 @@
           <w:szCs w:val="24"/>
           <w:rtl/>
         </w:rPr>
-        <w:t xml:space="preserve">שלושת המקרים שנסקרו נבדלים זה מזה באופן שיסייע להבין את תגובתו של הרצל. בגרמניה הייתה האנטישמיות מושרשת בתרבות הפוליטית, אך המפלגות שנשאו אותה נותרו שוליות. בצרפת הייתה התעמולה עוצמתית והרחוב סוער, אך הכוח הפוליטי חלש, והמאבק על דרייפוס הסתיים בניצחון הרפובליקה. באוסטריה, ורק בה, כבשה מפלגה אנטישמית את השלטון בעיר הבירה, בשנת 1895, בדיוק בחודשים שבהם ניסח הרצל את רעיונו. ההבדל בין המקרים נוגע גם למקום שתפסה האנטישמיות במערכת הפוליטית. בגרמניה ובאוסטריה הייתה האנטישמיות עניין מפלגתי, שאפשר היה למדוד את כוחו במושבים ובקולות, ובשתיהן היא נשענה על שכבות חברתיות מוגדרות של זעיר־בורגנות, איכרים ובעלי מלאכה. בצרפת הייתה האנטישמיות עניין של עיתונות, של ליגות ושל רחוב, ומחנותיה חצו את הגבולות המפלגתיים. מבחינת משקיף יהודי, האנטישמיות הגרמנית והאוסטרית נראתה ניתנת לחיזוי, ואילו הצרפתית נראתה פתאומית ומפתיעה, ודווקא משום כך התאימה לשמש, בדיעבד, סמל להתפרצות בלתי צפויה של שנאה במקום שבו לא ציפו לה (Hyman, 1998, pp. 111-114; Pulzer, 1988, pp. 47-57).</w:t>
+        <w:t xml:space="preserve">שלושת המקרים שנסקרו נבדלים זה מזה באופן שיסייע להבין את תגובתו של הרצל. בגרמניה הייתה האנטישמיות מושרשת בתרבות הפוליטית, אך המפלגות שנשאו אותה נותרו שוליות. בצרפת הייתה התעמולה עוצמתית והרחוב סוער, אך הכוח הפוליטי חלש, והמאבק על דרייפוס הסתיים בניצחון הרפובליקה. באוסטריה, ורק בה, כבשה מפלגה אנטישמית את השלטון בעיר הבירה, בשנת 1895, בדיוק בחודשים שבהם ניסח הרצל את רעיונו. ההבדל בין המקרים נוגע גם למקום שתפסה האנטישמיות במערכת הפוליטית. בגרמניה ובאוסטריה הייתה האנטישמיות עניין מפלגתי, שאפשר היה למדוד את כוחו במושבים ובקולות, ובשתיהן היא נשענה על שכבות חברתיות מוגדרות של זעיר־בורגנות, איכרים ובעלי מלאכה. בצרפת הייתה האנטישמיות עניין של עיתונות, של ליגות ושל רחוב, ומחנותיה חצו את הגבולות המפלגתיים. מבחינת משקיף יהודי, האנטישמיות הגרמנית והאוסטרית נראתה ניתנת לחיזוי, ואילו הצרפתית נראתה פתאומית ומפתיעה, ודווקא משום כך התאימה לשמש, בדיעבד, סמל להתפרצות בלתי צפויה של שנאה במקום שבו לא ציפו לה .</w:t>
+      </w:r>
+      <w:r>
+        <w:rPr>
+          <w:rStyle w:val="FootnoteReference"/>
+        </w:rPr>
+        <w:footnoteReference w:id="34"/>
       </w:r>
     </w:p>
     <w:p>
@@ -978,7 +1209,13 @@
           <w:szCs w:val="24"/>
           <w:rtl/>
         </w:rPr>
-        <w:t xml:space="preserve">הרצל עצמו הגיע אל שנות התשעים כיהודי מתבולל שכבר הכיר את האנטישמיות הווינאית מקרוב, שסיקר את האנטישמיות הצרפתית כעיתונאי, ושהיה נתון במשבר אישי. על רקע זה יבחן הפרק הבא את הגורמים למהפך שלו שאינם קשורים לפרשת דרייפוס (אבינרי, 2007, עמ' 15-56; Hyman, 1998, pp. 111-114; Pulzer, 1988, pp. 47-57).</w:t>
+        <w:t xml:space="preserve">הרצל עצמו הגיע אל שנות התשעים כיהודי מתבולל שכבר הכיר את האנטישמיות הווינאית מקרוב, שסיקר את האנטישמיות הצרפתית כעיתונאי, ושהיה נתון במשבר אישי. על רקע זה יבחן הפרק הבא את הגורמים למהפך שלו שאינם קשורים לפרשת דרייפוס .</w:t>
+      </w:r>
+      <w:r>
+        <w:rPr>
+          <w:rStyle w:val="FootnoteReference"/>
+        </w:rPr>
+        <w:footnoteReference w:id="35"/>
       </w:r>
     </w:p>
     <w:p>
@@ -2169,6 +2406,2434 @@
       </w:r>
       <w:r>
         <w:continuationSeparator/>
+      </w:r>
+    </w:p>
+  </w:footnote>
+  <w:footnote w:id="1">
+    <w:p>
+      <w:pPr>
+        <w:bidi w:val="false"/>
+        <w:spacing w:after="40" w:line="240" w:lineRule="auto"/>
+        <w:jc w:val="left"/>
+      </w:pPr>
+      <w:r>
+        <w:rPr>
+          <w:rStyle w:val="FootnoteReference"/>
+        </w:rPr>
+        <w:footnoteRef/>
+      </w:r>
+      <w:r>
+        <w:rPr>
+          <w:rFonts w:ascii="David" w:cs="David" w:eastAsia="David" w:hAnsi="David"/>
+          <w:sz w:val="20"/>
+          <w:szCs w:val="20"/>
+        </w:rPr>
+        <w:t xml:space="preserve"> </w:t>
+      </w:r>
+      <w:r>
+        <w:rPr>
+          <w:rFonts w:ascii="David" w:cs="David" w:eastAsia="David" w:hAnsi="David"/>
+          <w:sz w:val="20"/>
+          <w:szCs w:val="20"/>
+          <w:rtl w:val="false"/>
+        </w:rPr>
+        <w:t xml:space="preserve">Theodor Herzl, "Zionism," </w:t>
+      </w:r>
+      <w:r>
+        <w:rPr>
+          <w:rFonts w:ascii="David" w:cs="David" w:eastAsia="David" w:hAnsi="David"/>
+          <w:i/>
+          <w:iCs/>
+          <w:sz w:val="20"/>
+          <w:szCs w:val="20"/>
+          <w:rtl w:val="false"/>
+        </w:rPr>
+        <w:t xml:space="preserve">The North American Review</w:t>
+      </w:r>
+      <w:r>
+        <w:rPr>
+          <w:rFonts w:ascii="David" w:cs="David" w:eastAsia="David" w:hAnsi="David"/>
+          <w:sz w:val="20"/>
+          <w:szCs w:val="20"/>
+          <w:rtl w:val="false"/>
+        </w:rPr>
+        <w:t xml:space="preserve"> 169 (July 1899), pp. 1-8.</w:t>
+      </w:r>
+    </w:p>
+  </w:footnote>
+  <w:footnote w:id="2">
+    <w:p>
+      <w:pPr>
+        <w:bidi w:val="false"/>
+        <w:spacing w:after="40" w:line="240" w:lineRule="auto"/>
+        <w:jc w:val="left"/>
+      </w:pPr>
+      <w:r>
+        <w:rPr>
+          <w:rStyle w:val="FootnoteReference"/>
+        </w:rPr>
+        <w:footnoteRef/>
+      </w:r>
+      <w:r>
+        <w:rPr>
+          <w:rFonts w:ascii="David" w:cs="David" w:eastAsia="David" w:hAnsi="David"/>
+          <w:sz w:val="20"/>
+          <w:szCs w:val="20"/>
+        </w:rPr>
+        <w:t xml:space="preserve"> </w:t>
+      </w:r>
+      <w:r>
+        <w:rPr>
+          <w:rFonts w:ascii="David" w:cs="David" w:eastAsia="David" w:hAnsi="David"/>
+          <w:sz w:val="20"/>
+          <w:szCs w:val="20"/>
+          <w:rtl/>
+        </w:rPr>
+        <w:t xml:space="preserve">שלמה אבינרי, </w:t>
+      </w:r>
+      <w:r>
+        <w:rPr>
+          <w:rFonts w:ascii="David" w:cs="David" w:eastAsia="David" w:hAnsi="David"/>
+          <w:b/>
+          <w:bCs/>
+          <w:i w:val="false"/>
+          <w:iCs w:val="false"/>
+          <w:sz w:val="20"/>
+          <w:szCs w:val="20"/>
+          <w:rtl/>
+        </w:rPr>
+        <w:t xml:space="preserve">הרצל</w:t>
+      </w:r>
+      <w:r>
+        <w:rPr>
+          <w:rFonts w:ascii="David" w:cs="David" w:eastAsia="David" w:hAnsi="David"/>
+          <w:sz w:val="20"/>
+          <w:szCs w:val="20"/>
+          <w:rtl/>
+        </w:rPr>
+        <w:t xml:space="preserve"> (ירושלים: מרכז זלמן שזר, 2007), עמ' 84-108; Jacques Kornberg, </w:t>
+      </w:r>
+      <w:r>
+        <w:rPr>
+          <w:rFonts w:ascii="David" w:cs="David" w:eastAsia="David" w:hAnsi="David"/>
+          <w:i/>
+          <w:iCs/>
+          <w:sz w:val="20"/>
+          <w:szCs w:val="20"/>
+          <w:rtl w:val="false"/>
+        </w:rPr>
+        <w:t xml:space="preserve">Theodor Herzl: From Assimilation to Zionism</w:t>
+      </w:r>
+      <w:r>
+        <w:rPr>
+          <w:rFonts w:ascii="David" w:cs="David" w:eastAsia="David" w:hAnsi="David"/>
+          <w:sz w:val="20"/>
+          <w:szCs w:val="20"/>
+          <w:rtl w:val="false"/>
+        </w:rPr>
+        <w:t xml:space="preserve"> (Bloomington: Indiana University Press, 1993), pp. 183-202.</w:t>
+      </w:r>
+    </w:p>
+  </w:footnote>
+  <w:footnote w:id="3">
+    <w:p>
+      <w:pPr>
+        <w:bidi w:val="false"/>
+        <w:spacing w:after="40" w:line="240" w:lineRule="auto"/>
+        <w:jc w:val="left"/>
+      </w:pPr>
+      <w:r>
+        <w:rPr>
+          <w:rStyle w:val="FootnoteReference"/>
+        </w:rPr>
+        <w:footnoteRef/>
+      </w:r>
+      <w:r>
+        <w:rPr>
+          <w:rFonts w:ascii="David" w:cs="David" w:eastAsia="David" w:hAnsi="David"/>
+          <w:sz w:val="20"/>
+          <w:szCs w:val="20"/>
+        </w:rPr>
+        <w:t xml:space="preserve"> </w:t>
+      </w:r>
+      <w:r>
+        <w:rPr>
+          <w:rFonts w:ascii="David" w:cs="David" w:eastAsia="David" w:hAnsi="David"/>
+          <w:sz w:val="20"/>
+          <w:szCs w:val="20"/>
+          <w:rtl/>
+        </w:rPr>
+        <w:t xml:space="preserve">שמואל אטינגר, </w:t>
+      </w:r>
+      <w:r>
+        <w:rPr>
+          <w:rFonts w:ascii="David" w:cs="David" w:eastAsia="David" w:hAnsi="David"/>
+          <w:b/>
+          <w:bCs/>
+          <w:i w:val="false"/>
+          <w:iCs w:val="false"/>
+          <w:sz w:val="20"/>
+          <w:szCs w:val="20"/>
+          <w:rtl/>
+        </w:rPr>
+        <w:t xml:space="preserve">האנטישמיות בעת החדשה: פרקי מחקר ועיון</w:t>
+      </w:r>
+      <w:r>
+        <w:rPr>
+          <w:rFonts w:ascii="David" w:cs="David" w:eastAsia="David" w:hAnsi="David"/>
+          <w:sz w:val="20"/>
+          <w:szCs w:val="20"/>
+          <w:rtl/>
+        </w:rPr>
+        <w:t xml:space="preserve"> (תל אביב: מורשת וספרית פועלים, 1978), עמ' 1-28; David Engel, "Away from a Definition of Antisemitism: An Essay in the Semantics of Historical Description," in Jeremy Cohen and Moshe Rosman (eds.), </w:t>
+      </w:r>
+      <w:r>
+        <w:rPr>
+          <w:rFonts w:ascii="David" w:cs="David" w:eastAsia="David" w:hAnsi="David"/>
+          <w:i/>
+          <w:iCs/>
+          <w:sz w:val="20"/>
+          <w:szCs w:val="20"/>
+          <w:rtl w:val="false"/>
+        </w:rPr>
+        <w:t xml:space="preserve">Rethinking European Jewish History</w:t>
+      </w:r>
+      <w:r>
+        <w:rPr>
+          <w:rFonts w:ascii="David" w:cs="David" w:eastAsia="David" w:hAnsi="David"/>
+          <w:sz w:val="20"/>
+          <w:szCs w:val="20"/>
+          <w:rtl w:val="false"/>
+        </w:rPr>
+        <w:t xml:space="preserve"> (Oxford: Littman Library, 2009), pp. 30-53.</w:t>
+      </w:r>
+    </w:p>
+  </w:footnote>
+  <w:footnote w:id="4">
+    <w:p>
+      <w:pPr>
+        <w:bidi w:val="false"/>
+        <w:spacing w:after="40" w:line="240" w:lineRule="auto"/>
+        <w:jc w:val="left"/>
+      </w:pPr>
+      <w:r>
+        <w:rPr>
+          <w:rStyle w:val="FootnoteReference"/>
+        </w:rPr>
+        <w:footnoteRef/>
+      </w:r>
+      <w:r>
+        <w:rPr>
+          <w:rFonts w:ascii="David" w:cs="David" w:eastAsia="David" w:hAnsi="David"/>
+          <w:sz w:val="20"/>
+          <w:szCs w:val="20"/>
+        </w:rPr>
+        <w:t xml:space="preserve"> </w:t>
+      </w:r>
+      <w:r>
+        <w:rPr>
+          <w:rFonts w:ascii="David" w:cs="David" w:eastAsia="David" w:hAnsi="David"/>
+          <w:sz w:val="20"/>
+          <w:szCs w:val="20"/>
+          <w:rtl/>
+        </w:rPr>
+        <w:t xml:space="preserve">אבינרי, </w:t>
+      </w:r>
+      <w:r>
+        <w:rPr>
+          <w:rFonts w:ascii="David" w:cs="David" w:eastAsia="David" w:hAnsi="David"/>
+          <w:b/>
+          <w:bCs/>
+          <w:i w:val="false"/>
+          <w:iCs w:val="false"/>
+          <w:sz w:val="20"/>
+          <w:szCs w:val="20"/>
+          <w:rtl/>
+        </w:rPr>
+        <w:t xml:space="preserve">הרצל</w:t>
+      </w:r>
+      <w:r>
+        <w:rPr>
+          <w:rFonts w:ascii="David" w:cs="David" w:eastAsia="David" w:hAnsi="David"/>
+          <w:sz w:val="20"/>
+          <w:szCs w:val="20"/>
+          <w:rtl/>
+        </w:rPr>
+        <w:t xml:space="preserve">, עמ' 84-108; Kornberg, </w:t>
+      </w:r>
+      <w:r>
+        <w:rPr>
+          <w:rFonts w:ascii="David" w:cs="David" w:eastAsia="David" w:hAnsi="David"/>
+          <w:i/>
+          <w:iCs/>
+          <w:sz w:val="20"/>
+          <w:szCs w:val="20"/>
+          <w:rtl w:val="false"/>
+        </w:rPr>
+        <w:t xml:space="preserve">Theodor Herzl</w:t>
+      </w:r>
+      <w:r>
+        <w:rPr>
+          <w:rFonts w:ascii="David" w:cs="David" w:eastAsia="David" w:hAnsi="David"/>
+          <w:sz w:val="20"/>
+          <w:szCs w:val="20"/>
+          <w:rtl w:val="false"/>
+        </w:rPr>
+        <w:t xml:space="preserve">, pp. 183-202; Derek Penslar, </w:t>
+      </w:r>
+      <w:r>
+        <w:rPr>
+          <w:rFonts w:ascii="David" w:cs="David" w:eastAsia="David" w:hAnsi="David"/>
+          <w:i/>
+          <w:iCs/>
+          <w:sz w:val="20"/>
+          <w:szCs w:val="20"/>
+          <w:rtl w:val="false"/>
+        </w:rPr>
+        <w:t xml:space="preserve">Theodor Herzl: The Charismatic Leader</w:t>
+      </w:r>
+      <w:r>
+        <w:rPr>
+          <w:rFonts w:ascii="David" w:cs="David" w:eastAsia="David" w:hAnsi="David"/>
+          <w:sz w:val="20"/>
+          <w:szCs w:val="20"/>
+          <w:rtl w:val="false"/>
+        </w:rPr>
+        <w:t xml:space="preserve"> (New Haven: Yale University Press, 2020), pp. 49-70.</w:t>
+      </w:r>
+    </w:p>
+  </w:footnote>
+  <w:footnote w:id="5">
+    <w:p>
+      <w:pPr>
+        <w:bidi w:val="false"/>
+        <w:spacing w:after="40" w:line="240" w:lineRule="auto"/>
+        <w:jc w:val="left"/>
+      </w:pPr>
+      <w:r>
+        <w:rPr>
+          <w:rStyle w:val="FootnoteReference"/>
+        </w:rPr>
+        <w:footnoteRef/>
+      </w:r>
+      <w:r>
+        <w:rPr>
+          <w:rFonts w:ascii="David" w:cs="David" w:eastAsia="David" w:hAnsi="David"/>
+          <w:sz w:val="20"/>
+          <w:szCs w:val="20"/>
+        </w:rPr>
+        <w:t xml:space="preserve"> </w:t>
+      </w:r>
+      <w:r>
+        <w:rPr>
+          <w:rFonts w:ascii="David" w:cs="David" w:eastAsia="David" w:hAnsi="David"/>
+          <w:sz w:val="20"/>
+          <w:szCs w:val="20"/>
+          <w:rtl/>
+        </w:rPr>
+        <w:t xml:space="preserve">אבינרי, </w:t>
+      </w:r>
+      <w:r>
+        <w:rPr>
+          <w:rFonts w:ascii="David" w:cs="David" w:eastAsia="David" w:hAnsi="David"/>
+          <w:b/>
+          <w:bCs/>
+          <w:i w:val="false"/>
+          <w:iCs w:val="false"/>
+          <w:sz w:val="20"/>
+          <w:szCs w:val="20"/>
+          <w:rtl/>
+        </w:rPr>
+        <w:t xml:space="preserve">הרצל</w:t>
+      </w:r>
+      <w:r>
+        <w:rPr>
+          <w:rFonts w:ascii="David" w:cs="David" w:eastAsia="David" w:hAnsi="David"/>
+          <w:sz w:val="20"/>
+          <w:szCs w:val="20"/>
+          <w:rtl/>
+        </w:rPr>
+        <w:t xml:space="preserve">, עמ' 15-33; Alex Bein, </w:t>
+      </w:r>
+      <w:r>
+        <w:rPr>
+          <w:rFonts w:ascii="David" w:cs="David" w:eastAsia="David" w:hAnsi="David"/>
+          <w:i/>
+          <w:iCs/>
+          <w:sz w:val="20"/>
+          <w:szCs w:val="20"/>
+          <w:rtl w:val="false"/>
+        </w:rPr>
+        <w:t xml:space="preserve">Theodore Herzl: A Biography</w:t>
+      </w:r>
+      <w:r>
+        <w:rPr>
+          <w:rFonts w:ascii="David" w:cs="David" w:eastAsia="David" w:hAnsi="David"/>
+          <w:sz w:val="20"/>
+          <w:szCs w:val="20"/>
+          <w:rtl w:val="false"/>
+        </w:rPr>
+        <w:t xml:space="preserve">, trans. Maurice Samuel (Philadelphia: Jewish Publication Society, 1941), pp. 1-40.</w:t>
+      </w:r>
+    </w:p>
+  </w:footnote>
+  <w:footnote w:id="6">
+    <w:p>
+      <w:pPr>
+        <w:bidi w:val="false"/>
+        <w:spacing w:after="40" w:line="240" w:lineRule="auto"/>
+        <w:jc w:val="left"/>
+      </w:pPr>
+      <w:r>
+        <w:rPr>
+          <w:rStyle w:val="FootnoteReference"/>
+        </w:rPr>
+        <w:footnoteRef/>
+      </w:r>
+      <w:r>
+        <w:rPr>
+          <w:rFonts w:ascii="David" w:cs="David" w:eastAsia="David" w:hAnsi="David"/>
+          <w:sz w:val="20"/>
+          <w:szCs w:val="20"/>
+        </w:rPr>
+        <w:t xml:space="preserve"> </w:t>
+      </w:r>
+      <w:r>
+        <w:rPr>
+          <w:rFonts w:ascii="David" w:cs="David" w:eastAsia="David" w:hAnsi="David"/>
+          <w:sz w:val="20"/>
+          <w:szCs w:val="20"/>
+          <w:rtl w:val="false"/>
+        </w:rPr>
+        <w:t xml:space="preserve">Jacques Kornberg, "Theodor Herzl: A Reevaluation," </w:t>
+      </w:r>
+      <w:r>
+        <w:rPr>
+          <w:rFonts w:ascii="David" w:cs="David" w:eastAsia="David" w:hAnsi="David"/>
+          <w:i/>
+          <w:iCs/>
+          <w:sz w:val="20"/>
+          <w:szCs w:val="20"/>
+          <w:rtl w:val="false"/>
+        </w:rPr>
+        <w:t xml:space="preserve">Journal of Modern History</w:t>
+      </w:r>
+      <w:r>
+        <w:rPr>
+          <w:rFonts w:ascii="David" w:cs="David" w:eastAsia="David" w:hAnsi="David"/>
+          <w:sz w:val="20"/>
+          <w:szCs w:val="20"/>
+          <w:rtl w:val="false"/>
+        </w:rPr>
+        <w:t xml:space="preserve"> 52 (1980), pp. 226-252; Kornberg, </w:t>
+      </w:r>
+      <w:r>
+        <w:rPr>
+          <w:rFonts w:ascii="David" w:cs="David" w:eastAsia="David" w:hAnsi="David"/>
+          <w:i/>
+          <w:iCs/>
+          <w:sz w:val="20"/>
+          <w:szCs w:val="20"/>
+          <w:rtl w:val="false"/>
+        </w:rPr>
+        <w:t xml:space="preserve">Theodor Herzl</w:t>
+      </w:r>
+      <w:r>
+        <w:rPr>
+          <w:rFonts w:ascii="David" w:cs="David" w:eastAsia="David" w:hAnsi="David"/>
+          <w:sz w:val="20"/>
+          <w:szCs w:val="20"/>
+          <w:rtl w:val="false"/>
+        </w:rPr>
+        <w:t xml:space="preserve">, pp. 1-41.</w:t>
+      </w:r>
+    </w:p>
+  </w:footnote>
+  <w:footnote w:id="7">
+    <w:p>
+      <w:pPr>
+        <w:bidi w:val="false"/>
+        <w:spacing w:after="40" w:line="240" w:lineRule="auto"/>
+        <w:jc w:val="left"/>
+      </w:pPr>
+      <w:r>
+        <w:rPr>
+          <w:rStyle w:val="FootnoteReference"/>
+        </w:rPr>
+        <w:footnoteRef/>
+      </w:r>
+      <w:r>
+        <w:rPr>
+          <w:rFonts w:ascii="David" w:cs="David" w:eastAsia="David" w:hAnsi="David"/>
+          <w:sz w:val="20"/>
+          <w:szCs w:val="20"/>
+        </w:rPr>
+        <w:t xml:space="preserve"> </w:t>
+      </w:r>
+      <w:r>
+        <w:rPr>
+          <w:rFonts w:ascii="David" w:cs="David" w:eastAsia="David" w:hAnsi="David"/>
+          <w:sz w:val="20"/>
+          <w:szCs w:val="20"/>
+          <w:rtl/>
+        </w:rPr>
+        <w:t xml:space="preserve">אבינרי, </w:t>
+      </w:r>
+      <w:r>
+        <w:rPr>
+          <w:rFonts w:ascii="David" w:cs="David" w:eastAsia="David" w:hAnsi="David"/>
+          <w:b/>
+          <w:bCs/>
+          <w:i w:val="false"/>
+          <w:iCs w:val="false"/>
+          <w:sz w:val="20"/>
+          <w:szCs w:val="20"/>
+          <w:rtl/>
+        </w:rPr>
+        <w:t xml:space="preserve">הרצל</w:t>
+      </w:r>
+      <w:r>
+        <w:rPr>
+          <w:rFonts w:ascii="David" w:cs="David" w:eastAsia="David" w:hAnsi="David"/>
+          <w:sz w:val="20"/>
+          <w:szCs w:val="20"/>
+          <w:rtl/>
+        </w:rPr>
+        <w:t xml:space="preserve">, עמ' 34-56; Amos Elon, </w:t>
+      </w:r>
+      <w:r>
+        <w:rPr>
+          <w:rFonts w:ascii="David" w:cs="David" w:eastAsia="David" w:hAnsi="David"/>
+          <w:i/>
+          <w:iCs/>
+          <w:sz w:val="20"/>
+          <w:szCs w:val="20"/>
+          <w:rtl w:val="false"/>
+        </w:rPr>
+        <w:t xml:space="preserve">Herzl</w:t>
+      </w:r>
+      <w:r>
+        <w:rPr>
+          <w:rFonts w:ascii="David" w:cs="David" w:eastAsia="David" w:hAnsi="David"/>
+          <w:sz w:val="20"/>
+          <w:szCs w:val="20"/>
+          <w:rtl w:val="false"/>
+        </w:rPr>
+        <w:t xml:space="preserve"> (New York: Holt, Rinehart and Winston, 1975), pp. 55-66.</w:t>
+      </w:r>
+    </w:p>
+  </w:footnote>
+  <w:footnote w:id="8">
+    <w:p>
+      <w:pPr>
+        <w:bidi w:val="false"/>
+        <w:spacing w:after="40" w:line="240" w:lineRule="auto"/>
+        <w:jc w:val="left"/>
+      </w:pPr>
+      <w:r>
+        <w:rPr>
+          <w:rStyle w:val="FootnoteReference"/>
+        </w:rPr>
+        <w:footnoteRef/>
+      </w:r>
+      <w:r>
+        <w:rPr>
+          <w:rFonts w:ascii="David" w:cs="David" w:eastAsia="David" w:hAnsi="David"/>
+          <w:sz w:val="20"/>
+          <w:szCs w:val="20"/>
+        </w:rPr>
+        <w:t xml:space="preserve"> </w:t>
+      </w:r>
+      <w:r>
+        <w:rPr>
+          <w:rFonts w:ascii="David" w:cs="David" w:eastAsia="David" w:hAnsi="David"/>
+          <w:sz w:val="20"/>
+          <w:szCs w:val="20"/>
+          <w:rtl/>
+        </w:rPr>
+        <w:t xml:space="preserve">אבינרי, </w:t>
+      </w:r>
+      <w:r>
+        <w:rPr>
+          <w:rFonts w:ascii="David" w:cs="David" w:eastAsia="David" w:hAnsi="David"/>
+          <w:b/>
+          <w:bCs/>
+          <w:i w:val="false"/>
+          <w:iCs w:val="false"/>
+          <w:sz w:val="20"/>
+          <w:szCs w:val="20"/>
+          <w:rtl/>
+        </w:rPr>
+        <w:t xml:space="preserve">הרצל</w:t>
+      </w:r>
+      <w:r>
+        <w:rPr>
+          <w:rFonts w:ascii="David" w:cs="David" w:eastAsia="David" w:hAnsi="David"/>
+          <w:sz w:val="20"/>
+          <w:szCs w:val="20"/>
+          <w:rtl/>
+        </w:rPr>
+        <w:t xml:space="preserve">, עמ' 42-56; Steven Beller, </w:t>
+      </w:r>
+      <w:r>
+        <w:rPr>
+          <w:rFonts w:ascii="David" w:cs="David" w:eastAsia="David" w:hAnsi="David"/>
+          <w:i/>
+          <w:iCs/>
+          <w:sz w:val="20"/>
+          <w:szCs w:val="20"/>
+          <w:rtl w:val="false"/>
+        </w:rPr>
+        <w:t xml:space="preserve">Herzl</w:t>
+      </w:r>
+      <w:r>
+        <w:rPr>
+          <w:rFonts w:ascii="David" w:cs="David" w:eastAsia="David" w:hAnsi="David"/>
+          <w:sz w:val="20"/>
+          <w:szCs w:val="20"/>
+          <w:rtl w:val="false"/>
+        </w:rPr>
+        <w:t xml:space="preserve"> (London: Peter Halban, 1991), pp. 9-19.</w:t>
+      </w:r>
+    </w:p>
+  </w:footnote>
+  <w:footnote w:id="9">
+    <w:p>
+      <w:pPr>
+        <w:bidi w:val="false"/>
+        <w:spacing w:after="40" w:line="240" w:lineRule="auto"/>
+        <w:jc w:val="left"/>
+      </w:pPr>
+      <w:r>
+        <w:rPr>
+          <w:rStyle w:val="FootnoteReference"/>
+        </w:rPr>
+        <w:footnoteRef/>
+      </w:r>
+      <w:r>
+        <w:rPr>
+          <w:rFonts w:ascii="David" w:cs="David" w:eastAsia="David" w:hAnsi="David"/>
+          <w:sz w:val="20"/>
+          <w:szCs w:val="20"/>
+        </w:rPr>
+        <w:t xml:space="preserve"> </w:t>
+      </w:r>
+      <w:r>
+        <w:rPr>
+          <w:rFonts w:ascii="David" w:cs="David" w:eastAsia="David" w:hAnsi="David"/>
+          <w:sz w:val="20"/>
+          <w:szCs w:val="20"/>
+          <w:rtl w:val="false"/>
+        </w:rPr>
+        <w:t xml:space="preserve">Elon, </w:t>
+      </w:r>
+      <w:r>
+        <w:rPr>
+          <w:rFonts w:ascii="David" w:cs="David" w:eastAsia="David" w:hAnsi="David"/>
+          <w:i/>
+          <w:iCs/>
+          <w:sz w:val="20"/>
+          <w:szCs w:val="20"/>
+          <w:rtl w:val="false"/>
+        </w:rPr>
+        <w:t xml:space="preserve">Herzl</w:t>
+      </w:r>
+      <w:r>
+        <w:rPr>
+          <w:rFonts w:ascii="David" w:cs="David" w:eastAsia="David" w:hAnsi="David"/>
+          <w:sz w:val="20"/>
+          <w:szCs w:val="20"/>
+          <w:rtl w:val="false"/>
+        </w:rPr>
+        <w:t xml:space="preserve">, pp. 87-113; Penslar, </w:t>
+      </w:r>
+      <w:r>
+        <w:rPr>
+          <w:rFonts w:ascii="David" w:cs="David" w:eastAsia="David" w:hAnsi="David"/>
+          <w:i/>
+          <w:iCs/>
+          <w:sz w:val="20"/>
+          <w:szCs w:val="20"/>
+          <w:rtl w:val="false"/>
+        </w:rPr>
+        <w:t xml:space="preserve">Theodor Herzl</w:t>
+      </w:r>
+      <w:r>
+        <w:rPr>
+          <w:rFonts w:ascii="David" w:cs="David" w:eastAsia="David" w:hAnsi="David"/>
+          <w:sz w:val="20"/>
+          <w:szCs w:val="20"/>
+          <w:rtl w:val="false"/>
+        </w:rPr>
+        <w:t xml:space="preserve">, pp. 31-48.</w:t>
+      </w:r>
+    </w:p>
+  </w:footnote>
+  <w:footnote w:id="10">
+    <w:p>
+      <w:pPr>
+        <w:bidi w:val="false"/>
+        <w:spacing w:after="40" w:line="240" w:lineRule="auto"/>
+        <w:jc w:val="left"/>
+      </w:pPr>
+      <w:r>
+        <w:rPr>
+          <w:rStyle w:val="FootnoteReference"/>
+        </w:rPr>
+        <w:footnoteRef/>
+      </w:r>
+      <w:r>
+        <w:rPr>
+          <w:rFonts w:ascii="David" w:cs="David" w:eastAsia="David" w:hAnsi="David"/>
+          <w:sz w:val="20"/>
+          <w:szCs w:val="20"/>
+        </w:rPr>
+        <w:t xml:space="preserve"> </w:t>
+      </w:r>
+      <w:r>
+        <w:rPr>
+          <w:rFonts w:ascii="David" w:cs="David" w:eastAsia="David" w:hAnsi="David"/>
+          <w:sz w:val="20"/>
+          <w:szCs w:val="20"/>
+          <w:rtl w:val="false"/>
+        </w:rPr>
+        <w:t xml:space="preserve">Kornberg, </w:t>
+      </w:r>
+      <w:r>
+        <w:rPr>
+          <w:rFonts w:ascii="David" w:cs="David" w:eastAsia="David" w:hAnsi="David"/>
+          <w:i/>
+          <w:iCs/>
+          <w:sz w:val="20"/>
+          <w:szCs w:val="20"/>
+          <w:rtl w:val="false"/>
+        </w:rPr>
+        <w:t xml:space="preserve">Theodor Herzl</w:t>
+      </w:r>
+      <w:r>
+        <w:rPr>
+          <w:rFonts w:ascii="David" w:cs="David" w:eastAsia="David" w:hAnsi="David"/>
+          <w:sz w:val="20"/>
+          <w:szCs w:val="20"/>
+          <w:rtl w:val="false"/>
+        </w:rPr>
+        <w:t xml:space="preserve">, pp. 134-158; Ernst Pawel, </w:t>
+      </w:r>
+      <w:r>
+        <w:rPr>
+          <w:rFonts w:ascii="David" w:cs="David" w:eastAsia="David" w:hAnsi="David"/>
+          <w:i/>
+          <w:iCs/>
+          <w:sz w:val="20"/>
+          <w:szCs w:val="20"/>
+          <w:rtl w:val="false"/>
+        </w:rPr>
+        <w:t xml:space="preserve">The Labyrinth of Exile: A Life of Theodor Herzl</w:t>
+      </w:r>
+      <w:r>
+        <w:rPr>
+          <w:rFonts w:ascii="David" w:cs="David" w:eastAsia="David" w:hAnsi="David"/>
+          <w:sz w:val="20"/>
+          <w:szCs w:val="20"/>
+          <w:rtl w:val="false"/>
+        </w:rPr>
+        <w:t xml:space="preserve"> (New York: Farrar, Straus and Giroux, 1989), pp. 189-240.</w:t>
+      </w:r>
+    </w:p>
+  </w:footnote>
+  <w:footnote w:id="11">
+    <w:p>
+      <w:pPr>
+        <w:bidi w:val="false"/>
+        <w:spacing w:after="40" w:line="240" w:lineRule="auto"/>
+        <w:jc w:val="left"/>
+      </w:pPr>
+      <w:r>
+        <w:rPr>
+          <w:rStyle w:val="FootnoteReference"/>
+        </w:rPr>
+        <w:footnoteRef/>
+      </w:r>
+      <w:r>
+        <w:rPr>
+          <w:rFonts w:ascii="David" w:cs="David" w:eastAsia="David" w:hAnsi="David"/>
+          <w:sz w:val="20"/>
+          <w:szCs w:val="20"/>
+        </w:rPr>
+        <w:t xml:space="preserve"> </w:t>
+      </w:r>
+      <w:r>
+        <w:rPr>
+          <w:rFonts w:ascii="David" w:cs="David" w:eastAsia="David" w:hAnsi="David"/>
+          <w:sz w:val="20"/>
+          <w:szCs w:val="20"/>
+          <w:rtl/>
+        </w:rPr>
+        <w:t xml:space="preserve">יעקב כ"ץ, </w:t>
+      </w:r>
+      <w:r>
+        <w:rPr>
+          <w:rFonts w:ascii="David" w:cs="David" w:eastAsia="David" w:hAnsi="David"/>
+          <w:b/>
+          <w:bCs/>
+          <w:i w:val="false"/>
+          <w:iCs w:val="false"/>
+          <w:sz w:val="20"/>
+          <w:szCs w:val="20"/>
+          <w:rtl/>
+        </w:rPr>
+        <w:t xml:space="preserve">שנאת ישראל: משנאת הדת לשלילת הגזע</w:t>
+      </w:r>
+      <w:r>
+        <w:rPr>
+          <w:rFonts w:ascii="David" w:cs="David" w:eastAsia="David" w:hAnsi="David"/>
+          <w:sz w:val="20"/>
+          <w:szCs w:val="20"/>
+          <w:rtl/>
+        </w:rPr>
+        <w:t xml:space="preserve"> (תל אביב: עם עובד, 1979), עמ' 9-17, 245-260; Peter Pulzer, </w:t>
+      </w:r>
+      <w:r>
+        <w:rPr>
+          <w:rFonts w:ascii="David" w:cs="David" w:eastAsia="David" w:hAnsi="David"/>
+          <w:i/>
+          <w:iCs/>
+          <w:sz w:val="20"/>
+          <w:szCs w:val="20"/>
+          <w:rtl w:val="false"/>
+        </w:rPr>
+        <w:t xml:space="preserve">The Rise of Political Anti-Semitism in Germany and Austria</w:t>
+      </w:r>
+      <w:r>
+        <w:rPr>
+          <w:rFonts w:ascii="David" w:cs="David" w:eastAsia="David" w:hAnsi="David"/>
+          <w:sz w:val="20"/>
+          <w:szCs w:val="20"/>
+          <w:rtl w:val="false"/>
+        </w:rPr>
+        <w:t xml:space="preserve">, rev. ed. (Cambridge, MA: Harvard University Press, 1988), pp. 47-57.</w:t>
+      </w:r>
+    </w:p>
+  </w:footnote>
+  <w:footnote w:id="12">
+    <w:p>
+      <w:pPr>
+        <w:bidi/>
+        <w:spacing w:after="40" w:line="240" w:lineRule="auto"/>
+        <w:jc w:val="both"/>
+      </w:pPr>
+      <w:r>
+        <w:rPr>
+          <w:rStyle w:val="FootnoteReference"/>
+        </w:rPr>
+        <w:footnoteRef/>
+      </w:r>
+      <w:r>
+        <w:rPr>
+          <w:rFonts w:ascii="David" w:cs="David" w:eastAsia="David" w:hAnsi="David"/>
+          <w:sz w:val="20"/>
+          <w:szCs w:val="20"/>
+        </w:rPr>
+        <w:t xml:space="preserve"> </w:t>
+      </w:r>
+      <w:r>
+        <w:rPr>
+          <w:rFonts w:ascii="David" w:cs="David" w:eastAsia="David" w:hAnsi="David"/>
+          <w:sz w:val="20"/>
+          <w:szCs w:val="20"/>
+          <w:rtl/>
+        </w:rPr>
+        <w:t xml:space="preserve">כ"ץ, </w:t>
+      </w:r>
+      <w:r>
+        <w:rPr>
+          <w:rFonts w:ascii="David" w:cs="David" w:eastAsia="David" w:hAnsi="David"/>
+          <w:b/>
+          <w:bCs/>
+          <w:i w:val="false"/>
+          <w:iCs w:val="false"/>
+          <w:sz w:val="20"/>
+          <w:szCs w:val="20"/>
+          <w:rtl/>
+        </w:rPr>
+        <w:t xml:space="preserve">שנאת ישראל</w:t>
+      </w:r>
+      <w:r>
+        <w:rPr>
+          <w:rFonts w:ascii="David" w:cs="David" w:eastAsia="David" w:hAnsi="David"/>
+          <w:sz w:val="20"/>
+          <w:szCs w:val="20"/>
+          <w:rtl/>
+        </w:rPr>
+        <w:t xml:space="preserve">, עמ' 227-244.</w:t>
+      </w:r>
+    </w:p>
+  </w:footnote>
+  <w:footnote w:id="13">
+    <w:p>
+      <w:pPr>
+        <w:bidi/>
+        <w:spacing w:after="40" w:line="240" w:lineRule="auto"/>
+        <w:jc w:val="both"/>
+      </w:pPr>
+      <w:r>
+        <w:rPr>
+          <w:rStyle w:val="FootnoteReference"/>
+        </w:rPr>
+        <w:footnoteRef/>
+      </w:r>
+      <w:r>
+        <w:rPr>
+          <w:rFonts w:ascii="David" w:cs="David" w:eastAsia="David" w:hAnsi="David"/>
+          <w:sz w:val="20"/>
+          <w:szCs w:val="20"/>
+        </w:rPr>
+        <w:t xml:space="preserve"> </w:t>
+      </w:r>
+      <w:r>
+        <w:rPr>
+          <w:rFonts w:ascii="David" w:cs="David" w:eastAsia="David" w:hAnsi="David"/>
+          <w:sz w:val="20"/>
+          <w:szCs w:val="20"/>
+          <w:rtl/>
+        </w:rPr>
+        <w:t xml:space="preserve">אטינגר, </w:t>
+      </w:r>
+      <w:r>
+        <w:rPr>
+          <w:rFonts w:ascii="David" w:cs="David" w:eastAsia="David" w:hAnsi="David"/>
+          <w:b/>
+          <w:bCs/>
+          <w:i w:val="false"/>
+          <w:iCs w:val="false"/>
+          <w:sz w:val="20"/>
+          <w:szCs w:val="20"/>
+          <w:rtl/>
+        </w:rPr>
+        <w:t xml:space="preserve">האנטישמיות בעת החדשה</w:t>
+      </w:r>
+      <w:r>
+        <w:rPr>
+          <w:rFonts w:ascii="David" w:cs="David" w:eastAsia="David" w:hAnsi="David"/>
+          <w:sz w:val="20"/>
+          <w:szCs w:val="20"/>
+          <w:rtl/>
+        </w:rPr>
+        <w:t xml:space="preserve">, עמ' 1-46.</w:t>
+      </w:r>
+    </w:p>
+  </w:footnote>
+  <w:footnote w:id="14">
+    <w:p>
+      <w:pPr>
+        <w:bidi/>
+        <w:spacing w:after="40" w:line="240" w:lineRule="auto"/>
+        <w:jc w:val="both"/>
+      </w:pPr>
+      <w:r>
+        <w:rPr>
+          <w:rStyle w:val="FootnoteReference"/>
+        </w:rPr>
+        <w:footnoteRef/>
+      </w:r>
+      <w:r>
+        <w:rPr>
+          <w:rFonts w:ascii="David" w:cs="David" w:eastAsia="David" w:hAnsi="David"/>
+          <w:sz w:val="20"/>
+          <w:szCs w:val="20"/>
+        </w:rPr>
+        <w:t xml:space="preserve"> </w:t>
+      </w:r>
+      <w:r>
+        <w:rPr>
+          <w:rFonts w:ascii="David" w:cs="David" w:eastAsia="David" w:hAnsi="David"/>
+          <w:sz w:val="20"/>
+          <w:szCs w:val="20"/>
+          <w:rtl/>
+        </w:rPr>
+        <w:t xml:space="preserve">דוד אנגל, "גלגולי המושג 'אנטישמיות' והשימוש בו כקטגוריה כוללת", בתוך: גיא מירון וסקוט אורי (עורכים), </w:t>
+      </w:r>
+      <w:r>
+        <w:rPr>
+          <w:rFonts w:ascii="David" w:cs="David" w:eastAsia="David" w:hAnsi="David"/>
+          <w:b/>
+          <w:bCs/>
+          <w:i w:val="false"/>
+          <w:iCs w:val="false"/>
+          <w:sz w:val="20"/>
+          <w:szCs w:val="20"/>
+          <w:rtl/>
+        </w:rPr>
+        <w:t xml:space="preserve">אנטישמיות בין מושג היסטורי לשיח ציבורי</w:t>
+      </w:r>
+      <w:r>
+        <w:rPr>
+          <w:rFonts w:ascii="David" w:cs="David" w:eastAsia="David" w:hAnsi="David"/>
+          <w:sz w:val="20"/>
+          <w:szCs w:val="20"/>
+          <w:rtl/>
+        </w:rPr>
+        <w:t xml:space="preserve">, ציון פה (תש"ף), עמ' 13-55; סוזנה השל, "לקראת היסטוריוגרפיה ארוטית: חקר הממדים החושיים והרגשיים של האנטישמיות", בתוך: גיא מירון וסקוט אורי (עורכים), </w:t>
+      </w:r>
+      <w:r>
+        <w:rPr>
+          <w:rFonts w:ascii="David" w:cs="David" w:eastAsia="David" w:hAnsi="David"/>
+          <w:b/>
+          <w:bCs/>
+          <w:i w:val="false"/>
+          <w:iCs w:val="false"/>
+          <w:sz w:val="20"/>
+          <w:szCs w:val="20"/>
+          <w:rtl/>
+        </w:rPr>
+        <w:t xml:space="preserve">אנטישמיות בין מושג היסטורי לשיח ציבורי</w:t>
+      </w:r>
+      <w:r>
+        <w:rPr>
+          <w:rFonts w:ascii="David" w:cs="David" w:eastAsia="David" w:hAnsi="David"/>
+          <w:sz w:val="20"/>
+          <w:szCs w:val="20"/>
+          <w:rtl/>
+        </w:rPr>
+        <w:t xml:space="preserve">, ציון פה (תש"ף), עמ' 5-30; Engel, "Away from a Definition of Antisemitism," pp. 30-53.</w:t>
+      </w:r>
+    </w:p>
+  </w:footnote>
+  <w:footnote w:id="15">
+    <w:p>
+      <w:pPr>
+        <w:bidi/>
+        <w:spacing w:after="40" w:line="240" w:lineRule="auto"/>
+        <w:jc w:val="both"/>
+      </w:pPr>
+      <w:r>
+        <w:rPr>
+          <w:rStyle w:val="FootnoteReference"/>
+        </w:rPr>
+        <w:footnoteRef/>
+      </w:r>
+      <w:r>
+        <w:rPr>
+          <w:rFonts w:ascii="David" w:cs="David" w:eastAsia="David" w:hAnsi="David"/>
+          <w:sz w:val="20"/>
+          <w:szCs w:val="20"/>
+        </w:rPr>
+        <w:t xml:space="preserve"> </w:t>
+      </w:r>
+      <w:r>
+        <w:rPr>
+          <w:rFonts w:ascii="David" w:cs="David" w:eastAsia="David" w:hAnsi="David"/>
+          <w:sz w:val="20"/>
+          <w:szCs w:val="20"/>
+          <w:rtl/>
+        </w:rPr>
+        <w:t xml:space="preserve">דיוויד פלדמן, "אנטישמיות ואסלאמופוביה", תרגם דורון מגן, בתוך: גיא מירון וסקוט אורי (עורכים), </w:t>
+      </w:r>
+      <w:r>
+        <w:rPr>
+          <w:rFonts w:ascii="David" w:cs="David" w:eastAsia="David" w:hAnsi="David"/>
+          <w:b/>
+          <w:bCs/>
+          <w:i w:val="false"/>
+          <w:iCs w:val="false"/>
+          <w:sz w:val="20"/>
+          <w:szCs w:val="20"/>
+          <w:rtl/>
+        </w:rPr>
+        <w:t xml:space="preserve">אנטישמיות בין מושג היסטורי לשיח ציבורי</w:t>
+      </w:r>
+      <w:r>
+        <w:rPr>
+          <w:rFonts w:ascii="David" w:cs="David" w:eastAsia="David" w:hAnsi="David"/>
+          <w:sz w:val="20"/>
+          <w:szCs w:val="20"/>
+          <w:rtl/>
+        </w:rPr>
+        <w:t xml:space="preserve">, ציון פה (תש"ף), עמ' 295-296.</w:t>
+      </w:r>
+    </w:p>
+  </w:footnote>
+  <w:footnote w:id="16">
+    <w:p>
+      <w:pPr>
+        <w:bidi/>
+        <w:spacing w:after="40" w:line="240" w:lineRule="auto"/>
+        <w:jc w:val="both"/>
+      </w:pPr>
+      <w:r>
+        <w:rPr>
+          <w:rStyle w:val="FootnoteReference"/>
+        </w:rPr>
+        <w:footnoteRef/>
+      </w:r>
+      <w:r>
+        <w:rPr>
+          <w:rFonts w:ascii="David" w:cs="David" w:eastAsia="David" w:hAnsi="David"/>
+          <w:sz w:val="20"/>
+          <w:szCs w:val="20"/>
+        </w:rPr>
+        <w:t xml:space="preserve"> </w:t>
+      </w:r>
+      <w:r>
+        <w:rPr>
+          <w:rFonts w:ascii="David" w:cs="David" w:eastAsia="David" w:hAnsi="David"/>
+          <w:sz w:val="20"/>
+          <w:szCs w:val="20"/>
+          <w:rtl/>
+        </w:rPr>
+        <w:t xml:space="preserve">צפריר ברזלי, "המושג 'אנטישמיות' כקטגוריה לחקר ההיסטוריה של היהודים בימי הביניים", בתוך: גיא מירון וסקוט אורי (עורכים), </w:t>
+      </w:r>
+      <w:r>
+        <w:rPr>
+          <w:rFonts w:ascii="David" w:cs="David" w:eastAsia="David" w:hAnsi="David"/>
+          <w:b/>
+          <w:bCs/>
+          <w:i w:val="false"/>
+          <w:iCs w:val="false"/>
+          <w:sz w:val="20"/>
+          <w:szCs w:val="20"/>
+          <w:rtl/>
+        </w:rPr>
+        <w:t xml:space="preserve">אנטישמיות בין מושג היסטורי לשיח ציבורי</w:t>
+      </w:r>
+      <w:r>
+        <w:rPr>
+          <w:rFonts w:ascii="David" w:cs="David" w:eastAsia="David" w:hAnsi="David"/>
+          <w:sz w:val="20"/>
+          <w:szCs w:val="20"/>
+          <w:rtl/>
+        </w:rPr>
+        <w:t xml:space="preserve">, ציון פה (תש"ף), עמ' 195-196, 206-207.</w:t>
+      </w:r>
+    </w:p>
+  </w:footnote>
+  <w:footnote w:id="17">
+    <w:p>
+      <w:pPr>
+        <w:bidi/>
+        <w:spacing w:after="40" w:line="240" w:lineRule="auto"/>
+        <w:jc w:val="both"/>
+      </w:pPr>
+      <w:r>
+        <w:rPr>
+          <w:rStyle w:val="FootnoteReference"/>
+        </w:rPr>
+        <w:footnoteRef/>
+      </w:r>
+      <w:r>
+        <w:rPr>
+          <w:rFonts w:ascii="David" w:cs="David" w:eastAsia="David" w:hAnsi="David"/>
+          <w:sz w:val="20"/>
+          <w:szCs w:val="20"/>
+        </w:rPr>
+        <w:t xml:space="preserve"> </w:t>
+      </w:r>
+      <w:r>
+        <w:rPr>
+          <w:rFonts w:ascii="David" w:cs="David" w:eastAsia="David" w:hAnsi="David"/>
+          <w:sz w:val="20"/>
+          <w:szCs w:val="20"/>
+          <w:rtl/>
+        </w:rPr>
+        <w:t xml:space="preserve">אנגל, "גלגולי המושג 'אנטישמיות'", עמ' 13-55; ברזלי, "המושג 'אנטישמיות' כקטגוריה", עמ' 206-207.</w:t>
+      </w:r>
+    </w:p>
+  </w:footnote>
+  <w:footnote w:id="18">
+    <w:p>
+      <w:pPr>
+        <w:bidi w:val="false"/>
+        <w:spacing w:after="40" w:line="240" w:lineRule="auto"/>
+        <w:jc w:val="left"/>
+      </w:pPr>
+      <w:r>
+        <w:rPr>
+          <w:rStyle w:val="FootnoteReference"/>
+        </w:rPr>
+        <w:footnoteRef/>
+      </w:r>
+      <w:r>
+        <w:rPr>
+          <w:rFonts w:ascii="David" w:cs="David" w:eastAsia="David" w:hAnsi="David"/>
+          <w:sz w:val="20"/>
+          <w:szCs w:val="20"/>
+        </w:rPr>
+        <w:t xml:space="preserve"> </w:t>
+      </w:r>
+      <w:r>
+        <w:rPr>
+          <w:rFonts w:ascii="David" w:cs="David" w:eastAsia="David" w:hAnsi="David"/>
+          <w:sz w:val="20"/>
+          <w:szCs w:val="20"/>
+          <w:rtl/>
+        </w:rPr>
+        <w:t xml:space="preserve">כ"ץ, </w:t>
+      </w:r>
+      <w:r>
+        <w:rPr>
+          <w:rFonts w:ascii="David" w:cs="David" w:eastAsia="David" w:hAnsi="David"/>
+          <w:b/>
+          <w:bCs/>
+          <w:i w:val="false"/>
+          <w:iCs w:val="false"/>
+          <w:sz w:val="20"/>
+          <w:szCs w:val="20"/>
+          <w:rtl/>
+        </w:rPr>
+        <w:t xml:space="preserve">שנאת ישראל</w:t>
+      </w:r>
+      <w:r>
+        <w:rPr>
+          <w:rFonts w:ascii="David" w:cs="David" w:eastAsia="David" w:hAnsi="David"/>
+          <w:sz w:val="20"/>
+          <w:szCs w:val="20"/>
+          <w:rtl/>
+        </w:rPr>
+        <w:t xml:space="preserve">, עמ' 261-289; Pulzer, </w:t>
+      </w:r>
+      <w:r>
+        <w:rPr>
+          <w:rFonts w:ascii="David" w:cs="David" w:eastAsia="David" w:hAnsi="David"/>
+          <w:i/>
+          <w:iCs/>
+          <w:sz w:val="20"/>
+          <w:szCs w:val="20"/>
+          <w:rtl w:val="false"/>
+        </w:rPr>
+        <w:t xml:space="preserve">The Rise of Political Anti-Semitism</w:t>
+      </w:r>
+      <w:r>
+        <w:rPr>
+          <w:rFonts w:ascii="David" w:cs="David" w:eastAsia="David" w:hAnsi="David"/>
+          <w:sz w:val="20"/>
+          <w:szCs w:val="20"/>
+          <w:rtl w:val="false"/>
+        </w:rPr>
+        <w:t xml:space="preserve">, pp. 88-105.</w:t>
+      </w:r>
+    </w:p>
+  </w:footnote>
+  <w:footnote w:id="19">
+    <w:p>
+      <w:pPr>
+        <w:bidi w:val="false"/>
+        <w:spacing w:after="40" w:line="240" w:lineRule="auto"/>
+        <w:jc w:val="left"/>
+      </w:pPr>
+      <w:r>
+        <w:rPr>
+          <w:rStyle w:val="FootnoteReference"/>
+        </w:rPr>
+        <w:footnoteRef/>
+      </w:r>
+      <w:r>
+        <w:rPr>
+          <w:rFonts w:ascii="David" w:cs="David" w:eastAsia="David" w:hAnsi="David"/>
+          <w:sz w:val="20"/>
+          <w:szCs w:val="20"/>
+        </w:rPr>
+        <w:t xml:space="preserve"> </w:t>
+      </w:r>
+      <w:r>
+        <w:rPr>
+          <w:rFonts w:ascii="David" w:cs="David" w:eastAsia="David" w:hAnsi="David"/>
+          <w:sz w:val="20"/>
+          <w:szCs w:val="20"/>
+          <w:rtl/>
+        </w:rPr>
+        <w:t xml:space="preserve">כ"ץ, </w:t>
+      </w:r>
+      <w:r>
+        <w:rPr>
+          <w:rFonts w:ascii="David" w:cs="David" w:eastAsia="David" w:hAnsi="David"/>
+          <w:b/>
+          <w:bCs/>
+          <w:i w:val="false"/>
+          <w:iCs w:val="false"/>
+          <w:sz w:val="20"/>
+          <w:szCs w:val="20"/>
+          <w:rtl/>
+        </w:rPr>
+        <w:t xml:space="preserve">שנאת ישראל</w:t>
+      </w:r>
+      <w:r>
+        <w:rPr>
+          <w:rFonts w:ascii="David" w:cs="David" w:eastAsia="David" w:hAnsi="David"/>
+          <w:sz w:val="20"/>
+          <w:szCs w:val="20"/>
+          <w:rtl/>
+        </w:rPr>
+        <w:t xml:space="preserve">, עמ' 290-308; Pulzer, </w:t>
+      </w:r>
+      <w:r>
+        <w:rPr>
+          <w:rFonts w:ascii="David" w:cs="David" w:eastAsia="David" w:hAnsi="David"/>
+          <w:i/>
+          <w:iCs/>
+          <w:sz w:val="20"/>
+          <w:szCs w:val="20"/>
+          <w:rtl w:val="false"/>
+        </w:rPr>
+        <w:t xml:space="preserve">The Rise of Political Anti-Semitism</w:t>
+      </w:r>
+      <w:r>
+        <w:rPr>
+          <w:rFonts w:ascii="David" w:cs="David" w:eastAsia="David" w:hAnsi="David"/>
+          <w:sz w:val="20"/>
+          <w:szCs w:val="20"/>
+          <w:rtl w:val="false"/>
+        </w:rPr>
+        <w:t xml:space="preserve">, pp. 49-52, 92-95.</w:t>
+      </w:r>
+    </w:p>
+  </w:footnote>
+  <w:footnote w:id="20">
+    <w:p>
+      <w:pPr>
+        <w:bidi w:val="false"/>
+        <w:spacing w:after="40" w:line="240" w:lineRule="auto"/>
+        <w:jc w:val="left"/>
+      </w:pPr>
+      <w:r>
+        <w:rPr>
+          <w:rStyle w:val="FootnoteReference"/>
+        </w:rPr>
+        <w:footnoteRef/>
+      </w:r>
+      <w:r>
+        <w:rPr>
+          <w:rFonts w:ascii="David" w:cs="David" w:eastAsia="David" w:hAnsi="David"/>
+          <w:sz w:val="20"/>
+          <w:szCs w:val="20"/>
+        </w:rPr>
+        <w:t xml:space="preserve"> </w:t>
+      </w:r>
+      <w:r>
+        <w:rPr>
+          <w:rFonts w:ascii="David" w:cs="David" w:eastAsia="David" w:hAnsi="David"/>
+          <w:sz w:val="20"/>
+          <w:szCs w:val="20"/>
+          <w:rtl w:val="false"/>
+        </w:rPr>
+        <w:t xml:space="preserve">Pulzer, </w:t>
+      </w:r>
+      <w:r>
+        <w:rPr>
+          <w:rFonts w:ascii="David" w:cs="David" w:eastAsia="David" w:hAnsi="David"/>
+          <w:i/>
+          <w:iCs/>
+          <w:sz w:val="20"/>
+          <w:szCs w:val="20"/>
+          <w:rtl w:val="false"/>
+        </w:rPr>
+        <w:t xml:space="preserve">The Rise of Political Anti-Semitism</w:t>
+      </w:r>
+      <w:r>
+        <w:rPr>
+          <w:rFonts w:ascii="David" w:cs="David" w:eastAsia="David" w:hAnsi="David"/>
+          <w:sz w:val="20"/>
+          <w:szCs w:val="20"/>
+          <w:rtl w:val="false"/>
+        </w:rPr>
+        <w:t xml:space="preserve">, pp. 106-130.</w:t>
+      </w:r>
+    </w:p>
+  </w:footnote>
+  <w:footnote w:id="21">
+    <w:p>
+      <w:pPr>
+        <w:bidi w:val="false"/>
+        <w:spacing w:after="40" w:line="240" w:lineRule="auto"/>
+        <w:jc w:val="left"/>
+      </w:pPr>
+      <w:r>
+        <w:rPr>
+          <w:rStyle w:val="FootnoteReference"/>
+        </w:rPr>
+        <w:footnoteRef/>
+      </w:r>
+      <w:r>
+        <w:rPr>
+          <w:rFonts w:ascii="David" w:cs="David" w:eastAsia="David" w:hAnsi="David"/>
+          <w:sz w:val="20"/>
+          <w:szCs w:val="20"/>
+        </w:rPr>
+        <w:t xml:space="preserve"> </w:t>
+      </w:r>
+      <w:r>
+        <w:rPr>
+          <w:rFonts w:ascii="David" w:cs="David" w:eastAsia="David" w:hAnsi="David"/>
+          <w:sz w:val="20"/>
+          <w:szCs w:val="20"/>
+          <w:rtl/>
+        </w:rPr>
+        <w:t xml:space="preserve">כ"ץ, </w:t>
+      </w:r>
+      <w:r>
+        <w:rPr>
+          <w:rFonts w:ascii="David" w:cs="David" w:eastAsia="David" w:hAnsi="David"/>
+          <w:b/>
+          <w:bCs/>
+          <w:i w:val="false"/>
+          <w:iCs w:val="false"/>
+          <w:sz w:val="20"/>
+          <w:szCs w:val="20"/>
+          <w:rtl/>
+        </w:rPr>
+        <w:t xml:space="preserve">שנאת ישראל</w:t>
+      </w:r>
+      <w:r>
+        <w:rPr>
+          <w:rFonts w:ascii="David" w:cs="David" w:eastAsia="David" w:hAnsi="David"/>
+          <w:sz w:val="20"/>
+          <w:szCs w:val="20"/>
+          <w:rtl/>
+        </w:rPr>
+        <w:t xml:space="preserve">, עמ' 309-320; Pulzer, </w:t>
+      </w:r>
+      <w:r>
+        <w:rPr>
+          <w:rFonts w:ascii="David" w:cs="David" w:eastAsia="David" w:hAnsi="David"/>
+          <w:i/>
+          <w:iCs/>
+          <w:sz w:val="20"/>
+          <w:szCs w:val="20"/>
+          <w:rtl w:val="false"/>
+        </w:rPr>
+        <w:t xml:space="preserve">The Rise of Political Anti-Semitism</w:t>
+      </w:r>
+      <w:r>
+        <w:rPr>
+          <w:rFonts w:ascii="David" w:cs="David" w:eastAsia="David" w:hAnsi="David"/>
+          <w:sz w:val="20"/>
+          <w:szCs w:val="20"/>
+          <w:rtl w:val="false"/>
+        </w:rPr>
+        <w:t xml:space="preserve">, pp. 121-130.</w:t>
+      </w:r>
+    </w:p>
+  </w:footnote>
+  <w:footnote w:id="22">
+    <w:p>
+      <w:pPr>
+        <w:bidi w:val="false"/>
+        <w:spacing w:after="40" w:line="240" w:lineRule="auto"/>
+        <w:jc w:val="left"/>
+      </w:pPr>
+      <w:r>
+        <w:rPr>
+          <w:rStyle w:val="FootnoteReference"/>
+        </w:rPr>
+        <w:footnoteRef/>
+      </w:r>
+      <w:r>
+        <w:rPr>
+          <w:rFonts w:ascii="David" w:cs="David" w:eastAsia="David" w:hAnsi="David"/>
+          <w:sz w:val="20"/>
+          <w:szCs w:val="20"/>
+        </w:rPr>
+        <w:t xml:space="preserve"> </w:t>
+      </w:r>
+      <w:r>
+        <w:rPr>
+          <w:rFonts w:ascii="David" w:cs="David" w:eastAsia="David" w:hAnsi="David"/>
+          <w:sz w:val="20"/>
+          <w:szCs w:val="20"/>
+          <w:rtl/>
+        </w:rPr>
+        <w:t xml:space="preserve">שולמית וולקוב, </w:t>
+      </w:r>
+      <w:r>
+        <w:rPr>
+          <w:rFonts w:ascii="David" w:cs="David" w:eastAsia="David" w:hAnsi="David"/>
+          <w:b/>
+          <w:bCs/>
+          <w:i w:val="false"/>
+          <w:iCs w:val="false"/>
+          <w:sz w:val="20"/>
+          <w:szCs w:val="20"/>
+          <w:rtl/>
+        </w:rPr>
+        <w:t xml:space="preserve">במעגל המכושף: יהודים, אנטישמים וגרמנים אחרים</w:t>
+      </w:r>
+      <w:r>
+        <w:rPr>
+          <w:rFonts w:ascii="David" w:cs="David" w:eastAsia="David" w:hAnsi="David"/>
+          <w:sz w:val="20"/>
+          <w:szCs w:val="20"/>
+          <w:rtl/>
+        </w:rPr>
+        <w:t xml:space="preserve"> (תל אביב: עם עובד, 2002), עמ' 71-98; Shulamit Volkov, "Antisemitism as a Cultural Code: Reflections on the History and Historiography of Antisemitism in Imperial Germany," </w:t>
+      </w:r>
+      <w:r>
+        <w:rPr>
+          <w:rFonts w:ascii="David" w:cs="David" w:eastAsia="David" w:hAnsi="David"/>
+          <w:i/>
+          <w:iCs/>
+          <w:sz w:val="20"/>
+          <w:szCs w:val="20"/>
+          <w:rtl w:val="false"/>
+        </w:rPr>
+        <w:t xml:space="preserve">Leo Baeck Institute Year Book</w:t>
+      </w:r>
+      <w:r>
+        <w:rPr>
+          <w:rFonts w:ascii="David" w:cs="David" w:eastAsia="David" w:hAnsi="David"/>
+          <w:sz w:val="20"/>
+          <w:szCs w:val="20"/>
+          <w:rtl w:val="false"/>
+        </w:rPr>
+        <w:t xml:space="preserve"> 23 (1978), pp. 25-46.</w:t>
+      </w:r>
+    </w:p>
+  </w:footnote>
+  <w:footnote w:id="23">
+    <w:p>
+      <w:pPr>
+        <w:bidi/>
+        <w:spacing w:after="40" w:line="240" w:lineRule="auto"/>
+        <w:jc w:val="both"/>
+      </w:pPr>
+      <w:r>
+        <w:rPr>
+          <w:rStyle w:val="FootnoteReference"/>
+        </w:rPr>
+        <w:footnoteRef/>
+      </w:r>
+      <w:r>
+        <w:rPr>
+          <w:rFonts w:ascii="David" w:cs="David" w:eastAsia="David" w:hAnsi="David"/>
+          <w:sz w:val="20"/>
+          <w:szCs w:val="20"/>
+        </w:rPr>
+        <w:t xml:space="preserve"> </w:t>
+      </w:r>
+      <w:r>
+        <w:rPr>
+          <w:rFonts w:ascii="David" w:cs="David" w:eastAsia="David" w:hAnsi="David"/>
+          <w:sz w:val="20"/>
+          <w:szCs w:val="20"/>
+          <w:rtl/>
+        </w:rPr>
+        <w:t xml:space="preserve">גיא מירון, </w:t>
+      </w:r>
+      <w:r>
+        <w:rPr>
+          <w:rFonts w:ascii="David" w:cs="David" w:eastAsia="David" w:hAnsi="David"/>
+          <w:b/>
+          <w:bCs/>
+          <w:i w:val="false"/>
+          <w:iCs w:val="false"/>
+          <w:sz w:val="20"/>
+          <w:szCs w:val="20"/>
+          <w:rtl/>
+        </w:rPr>
+        <w:t xml:space="preserve">האנטישמיות במאה ה-19: מדריך למידה</w:t>
+      </w:r>
+      <w:r>
+        <w:rPr>
+          <w:rFonts w:ascii="David" w:cs="David" w:eastAsia="David" w:hAnsi="David"/>
+          <w:sz w:val="20"/>
+          <w:szCs w:val="20"/>
+          <w:rtl/>
+        </w:rPr>
+        <w:t xml:space="preserve"> (רעננה: האוניברסיטה הפתוחה, 2022), עמ' 54-56; Pulzer, </w:t>
+      </w:r>
+      <w:r>
+        <w:rPr>
+          <w:rFonts w:ascii="David" w:cs="David" w:eastAsia="David" w:hAnsi="David"/>
+          <w:i/>
+          <w:iCs/>
+          <w:sz w:val="20"/>
+          <w:szCs w:val="20"/>
+          <w:rtl/>
+        </w:rPr>
+        <w:t xml:space="preserve">The Rise of Political Anti-Semitism</w:t>
+      </w:r>
+      <w:r>
+        <w:rPr>
+          <w:rFonts w:ascii="David" w:cs="David" w:eastAsia="David" w:hAnsi="David"/>
+          <w:sz w:val="20"/>
+          <w:szCs w:val="20"/>
+          <w:rtl/>
+        </w:rPr>
+        <w:t xml:space="preserve">, pp. 148-155.</w:t>
+      </w:r>
+    </w:p>
+  </w:footnote>
+  <w:footnote w:id="24">
+    <w:p>
+      <w:pPr>
+        <w:bidi w:val="false"/>
+        <w:spacing w:after="40" w:line="240" w:lineRule="auto"/>
+        <w:jc w:val="left"/>
+      </w:pPr>
+      <w:r>
+        <w:rPr>
+          <w:rStyle w:val="FootnoteReference"/>
+        </w:rPr>
+        <w:footnoteRef/>
+      </w:r>
+      <w:r>
+        <w:rPr>
+          <w:rFonts w:ascii="David" w:cs="David" w:eastAsia="David" w:hAnsi="David"/>
+          <w:sz w:val="20"/>
+          <w:szCs w:val="20"/>
+        </w:rPr>
+        <w:t xml:space="preserve"> </w:t>
+      </w:r>
+      <w:r>
+        <w:rPr>
+          <w:rFonts w:ascii="David" w:cs="David" w:eastAsia="David" w:hAnsi="David"/>
+          <w:sz w:val="20"/>
+          <w:szCs w:val="20"/>
+          <w:rtl w:val="false"/>
+        </w:rPr>
+        <w:t xml:space="preserve">Robert S. Wistrich, </w:t>
+      </w:r>
+      <w:r>
+        <w:rPr>
+          <w:rFonts w:ascii="David" w:cs="David" w:eastAsia="David" w:hAnsi="David"/>
+          <w:i/>
+          <w:iCs/>
+          <w:sz w:val="20"/>
+          <w:szCs w:val="20"/>
+          <w:rtl w:val="false"/>
+        </w:rPr>
+        <w:t xml:space="preserve">The Jews of Vienna in the Age of Franz Joseph</w:t>
+      </w:r>
+      <w:r>
+        <w:rPr>
+          <w:rFonts w:ascii="David" w:cs="David" w:eastAsia="David" w:hAnsi="David"/>
+          <w:sz w:val="20"/>
+          <w:szCs w:val="20"/>
+          <w:rtl w:val="false"/>
+        </w:rPr>
+        <w:t xml:space="preserve"> (Oxford: Oxford University Press, 1989), pp. 3-61.</w:t>
+      </w:r>
+    </w:p>
+  </w:footnote>
+  <w:footnote w:id="25">
+    <w:p>
+      <w:pPr>
+        <w:bidi w:val="false"/>
+        <w:spacing w:after="40" w:line="240" w:lineRule="auto"/>
+        <w:jc w:val="left"/>
+      </w:pPr>
+      <w:r>
+        <w:rPr>
+          <w:rStyle w:val="FootnoteReference"/>
+        </w:rPr>
+        <w:footnoteRef/>
+      </w:r>
+      <w:r>
+        <w:rPr>
+          <w:rFonts w:ascii="David" w:cs="David" w:eastAsia="David" w:hAnsi="David"/>
+          <w:sz w:val="20"/>
+          <w:szCs w:val="20"/>
+        </w:rPr>
+        <w:t xml:space="preserve"> </w:t>
+      </w:r>
+      <w:r>
+        <w:rPr>
+          <w:rFonts w:ascii="David" w:cs="David" w:eastAsia="David" w:hAnsi="David"/>
+          <w:sz w:val="20"/>
+          <w:szCs w:val="20"/>
+          <w:rtl/>
+        </w:rPr>
+        <w:t xml:space="preserve">מירון, </w:t>
+      </w:r>
+      <w:r>
+        <w:rPr>
+          <w:rFonts w:ascii="David" w:cs="David" w:eastAsia="David" w:hAnsi="David"/>
+          <w:b/>
+          <w:bCs/>
+          <w:i w:val="false"/>
+          <w:iCs w:val="false"/>
+          <w:sz w:val="20"/>
+          <w:szCs w:val="20"/>
+          <w:rtl/>
+        </w:rPr>
+        <w:t xml:space="preserve">מדריך למידה</w:t>
+      </w:r>
+      <w:r>
+        <w:rPr>
+          <w:rFonts w:ascii="David" w:cs="David" w:eastAsia="David" w:hAnsi="David"/>
+          <w:sz w:val="20"/>
+          <w:szCs w:val="20"/>
+          <w:rtl/>
+        </w:rPr>
+        <w:t xml:space="preserve">, עמ' 56-59; Wistrich, </w:t>
+      </w:r>
+      <w:r>
+        <w:rPr>
+          <w:rFonts w:ascii="David" w:cs="David" w:eastAsia="David" w:hAnsi="David"/>
+          <w:i/>
+          <w:iCs/>
+          <w:sz w:val="20"/>
+          <w:szCs w:val="20"/>
+          <w:rtl w:val="false"/>
+        </w:rPr>
+        <w:t xml:space="preserve">The Jews of Vienna</w:t>
+      </w:r>
+      <w:r>
+        <w:rPr>
+          <w:rFonts w:ascii="David" w:cs="David" w:eastAsia="David" w:hAnsi="David"/>
+          <w:sz w:val="20"/>
+          <w:szCs w:val="20"/>
+          <w:rtl w:val="false"/>
+        </w:rPr>
+        <w:t xml:space="preserve">, pp. 205-256.</w:t>
+      </w:r>
+    </w:p>
+  </w:footnote>
+  <w:footnote w:id="26">
+    <w:p>
+      <w:pPr>
+        <w:bidi w:val="false"/>
+        <w:spacing w:after="40" w:line="240" w:lineRule="auto"/>
+        <w:jc w:val="left"/>
+      </w:pPr>
+      <w:r>
+        <w:rPr>
+          <w:rStyle w:val="FootnoteReference"/>
+        </w:rPr>
+        <w:footnoteRef/>
+      </w:r>
+      <w:r>
+        <w:rPr>
+          <w:rFonts w:ascii="David" w:cs="David" w:eastAsia="David" w:hAnsi="David"/>
+          <w:sz w:val="20"/>
+          <w:szCs w:val="20"/>
+        </w:rPr>
+        <w:t xml:space="preserve"> </w:t>
+      </w:r>
+      <w:r>
+        <w:rPr>
+          <w:rFonts w:ascii="David" w:cs="David" w:eastAsia="David" w:hAnsi="David"/>
+          <w:sz w:val="20"/>
+          <w:szCs w:val="20"/>
+          <w:rtl/>
+        </w:rPr>
+        <w:t xml:space="preserve">מירון, </w:t>
+      </w:r>
+      <w:r>
+        <w:rPr>
+          <w:rFonts w:ascii="David" w:cs="David" w:eastAsia="David" w:hAnsi="David"/>
+          <w:b/>
+          <w:bCs/>
+          <w:i w:val="false"/>
+          <w:iCs w:val="false"/>
+          <w:sz w:val="20"/>
+          <w:szCs w:val="20"/>
+          <w:rtl/>
+        </w:rPr>
+        <w:t xml:space="preserve">מדריך למידה</w:t>
+      </w:r>
+      <w:r>
+        <w:rPr>
+          <w:rFonts w:ascii="David" w:cs="David" w:eastAsia="David" w:hAnsi="David"/>
+          <w:sz w:val="20"/>
+          <w:szCs w:val="20"/>
+          <w:rtl/>
+        </w:rPr>
+        <w:t xml:space="preserve">, עמ' 58-59; Carl E. Schorske, </w:t>
+      </w:r>
+      <w:r>
+        <w:rPr>
+          <w:rFonts w:ascii="David" w:cs="David" w:eastAsia="David" w:hAnsi="David"/>
+          <w:i/>
+          <w:iCs/>
+          <w:sz w:val="20"/>
+          <w:szCs w:val="20"/>
+          <w:rtl w:val="false"/>
+        </w:rPr>
+        <w:t xml:space="preserve">Fin-de-siècle Vienna: Politics and Culture</w:t>
+      </w:r>
+      <w:r>
+        <w:rPr>
+          <w:rFonts w:ascii="David" w:cs="David" w:eastAsia="David" w:hAnsi="David"/>
+          <w:sz w:val="20"/>
+          <w:szCs w:val="20"/>
+          <w:rtl w:val="false"/>
+        </w:rPr>
+        <w:t xml:space="preserve"> (New York: Alfred A. Knopf, 1980), pp. 116-180.</w:t>
+      </w:r>
+    </w:p>
+  </w:footnote>
+  <w:footnote w:id="27">
+    <w:p>
+      <w:pPr>
+        <w:bidi w:val="false"/>
+        <w:spacing w:after="40" w:line="240" w:lineRule="auto"/>
+        <w:jc w:val="left"/>
+      </w:pPr>
+      <w:r>
+        <w:rPr>
+          <w:rStyle w:val="FootnoteReference"/>
+        </w:rPr>
+        <w:footnoteRef/>
+      </w:r>
+      <w:r>
+        <w:rPr>
+          <w:rFonts w:ascii="David" w:cs="David" w:eastAsia="David" w:hAnsi="David"/>
+          <w:sz w:val="20"/>
+          <w:szCs w:val="20"/>
+        </w:rPr>
+        <w:t xml:space="preserve"> </w:t>
+      </w:r>
+      <w:r>
+        <w:rPr>
+          <w:rFonts w:ascii="David" w:cs="David" w:eastAsia="David" w:hAnsi="David"/>
+          <w:sz w:val="20"/>
+          <w:szCs w:val="20"/>
+          <w:rtl/>
+        </w:rPr>
+        <w:t xml:space="preserve">מירון, </w:t>
+      </w:r>
+      <w:r>
+        <w:rPr>
+          <w:rFonts w:ascii="David" w:cs="David" w:eastAsia="David" w:hAnsi="David"/>
+          <w:b/>
+          <w:bCs/>
+          <w:i w:val="false"/>
+          <w:iCs w:val="false"/>
+          <w:sz w:val="20"/>
+          <w:szCs w:val="20"/>
+          <w:rtl/>
+        </w:rPr>
+        <w:t xml:space="preserve">מדריך למידה</w:t>
+      </w:r>
+      <w:r>
+        <w:rPr>
+          <w:rFonts w:ascii="David" w:cs="David" w:eastAsia="David" w:hAnsi="David"/>
+          <w:sz w:val="20"/>
+          <w:szCs w:val="20"/>
+          <w:rtl/>
+        </w:rPr>
+        <w:t xml:space="preserve">, עמ' 60-62; Paula E. Hyman, </w:t>
+      </w:r>
+      <w:r>
+        <w:rPr>
+          <w:rFonts w:ascii="David" w:cs="David" w:eastAsia="David" w:hAnsi="David"/>
+          <w:i/>
+          <w:iCs/>
+          <w:sz w:val="20"/>
+          <w:szCs w:val="20"/>
+          <w:rtl w:val="false"/>
+        </w:rPr>
+        <w:t xml:space="preserve">The Jews of Modern France</w:t>
+      </w:r>
+      <w:r>
+        <w:rPr>
+          <w:rFonts w:ascii="David" w:cs="David" w:eastAsia="David" w:hAnsi="David"/>
+          <w:sz w:val="20"/>
+          <w:szCs w:val="20"/>
+          <w:rtl w:val="false"/>
+        </w:rPr>
+        <w:t xml:space="preserve"> (Berkeley: University of California Press, 1998), pp. 89-95.</w:t>
+      </w:r>
+    </w:p>
+  </w:footnote>
+  <w:footnote w:id="28">
+    <w:p>
+      <w:pPr>
+        <w:bidi w:val="false"/>
+        <w:spacing w:after="40" w:line="240" w:lineRule="auto"/>
+        <w:jc w:val="left"/>
+      </w:pPr>
+      <w:r>
+        <w:rPr>
+          <w:rStyle w:val="FootnoteReference"/>
+        </w:rPr>
+        <w:footnoteRef/>
+      </w:r>
+      <w:r>
+        <w:rPr>
+          <w:rFonts w:ascii="David" w:cs="David" w:eastAsia="David" w:hAnsi="David"/>
+          <w:sz w:val="20"/>
+          <w:szCs w:val="20"/>
+        </w:rPr>
+        <w:t xml:space="preserve"> </w:t>
+      </w:r>
+      <w:r>
+        <w:rPr>
+          <w:rFonts w:ascii="David" w:cs="David" w:eastAsia="David" w:hAnsi="David"/>
+          <w:sz w:val="20"/>
+          <w:szCs w:val="20"/>
+          <w:rtl w:val="false"/>
+        </w:rPr>
+        <w:t xml:space="preserve">Hyman, </w:t>
+      </w:r>
+      <w:r>
+        <w:rPr>
+          <w:rFonts w:ascii="David" w:cs="David" w:eastAsia="David" w:hAnsi="David"/>
+          <w:i/>
+          <w:iCs/>
+          <w:sz w:val="20"/>
+          <w:szCs w:val="20"/>
+          <w:rtl w:val="false"/>
+        </w:rPr>
+        <w:t xml:space="preserve">The Jews of Modern France</w:t>
+      </w:r>
+      <w:r>
+        <w:rPr>
+          <w:rFonts w:ascii="David" w:cs="David" w:eastAsia="David" w:hAnsi="David"/>
+          <w:sz w:val="20"/>
+          <w:szCs w:val="20"/>
+          <w:rtl w:val="false"/>
+        </w:rPr>
+        <w:t xml:space="preserve">, pp. 95-99; Stephen Wilson, </w:t>
+      </w:r>
+      <w:r>
+        <w:rPr>
+          <w:rFonts w:ascii="David" w:cs="David" w:eastAsia="David" w:hAnsi="David"/>
+          <w:i/>
+          <w:iCs/>
+          <w:sz w:val="20"/>
+          <w:szCs w:val="20"/>
+          <w:rtl w:val="false"/>
+        </w:rPr>
+        <w:t xml:space="preserve">Ideology and Experience: Antisemitism in France at the Time of the Dreyfus Affair</w:t>
+      </w:r>
+      <w:r>
+        <w:rPr>
+          <w:rFonts w:ascii="David" w:cs="David" w:eastAsia="David" w:hAnsi="David"/>
+          <w:sz w:val="20"/>
+          <w:szCs w:val="20"/>
+          <w:rtl w:val="false"/>
+        </w:rPr>
+        <w:t xml:space="preserve"> (Rutherford: Fairleigh Dickinson University Press, 1982), pp. 3-35.</w:t>
+      </w:r>
+    </w:p>
+  </w:footnote>
+  <w:footnote w:id="29">
+    <w:p>
+      <w:pPr>
+        <w:bidi/>
+        <w:spacing w:after="40" w:line="240" w:lineRule="auto"/>
+        <w:jc w:val="both"/>
+      </w:pPr>
+      <w:r>
+        <w:rPr>
+          <w:rStyle w:val="FootnoteReference"/>
+        </w:rPr>
+        <w:footnoteRef/>
+      </w:r>
+      <w:r>
+        <w:rPr>
+          <w:rFonts w:ascii="David" w:cs="David" w:eastAsia="David" w:hAnsi="David"/>
+          <w:sz w:val="20"/>
+          <w:szCs w:val="20"/>
+        </w:rPr>
+        <w:t xml:space="preserve"> </w:t>
+      </w:r>
+      <w:r>
+        <w:rPr>
+          <w:rFonts w:ascii="David" w:cs="David" w:eastAsia="David" w:hAnsi="David"/>
+          <w:sz w:val="20"/>
+          <w:szCs w:val="20"/>
+          <w:rtl/>
+        </w:rPr>
+        <w:t xml:space="preserve">אדואר דרימון, "צרפת המיוהדת" (1886), בתוך: </w:t>
+      </w:r>
+      <w:r>
+        <w:rPr>
+          <w:rFonts w:ascii="David" w:cs="David" w:eastAsia="David" w:hAnsi="David"/>
+          <w:b/>
+          <w:bCs/>
+          <w:i w:val="false"/>
+          <w:iCs w:val="false"/>
+          <w:sz w:val="20"/>
+          <w:szCs w:val="20"/>
+          <w:rtl/>
+        </w:rPr>
+        <w:t xml:space="preserve">מקראת הקורס האנטישמיות במאה ה-19</w:t>
+      </w:r>
+      <w:r>
+        <w:rPr>
+          <w:rFonts w:ascii="David" w:cs="David" w:eastAsia="David" w:hAnsi="David"/>
+          <w:sz w:val="20"/>
+          <w:szCs w:val="20"/>
+          <w:rtl/>
+        </w:rPr>
+        <w:t xml:space="preserve"> (רעננה: האוניברסיטה הפתוחה), עמ' 443-444; Hyman, </w:t>
+      </w:r>
+      <w:r>
+        <w:rPr>
+          <w:rFonts w:ascii="David" w:cs="David" w:eastAsia="David" w:hAnsi="David"/>
+          <w:i/>
+          <w:iCs/>
+          <w:sz w:val="20"/>
+          <w:szCs w:val="20"/>
+          <w:rtl/>
+        </w:rPr>
+        <w:t xml:space="preserve">The Jews of Modern France</w:t>
+      </w:r>
+      <w:r>
+        <w:rPr>
+          <w:rFonts w:ascii="David" w:cs="David" w:eastAsia="David" w:hAnsi="David"/>
+          <w:sz w:val="20"/>
+          <w:szCs w:val="20"/>
+          <w:rtl/>
+        </w:rPr>
+        <w:t xml:space="preserve">, pp. 96-98.</w:t>
+      </w:r>
+    </w:p>
+  </w:footnote>
+  <w:footnote w:id="30">
+    <w:p>
+      <w:pPr>
+        <w:bidi w:val="false"/>
+        <w:spacing w:after="40" w:line="240" w:lineRule="auto"/>
+        <w:jc w:val="left"/>
+      </w:pPr>
+      <w:r>
+        <w:rPr>
+          <w:rStyle w:val="FootnoteReference"/>
+        </w:rPr>
+        <w:footnoteRef/>
+      </w:r>
+      <w:r>
+        <w:rPr>
+          <w:rFonts w:ascii="David" w:cs="David" w:eastAsia="David" w:hAnsi="David"/>
+          <w:sz w:val="20"/>
+          <w:szCs w:val="20"/>
+        </w:rPr>
+        <w:t xml:space="preserve"> </w:t>
+      </w:r>
+      <w:r>
+        <w:rPr>
+          <w:rFonts w:ascii="David" w:cs="David" w:eastAsia="David" w:hAnsi="David"/>
+          <w:sz w:val="20"/>
+          <w:szCs w:val="20"/>
+          <w:rtl w:val="false"/>
+        </w:rPr>
+        <w:t xml:space="preserve">Wilson, </w:t>
+      </w:r>
+      <w:r>
+        <w:rPr>
+          <w:rFonts w:ascii="David" w:cs="David" w:eastAsia="David" w:hAnsi="David"/>
+          <w:i/>
+          <w:iCs/>
+          <w:sz w:val="20"/>
+          <w:szCs w:val="20"/>
+          <w:rtl w:val="false"/>
+        </w:rPr>
+        <w:t xml:space="preserve">Ideology and Experience</w:t>
+      </w:r>
+      <w:r>
+        <w:rPr>
+          <w:rFonts w:ascii="David" w:cs="David" w:eastAsia="David" w:hAnsi="David"/>
+          <w:sz w:val="20"/>
+          <w:szCs w:val="20"/>
+          <w:rtl w:val="false"/>
+        </w:rPr>
+        <w:t xml:space="preserve">, pp. 36-70; Eric Cahm, </w:t>
+      </w:r>
+      <w:r>
+        <w:rPr>
+          <w:rFonts w:ascii="David" w:cs="David" w:eastAsia="David" w:hAnsi="David"/>
+          <w:i/>
+          <w:iCs/>
+          <w:sz w:val="20"/>
+          <w:szCs w:val="20"/>
+          <w:rtl w:val="false"/>
+        </w:rPr>
+        <w:t xml:space="preserve">The Dreyfus Affair in French Society and Politics</w:t>
+      </w:r>
+      <w:r>
+        <w:rPr>
+          <w:rFonts w:ascii="David" w:cs="David" w:eastAsia="David" w:hAnsi="David"/>
+          <w:sz w:val="20"/>
+          <w:szCs w:val="20"/>
+          <w:rtl w:val="false"/>
+        </w:rPr>
+        <w:t xml:space="preserve"> (London: Longman, 1996), pp. 1-24.</w:t>
+      </w:r>
+    </w:p>
+  </w:footnote>
+  <w:footnote w:id="31">
+    <w:p>
+      <w:pPr>
+        <w:bidi w:val="false"/>
+        <w:spacing w:after="40" w:line="240" w:lineRule="auto"/>
+        <w:jc w:val="left"/>
+      </w:pPr>
+      <w:r>
+        <w:rPr>
+          <w:rStyle w:val="FootnoteReference"/>
+        </w:rPr>
+        <w:footnoteRef/>
+      </w:r>
+      <w:r>
+        <w:rPr>
+          <w:rFonts w:ascii="David" w:cs="David" w:eastAsia="David" w:hAnsi="David"/>
+          <w:sz w:val="20"/>
+          <w:szCs w:val="20"/>
+        </w:rPr>
+        <w:t xml:space="preserve"> </w:t>
+      </w:r>
+      <w:r>
+        <w:rPr>
+          <w:rFonts w:ascii="David" w:cs="David" w:eastAsia="David" w:hAnsi="David"/>
+          <w:sz w:val="20"/>
+          <w:szCs w:val="20"/>
+          <w:rtl w:val="false"/>
+        </w:rPr>
+        <w:t xml:space="preserve">Wilson, </w:t>
+      </w:r>
+      <w:r>
+        <w:rPr>
+          <w:rFonts w:ascii="David" w:cs="David" w:eastAsia="David" w:hAnsi="David"/>
+          <w:i/>
+          <w:iCs/>
+          <w:sz w:val="20"/>
+          <w:szCs w:val="20"/>
+          <w:rtl w:val="false"/>
+        </w:rPr>
+        <w:t xml:space="preserve">Ideology and Experience</w:t>
+      </w:r>
+      <w:r>
+        <w:rPr>
+          <w:rFonts w:ascii="David" w:cs="David" w:eastAsia="David" w:hAnsi="David"/>
+          <w:sz w:val="20"/>
+          <w:szCs w:val="20"/>
+          <w:rtl w:val="false"/>
+        </w:rPr>
+        <w:t xml:space="preserve">, pp. 106-124, 171-200; Pierre Birnbaum, </w:t>
+      </w:r>
+      <w:r>
+        <w:rPr>
+          <w:rFonts w:ascii="David" w:cs="David" w:eastAsia="David" w:hAnsi="David"/>
+          <w:i/>
+          <w:iCs/>
+          <w:sz w:val="20"/>
+          <w:szCs w:val="20"/>
+          <w:rtl w:val="false"/>
+        </w:rPr>
+        <w:t xml:space="preserve">The Anti-Semitic Moment: A Tour of France in 1898</w:t>
+      </w:r>
+      <w:r>
+        <w:rPr>
+          <w:rFonts w:ascii="David" w:cs="David" w:eastAsia="David" w:hAnsi="David"/>
+          <w:sz w:val="20"/>
+          <w:szCs w:val="20"/>
+          <w:rtl w:val="false"/>
+        </w:rPr>
+        <w:t xml:space="preserve">, trans. Jane Marie Todd (New York: Hill and Wang, 2003), pp. 1-22.</w:t>
+      </w:r>
+    </w:p>
+  </w:footnote>
+  <w:footnote w:id="32">
+    <w:p>
+      <w:pPr>
+        <w:bidi w:val="false"/>
+        <w:spacing w:after="40" w:line="240" w:lineRule="auto"/>
+        <w:jc w:val="left"/>
+      </w:pPr>
+      <w:r>
+        <w:rPr>
+          <w:rStyle w:val="FootnoteReference"/>
+        </w:rPr>
+        <w:footnoteRef/>
+      </w:r>
+      <w:r>
+        <w:rPr>
+          <w:rFonts w:ascii="David" w:cs="David" w:eastAsia="David" w:hAnsi="David"/>
+          <w:sz w:val="20"/>
+          <w:szCs w:val="20"/>
+        </w:rPr>
+        <w:t xml:space="preserve"> </w:t>
+      </w:r>
+      <w:r>
+        <w:rPr>
+          <w:rFonts w:ascii="David" w:cs="David" w:eastAsia="David" w:hAnsi="David"/>
+          <w:sz w:val="20"/>
+          <w:szCs w:val="20"/>
+          <w:rtl w:val="false"/>
+        </w:rPr>
+        <w:t xml:space="preserve">Hyman, </w:t>
+      </w:r>
+      <w:r>
+        <w:rPr>
+          <w:rFonts w:ascii="David" w:cs="David" w:eastAsia="David" w:hAnsi="David"/>
+          <w:i/>
+          <w:iCs/>
+          <w:sz w:val="20"/>
+          <w:szCs w:val="20"/>
+          <w:rtl w:val="false"/>
+        </w:rPr>
+        <w:t xml:space="preserve">The Jews of Modern France</w:t>
+      </w:r>
+      <w:r>
+        <w:rPr>
+          <w:rFonts w:ascii="David" w:cs="David" w:eastAsia="David" w:hAnsi="David"/>
+          <w:sz w:val="20"/>
+          <w:szCs w:val="20"/>
+          <w:rtl w:val="false"/>
+        </w:rPr>
+        <w:t xml:space="preserve">, pp. 104-106; Michael R. Marrus, </w:t>
+      </w:r>
+      <w:r>
+        <w:rPr>
+          <w:rFonts w:ascii="David" w:cs="David" w:eastAsia="David" w:hAnsi="David"/>
+          <w:i/>
+          <w:iCs/>
+          <w:sz w:val="20"/>
+          <w:szCs w:val="20"/>
+          <w:rtl w:val="false"/>
+        </w:rPr>
+        <w:t xml:space="preserve">The Politics of Assimilation: A Study of the French Jewish Community at the Time of the Dreyfus Affair</w:t>
+      </w:r>
+      <w:r>
+        <w:rPr>
+          <w:rFonts w:ascii="David" w:cs="David" w:eastAsia="David" w:hAnsi="David"/>
+          <w:sz w:val="20"/>
+          <w:szCs w:val="20"/>
+          <w:rtl w:val="false"/>
+        </w:rPr>
+        <w:t xml:space="preserve"> (Oxford: Clarendon Press, 1971), pp. 196-242.</w:t>
+      </w:r>
+    </w:p>
+  </w:footnote>
+  <w:footnote w:id="33">
+    <w:p>
+      <w:pPr>
+        <w:bidi w:val="false"/>
+        <w:spacing w:after="40" w:line="240" w:lineRule="auto"/>
+        <w:jc w:val="left"/>
+      </w:pPr>
+      <w:r>
+        <w:rPr>
+          <w:rStyle w:val="FootnoteReference"/>
+        </w:rPr>
+        <w:footnoteRef/>
+      </w:r>
+      <w:r>
+        <w:rPr>
+          <w:rFonts w:ascii="David" w:cs="David" w:eastAsia="David" w:hAnsi="David"/>
+          <w:sz w:val="20"/>
+          <w:szCs w:val="20"/>
+        </w:rPr>
+        <w:t xml:space="preserve"> </w:t>
+      </w:r>
+      <w:r>
+        <w:rPr>
+          <w:rFonts w:ascii="David" w:cs="David" w:eastAsia="David" w:hAnsi="David"/>
+          <w:sz w:val="20"/>
+          <w:szCs w:val="20"/>
+          <w:rtl/>
+        </w:rPr>
+        <w:t xml:space="preserve">מירון, </w:t>
+      </w:r>
+      <w:r>
+        <w:rPr>
+          <w:rFonts w:ascii="David" w:cs="David" w:eastAsia="David" w:hAnsi="David"/>
+          <w:b/>
+          <w:bCs/>
+          <w:i w:val="false"/>
+          <w:iCs w:val="false"/>
+          <w:sz w:val="20"/>
+          <w:szCs w:val="20"/>
+          <w:rtl/>
+        </w:rPr>
+        <w:t xml:space="preserve">מדריך למידה</w:t>
+      </w:r>
+      <w:r>
+        <w:rPr>
+          <w:rFonts w:ascii="David" w:cs="David" w:eastAsia="David" w:hAnsi="David"/>
+          <w:sz w:val="20"/>
+          <w:szCs w:val="20"/>
+          <w:rtl/>
+        </w:rPr>
+        <w:t xml:space="preserve">, עמ' 63; Hyman, </w:t>
+      </w:r>
+      <w:r>
+        <w:rPr>
+          <w:rFonts w:ascii="David" w:cs="David" w:eastAsia="David" w:hAnsi="David"/>
+          <w:i/>
+          <w:iCs/>
+          <w:sz w:val="20"/>
+          <w:szCs w:val="20"/>
+          <w:rtl w:val="false"/>
+        </w:rPr>
+        <w:t xml:space="preserve">The Jews of Modern France</w:t>
+      </w:r>
+      <w:r>
+        <w:rPr>
+          <w:rFonts w:ascii="David" w:cs="David" w:eastAsia="David" w:hAnsi="David"/>
+          <w:sz w:val="20"/>
+          <w:szCs w:val="20"/>
+          <w:rtl w:val="false"/>
+        </w:rPr>
+        <w:t xml:space="preserve">, pp. 98-99, 111-114.</w:t>
+      </w:r>
+    </w:p>
+  </w:footnote>
+  <w:footnote w:id="34">
+    <w:p>
+      <w:pPr>
+        <w:bidi w:val="false"/>
+        <w:spacing w:after="40" w:line="240" w:lineRule="auto"/>
+        <w:jc w:val="left"/>
+      </w:pPr>
+      <w:r>
+        <w:rPr>
+          <w:rStyle w:val="FootnoteReference"/>
+        </w:rPr>
+        <w:footnoteRef/>
+      </w:r>
+      <w:r>
+        <w:rPr>
+          <w:rFonts w:ascii="David" w:cs="David" w:eastAsia="David" w:hAnsi="David"/>
+          <w:sz w:val="20"/>
+          <w:szCs w:val="20"/>
+        </w:rPr>
+        <w:t xml:space="preserve"> </w:t>
+      </w:r>
+      <w:r>
+        <w:rPr>
+          <w:rFonts w:ascii="David" w:cs="David" w:eastAsia="David" w:hAnsi="David"/>
+          <w:sz w:val="20"/>
+          <w:szCs w:val="20"/>
+          <w:rtl w:val="false"/>
+        </w:rPr>
+        <w:t xml:space="preserve">Hyman, </w:t>
+      </w:r>
+      <w:r>
+        <w:rPr>
+          <w:rFonts w:ascii="David" w:cs="David" w:eastAsia="David" w:hAnsi="David"/>
+          <w:i/>
+          <w:iCs/>
+          <w:sz w:val="20"/>
+          <w:szCs w:val="20"/>
+          <w:rtl w:val="false"/>
+        </w:rPr>
+        <w:t xml:space="preserve">The Jews of Modern France</w:t>
+      </w:r>
+      <w:r>
+        <w:rPr>
+          <w:rFonts w:ascii="David" w:cs="David" w:eastAsia="David" w:hAnsi="David"/>
+          <w:sz w:val="20"/>
+          <w:szCs w:val="20"/>
+          <w:rtl w:val="false"/>
+        </w:rPr>
+        <w:t xml:space="preserve">, pp. 111-114; Pulzer, </w:t>
+      </w:r>
+      <w:r>
+        <w:rPr>
+          <w:rFonts w:ascii="David" w:cs="David" w:eastAsia="David" w:hAnsi="David"/>
+          <w:i/>
+          <w:iCs/>
+          <w:sz w:val="20"/>
+          <w:szCs w:val="20"/>
+          <w:rtl w:val="false"/>
+        </w:rPr>
+        <w:t xml:space="preserve">The Rise of Political Anti-Semitism</w:t>
+      </w:r>
+      <w:r>
+        <w:rPr>
+          <w:rFonts w:ascii="David" w:cs="David" w:eastAsia="David" w:hAnsi="David"/>
+          <w:sz w:val="20"/>
+          <w:szCs w:val="20"/>
+          <w:rtl w:val="false"/>
+        </w:rPr>
+        <w:t xml:space="preserve">, pp. 47-57.</w:t>
+      </w:r>
+    </w:p>
+  </w:footnote>
+  <w:footnote w:id="35">
+    <w:p>
+      <w:pPr>
+        <w:bidi w:val="false"/>
+        <w:spacing w:after="40" w:line="240" w:lineRule="auto"/>
+        <w:jc w:val="left"/>
+      </w:pPr>
+      <w:r>
+        <w:rPr>
+          <w:rStyle w:val="FootnoteReference"/>
+        </w:rPr>
+        <w:footnoteRef/>
+      </w:r>
+      <w:r>
+        <w:rPr>
+          <w:rFonts w:ascii="David" w:cs="David" w:eastAsia="David" w:hAnsi="David"/>
+          <w:sz w:val="20"/>
+          <w:szCs w:val="20"/>
+        </w:rPr>
+        <w:t xml:space="preserve"> </w:t>
+      </w:r>
+      <w:r>
+        <w:rPr>
+          <w:rFonts w:ascii="David" w:cs="David" w:eastAsia="David" w:hAnsi="David"/>
+          <w:sz w:val="20"/>
+          <w:szCs w:val="20"/>
+          <w:rtl/>
+        </w:rPr>
+        <w:t xml:space="preserve">אבינרי, </w:t>
+      </w:r>
+      <w:r>
+        <w:rPr>
+          <w:rFonts w:ascii="David" w:cs="David" w:eastAsia="David" w:hAnsi="David"/>
+          <w:b/>
+          <w:bCs/>
+          <w:i w:val="false"/>
+          <w:iCs w:val="false"/>
+          <w:sz w:val="20"/>
+          <w:szCs w:val="20"/>
+          <w:rtl/>
+        </w:rPr>
+        <w:t xml:space="preserve">הרצל</w:t>
+      </w:r>
+      <w:r>
+        <w:rPr>
+          <w:rFonts w:ascii="David" w:cs="David" w:eastAsia="David" w:hAnsi="David"/>
+          <w:sz w:val="20"/>
+          <w:szCs w:val="20"/>
+          <w:rtl/>
+        </w:rPr>
+        <w:t xml:space="preserve">, עמ' 15-56; Hyman, </w:t>
+      </w:r>
+      <w:r>
+        <w:rPr>
+          <w:rFonts w:ascii="David" w:cs="David" w:eastAsia="David" w:hAnsi="David"/>
+          <w:i/>
+          <w:iCs/>
+          <w:sz w:val="20"/>
+          <w:szCs w:val="20"/>
+          <w:rtl w:val="false"/>
+        </w:rPr>
+        <w:t xml:space="preserve">The Jews of Modern France</w:t>
+      </w:r>
+      <w:r>
+        <w:rPr>
+          <w:rFonts w:ascii="David" w:cs="David" w:eastAsia="David" w:hAnsi="David"/>
+          <w:sz w:val="20"/>
+          <w:szCs w:val="20"/>
+          <w:rtl w:val="false"/>
+        </w:rPr>
+        <w:t xml:space="preserve">, pp. 111-114; Pulzer, </w:t>
+      </w:r>
+      <w:r>
+        <w:rPr>
+          <w:rFonts w:ascii="David" w:cs="David" w:eastAsia="David" w:hAnsi="David"/>
+          <w:i/>
+          <w:iCs/>
+          <w:sz w:val="20"/>
+          <w:szCs w:val="20"/>
+          <w:rtl w:val="false"/>
+        </w:rPr>
+        <w:t xml:space="preserve">The Rise of Political Anti-Semitism</w:t>
+      </w:r>
+      <w:r>
+        <w:rPr>
+          <w:rFonts w:ascii="David" w:cs="David" w:eastAsia="David" w:hAnsi="David"/>
+          <w:sz w:val="20"/>
+          <w:szCs w:val="20"/>
+          <w:rtl w:val="false"/>
+        </w:rPr>
+        <w:t xml:space="preserve">, pp. 47-57.</w:t>
       </w:r>
     </w:p>
   </w:footnote>

</xml_diff>

<commit_message>
Verify citations against the course reader: Heschel pp. 73-94, Ettinger 2nd ed. 1990, Hyman ch. 6 pp. 91-114, Pulzer 1964 chapters; add reader primary sources (Stoecker, Marr, Treitschke, Duehring, CV declaration)
Co-Authored-By: Claude Fable 5.1 <noreply@anthropic.com>
Claude-Session: https://claude.ai/code/session_014Ur3fhHcvLKdVTb2L63jaV
</commit_message>
<xml_diff>
--- a/seminar/מבוא ופרק ראשון - להגשה.docx
+++ b/seminar/מבוא ופרק ראשון - להגשה.docx
@@ -800,7 +800,7 @@
           <w:szCs w:val="24"/>
           <w:rtl/>
         </w:rPr>
-        <w:t xml:space="preserve">לצד התנועה הפוליטית התפתחה גם תורה. בשנת 1881 פרסם הפילוסוף אויגן דירינג את חיבורו "השאלה היהודית כשאלה של גזע, מוסר ותרבות", שהציג את היהודים כגזע נחות ומזיק שאין לו תקנה, ושלל במפורש את המרת הדת כפתרון. דירינג הפך את האנטישמיות מעמדה דתית או כלכלית לתורה ביולוגית סגורה, וזהו החיבור שהרצל קרא בשנת 1882. באותה שנה התלוותה לתעמולה גם אלימות: בקיץ 1881 פרצו התפרעויות נגד יהודים בנוישטטין שבפומרניה ובעיירות סמוכות, לאחר שריפת בית הכנסת המקומי, והן היו הראשונות בגרמניה המאוחדת .</w:t>
+        <w:t xml:space="preserve">המקורות הראשוניים שבמקראת הקורס מאפשרים לעמוד על טיב הטענות. שטקר, בנאומו "תביעתנו כלפי היהדות המודרנית" (ספטמבר 1879), תיאר את היהודים כ"עם בתוך עם, מדינה בתוך מדינה", הזהיר מפני ארבעים וחמישה אלף היהודים של ברלין השולטים לדבריו בכסף, בבנקים ובעיתונות, ודרש מהם "להשתתף בעבודה הגרמנית" ולוותר על השאיפה "להפוך לאדוניה של גרמניה" .</w:t>
       </w:r>
       <w:r>
         <w:rPr>
@@ -808,6 +808,36 @@
         </w:rPr>
         <w:footnoteReference w:id="19"/>
       </w:r>
+      <w:r>
+        <w:rPr>
+          <w:rFonts w:ascii="David" w:cs="David" w:eastAsia="David" w:hAnsi="David"/>
+          <w:sz w:val="24"/>
+          <w:szCs w:val="24"/>
+          <w:rtl/>
+        </w:rPr>
+        <w:t xml:space="preserve"> מאר, בחיבורו "ניצחון היהדות על הגרמאניות", הציג את הדברים בלשון של גורל היסטורי: היהדות כבר ניצחה, המדינה "הנוצרית" אינה יכולה לעצור אותה, ובתוך ארבעה דורות לא תיוותר משרה בגרמניה שלא תיכבש בידי יהודים .</w:t>
+      </w:r>
+      <w:r>
+        <w:rPr>
+          <w:rStyle w:val="FootnoteReference"/>
+        </w:rPr>
+        <w:footnoteReference w:id="20"/>
+      </w:r>
+      <w:r>
+        <w:rPr>
+          <w:rFonts w:ascii="David" w:cs="David" w:eastAsia="David" w:hAnsi="David"/>
+          <w:sz w:val="24"/>
+          <w:szCs w:val="24"/>
+          <w:rtl/>
+        </w:rPr>
+        <w:t xml:space="preserve"> טרייצ'קה ניסח את הדברים במתינות של מלומד, אך הגיע לאותה מסקנה: ההגירה מ"העריסה הפולנית שאינה נדלית" מאיימת על התרבות הלאומית, העיתונות הגרמנית נשלטת בידי יהודים, ו"עד לחוגים בעלי ההשכלה הגבוהה ביותר נשמע כיום פה אחד: היהודים הם אסוננו" .</w:t>
+      </w:r>
+      <w:r>
+        <w:rPr>
+          <w:rStyle w:val="FootnoteReference"/>
+        </w:rPr>
+        <w:footnoteReference w:id="21"/>
+      </w:r>
     </w:p>
     <w:p>
       <w:pPr>
@@ -822,13 +852,50 @@
           <w:szCs w:val="24"/>
           <w:rtl/>
         </w:rPr>
+        <w:t xml:space="preserve">לצד התנועה הפוליטית התפתחה גם תורה. בשנת 1881 פרסם הפילוסוף אויגן דירינג את חיבורו "השאלה היהודית כשאלה של גזע, מוסר ותרבות", שהציג את היהודים כגזע נחות ומזיק שאין לו תקנה, ושלל במפורש את המרת הדת כפתרון. דירינג הפך את האנטישמיות מעמדה דתית או כלכלית לתורה ביולוגית סגורה, שבה אפילו עלילת הדם מוסברת כביטוי ל"אהבה העצמית העצומה של העברים, העוינת לכל זולתם", וזהו החיבור שהרצל קרא בשנת 1882 .</w:t>
+      </w:r>
+      <w:r>
+        <w:rPr>
+          <w:rStyle w:val="FootnoteReference"/>
+        </w:rPr>
+        <w:footnoteReference w:id="22"/>
+      </w:r>
+      <w:r>
+        <w:rPr>
+          <w:rFonts w:ascii="David" w:cs="David" w:eastAsia="David" w:hAnsi="David"/>
+          <w:sz w:val="24"/>
+          <w:szCs w:val="24"/>
+          <w:rtl/>
+        </w:rPr>
+        <w:t xml:space="preserve"> באותה שנה התלוותה לתעמולה גם אלימות: בקיץ 1881 פרצו התפרעויות נגד יהודים בנוישטטין שבפומרניה ובעיירות סמוכות, לאחר שריפת בית הכנסת המקומי, והן היו הראשונות בגרמניה המאוחדת .</w:t>
+      </w:r>
+      <w:r>
+        <w:rPr>
+          <w:rStyle w:val="FootnoteReference"/>
+        </w:rPr>
+        <w:footnoteReference w:id="23"/>
+      </w:r>
+    </w:p>
+    <w:p>
+      <w:pPr>
+        <w:bidi/>
+        <w:spacing w:after="120" w:line="360" w:lineRule="auto"/>
+        <w:jc w:val="right"/>
+      </w:pPr>
+      <w:r>
+        <w:rPr>
+          <w:rFonts w:ascii="David" w:cs="David" w:eastAsia="David" w:hAnsi="David"/>
+          <w:sz w:val="24"/>
+          <w:szCs w:val="24"/>
+          <w:rtl/>
+        </w:rPr>
         <w:t xml:space="preserve">בשנות התשעים, השנים שבהן שהה הרצל בפריז, הגיעה האנטישמיות המפלגתית בגרמניה לשיאה. המורה אוטו בקל נבחר לרייכסטאג בשנת 1887 כציר האנטישמי הראשון, על מצע של איכרים בהסן נגד סוחרי הבקר היהודים; הרמן אלוורדט, מנהל בית ספר שהורשע בהוצאת דיבה, נבחר בשנת 1892; ובבחירות 1893 זכו המפלגות האנטישמיות בשישה עשר מושבים. באותה שנה אימצה המפלגה השמרנית, בתוכנית טיבולי, סעיף נגד "ההשפעה היהודית ההרסנית". ההצלחה הייתה מוגבלת: המפלגות האנטישמיות נותרו בשולי המערכת, התפצלו ושקעו לפני מלחמת העולם הראשונה. אך הן הראו שאנטישמיות יכולה לשמש מצע לגיוס פוליטי, ושהמפלגות הממוסדות מוכנות לאמץ את שפתה .</w:t>
       </w:r>
       <w:r>
         <w:rPr>
           <w:rStyle w:val="FootnoteReference"/>
         </w:rPr>
-        <w:footnoteReference w:id="20"/>
+        <w:footnoteReference w:id="24"/>
       </w:r>
     </w:p>
     <w:p>
@@ -844,13 +911,13 @@
           <w:szCs w:val="24"/>
           <w:rtl/>
         </w:rPr>
-        <w:t xml:space="preserve">התגובה על האנטישמיות בגרמניה מלמדת על מקומה בתרבות הפוליטית. בשנת 1880 חתמו שבעים וחמישה אישי ציבור, ובהם ההיסטוריון תיאודור מומזן, על הצהרה נגד "ויכוח האנטישמיות"; בשנת 1891 נוסדה "האגודה להדיפת האנטישמיות", שרוב חבריה היו נוצרים ליברלים; ובשנת 1893 הקימו יהודי גרמניה את "האגודה המרכזית של אזרחים גרמנים בני הדת היהודית", שנועדה להיאבק באנטישמיות בכלים משפטיים ולהדגיש את הגרמניות של היהודים. ההתארגנות היהודית הזאת, שראתה בהגנה על האמנציפציה ולא ביציאה ממנה את התשובה, היא הרקע שעל פניו יבלוט הפתרון של הרצל .</w:t>
-      </w:r>
-      <w:r>
-        <w:rPr>
-          <w:rStyle w:val="FootnoteReference"/>
-        </w:rPr>
-        <w:footnoteReference w:id="21"/>
+        <w:t xml:space="preserve">התגובה על האנטישמיות בגרמניה מלמדת על מקומה בתרבות הפוליטית. בשנת 1880 חתמו שבעים וחמישה אישי ציבור, ובהם ההיסטוריון תיאודור מומזן, על הצהרה נגד "ויכוח האנטישמיות"; בשנת 1891 נוסדה "האגודה להדיפת האנטישמיות", שרוב חבריה היו נוצרים ליברלים; ובשנת 1893 הקימו יהודי גרמניה את "האגודה המרכזית של אזרחים גרמנים בני הדת היהודית", שנועדה להיאבק באנטישמיות בכלים משפטיים ולהדגיש את הגרמניות של היהודים. בכרוז הייסוד שלה הכריזה האגודה שהיהודים הגרמנים "נמסרו בשמחה ובהתלהבות לחיי הכלל של העם הגרמני", ושהם מתארגנים כדי "להגן בכוחנו שלנו על מעמדנו במולדתנו". ההתארגנות היהודית הזאת, שראתה בהגנה על האמנציפציה ולא ביציאה ממנה את התשובה, היא הרקע שעל פניו יבלוט הפתרון של הרצל .</w:t>
+      </w:r>
+      <w:r>
+        <w:rPr>
+          <w:rStyle w:val="FootnoteReference"/>
+        </w:rPr>
+        <w:footnoteReference w:id="25"/>
       </w:r>
     </w:p>
     <w:p>
@@ -872,7 +939,7 @@
         <w:rPr>
           <w:rStyle w:val="FootnoteReference"/>
         </w:rPr>
-        <w:footnoteReference w:id="22"/>
+        <w:footnoteReference w:id="26"/>
       </w:r>
     </w:p>
     <w:p>
@@ -913,7 +980,7 @@
         <w:rPr>
           <w:rStyle w:val="FootnoteReference"/>
         </w:rPr>
-        <w:footnoteReference w:id="23"/>
+        <w:footnoteReference w:id="27"/>
       </w:r>
     </w:p>
     <w:p>
@@ -935,7 +1002,7 @@
         <w:rPr>
           <w:rStyle w:val="FootnoteReference"/>
         </w:rPr>
-        <w:footnoteReference w:id="24"/>
+        <w:footnoteReference w:id="28"/>
       </w:r>
     </w:p>
     <w:p>
@@ -957,7 +1024,7 @@
         <w:rPr>
           <w:rStyle w:val="FootnoteReference"/>
         </w:rPr>
-        <w:footnoteReference w:id="25"/>
+        <w:footnoteReference w:id="29"/>
       </w:r>
     </w:p>
     <w:p>
@@ -979,7 +1046,7 @@
         <w:rPr>
           <w:rStyle w:val="FootnoteReference"/>
         </w:rPr>
-        <w:footnoteReference w:id="26"/>
+        <w:footnoteReference w:id="30"/>
       </w:r>
     </w:p>
     <w:p>
@@ -1020,7 +1087,7 @@
         <w:rPr>
           <w:rStyle w:val="FootnoteReference"/>
         </w:rPr>
-        <w:footnoteReference w:id="27"/>
+        <w:footnoteReference w:id="31"/>
       </w:r>
     </w:p>
     <w:p>
@@ -1042,7 +1109,7 @@
         <w:rPr>
           <w:rStyle w:val="FootnoteReference"/>
         </w:rPr>
-        <w:footnoteReference w:id="28"/>
+        <w:footnoteReference w:id="32"/>
       </w:r>
     </w:p>
     <w:p>
@@ -1064,7 +1131,7 @@
         <w:rPr>
           <w:rStyle w:val="FootnoteReference"/>
         </w:rPr>
-        <w:footnoteReference w:id="29"/>
+        <w:footnoteReference w:id="33"/>
       </w:r>
     </w:p>
     <w:p>
@@ -1086,7 +1153,7 @@
         <w:rPr>
           <w:rStyle w:val="FootnoteReference"/>
         </w:rPr>
-        <w:footnoteReference w:id="30"/>
+        <w:footnoteReference w:id="34"/>
       </w:r>
     </w:p>
     <w:p>
@@ -1108,7 +1175,7 @@
         <w:rPr>
           <w:rStyle w:val="FootnoteReference"/>
         </w:rPr>
-        <w:footnoteReference w:id="31"/>
+        <w:footnoteReference w:id="35"/>
       </w:r>
     </w:p>
     <w:p>
@@ -1130,7 +1197,7 @@
         <w:rPr>
           <w:rStyle w:val="FootnoteReference"/>
         </w:rPr>
-        <w:footnoteReference w:id="32"/>
+        <w:footnoteReference w:id="36"/>
       </w:r>
     </w:p>
     <w:p>
@@ -1152,7 +1219,7 @@
         <w:rPr>
           <w:rStyle w:val="FootnoteReference"/>
         </w:rPr>
-        <w:footnoteReference w:id="33"/>
+        <w:footnoteReference w:id="37"/>
       </w:r>
     </w:p>
     <w:p>
@@ -1193,7 +1260,7 @@
         <w:rPr>
           <w:rStyle w:val="FootnoteReference"/>
         </w:rPr>
-        <w:footnoteReference w:id="34"/>
+        <w:footnoteReference w:id="38"/>
       </w:r>
     </w:p>
     <w:p>
@@ -1215,7 +1282,7 @@
         <w:rPr>
           <w:rStyle w:val="FootnoteReference"/>
         </w:rPr>
-        <w:footnoteReference w:id="35"/>
+        <w:footnoteReference w:id="39"/>
       </w:r>
     </w:p>
     <w:p>
@@ -1330,7 +1397,7 @@
           <w:szCs w:val="24"/>
           <w:rtl/>
         </w:rPr>
-        <w:t xml:space="preserve">אטינגר, ש' (1978). </w:t>
+        <w:t xml:space="preserve">אטינגר, ש' (1990). </w:t>
       </w:r>
       <w:r>
         <w:rPr>
@@ -1352,7 +1419,7 @@
           <w:szCs w:val="24"/>
           <w:rtl/>
         </w:rPr>
-        <w:t xml:space="preserve">. תל אביב: מורשת וספרית פועלים.</w:t>
+        <w:t xml:space="preserve"> (מהדורה שנייה). תל אביב: מורשת.</w:t>
       </w:r>
     </w:p>
     <w:p>
@@ -1408,7 +1475,7 @@
           <w:szCs w:val="24"/>
           <w:rtl/>
         </w:rPr>
-        <w:t xml:space="preserve">דרימון, א' (1886). צרפת המיוהדת. בתוך </w:t>
+        <w:t xml:space="preserve">דירינג, א' (1881). שאלת היהודים כשאלת הגזע. בתוך </w:t>
       </w:r>
       <w:r>
         <w:rPr>
@@ -1430,7 +1497,7 @@
           <w:szCs w:val="24"/>
           <w:rtl/>
         </w:rPr>
-        <w:t xml:space="preserve"> (עמ' 443-444). רעננה: האוניברסיטה הפתוחה.</w:t>
+        <w:t xml:space="preserve"> (עמ' 355-356). רעננה: האוניברסיטה הפתוחה.</w:t>
       </w:r>
     </w:p>
     <w:p>
@@ -1447,7 +1514,7 @@
           <w:szCs w:val="24"/>
           <w:rtl/>
         </w:rPr>
-        <w:t xml:space="preserve">השל, ס' (תש"ף). לקראת היסטוריוגרפיה ארוטית: חקר הממדים החושיים והרגשיים של האנטישמיות. בתוך ג' מירון וס' אורי (עורכים), אנטישמיות בין מושג היסטורי לשיח ציבורי, </w:t>
+        <w:t xml:space="preserve">דרימון, א' (1886). צרפת המיוהדת. בתוך </w:t>
       </w:r>
       <w:r>
         <w:rPr>
@@ -1460,16 +1527,16 @@
           <w:szCs w:val="24"/>
           <w:rtl/>
         </w:rPr>
-        <w:t xml:space="preserve">ציון</w:t>
-      </w:r>
-      <w:r>
-        <w:rPr>
-          <w:rFonts w:ascii="David" w:cs="David" w:eastAsia="David" w:hAnsi="David"/>
-          <w:sz w:val="24"/>
-          <w:szCs w:val="24"/>
-          <w:rtl/>
-        </w:rPr>
-        <w:t xml:space="preserve">, פה, 5-30.</w:t>
+        <w:t xml:space="preserve">מקראת הקורס האנטישמיות במאה ה-19</w:t>
+      </w:r>
+      <w:r>
+        <w:rPr>
+          <w:rFonts w:ascii="David" w:cs="David" w:eastAsia="David" w:hAnsi="David"/>
+          <w:sz w:val="24"/>
+          <w:szCs w:val="24"/>
+          <w:rtl/>
+        </w:rPr>
+        <w:t xml:space="preserve"> (עמ' 443-444). רעננה: האוניברסיטה הפתוחה.</w:t>
       </w:r>
     </w:p>
     <w:p>
@@ -1486,7 +1553,7 @@
           <w:szCs w:val="24"/>
           <w:rtl/>
         </w:rPr>
-        <w:t xml:space="preserve">וולקוב, ש' (2002). </w:t>
+        <w:t xml:space="preserve">השל, ס' (תש"ף). לקראת היסטוריוגרפיה ארוטית: חקר הממדים החושיים והרגשיים של האנטישמיות. בתוך ג' מירון וס' אורי (עורכים), אנטישמיות בין מושג היסטורי לשיח ציבורי, </w:t>
       </w:r>
       <w:r>
         <w:rPr>
@@ -1499,16 +1566,16 @@
           <w:szCs w:val="24"/>
           <w:rtl/>
         </w:rPr>
-        <w:t xml:space="preserve">במעגל המכושף: יהודים, אנטישמים וגרמנים אחרים</w:t>
-      </w:r>
-      <w:r>
-        <w:rPr>
-          <w:rFonts w:ascii="David" w:cs="David" w:eastAsia="David" w:hAnsi="David"/>
-          <w:sz w:val="24"/>
-          <w:szCs w:val="24"/>
-          <w:rtl/>
-        </w:rPr>
-        <w:t xml:space="preserve">. תל אביב: עם עובד.</w:t>
+        <w:t xml:space="preserve">ציון</w:t>
+      </w:r>
+      <w:r>
+        <w:rPr>
+          <w:rFonts w:ascii="David" w:cs="David" w:eastAsia="David" w:hAnsi="David"/>
+          <w:sz w:val="24"/>
+          <w:szCs w:val="24"/>
+          <w:rtl/>
+        </w:rPr>
+        <w:t xml:space="preserve">, פה, 73-94.</w:t>
       </w:r>
     </w:p>
     <w:p>
@@ -1525,7 +1592,7 @@
           <w:szCs w:val="24"/>
           <w:rtl/>
         </w:rPr>
-        <w:t xml:space="preserve">כ"ץ, י' (1979). </w:t>
+        <w:t xml:space="preserve">וולקוב, ש' (2002). </w:t>
       </w:r>
       <w:r>
         <w:rPr>
@@ -1538,7 +1605,7 @@
           <w:szCs w:val="24"/>
           <w:rtl/>
         </w:rPr>
-        <w:t xml:space="preserve">שנאת ישראל: משנאת הדת לשלילת הגזע</w:t>
+        <w:t xml:space="preserve">במעגל המכושף: יהודים, אנטישמים וגרמנים אחרים</w:t>
       </w:r>
       <w:r>
         <w:rPr>
@@ -1564,7 +1631,7 @@
           <w:szCs w:val="24"/>
           <w:rtl/>
         </w:rPr>
-        <w:t xml:space="preserve">מירון, ג' (2022). </w:t>
+        <w:t xml:space="preserve">כ"ץ, י' (1979). </w:t>
       </w:r>
       <w:r>
         <w:rPr>
@@ -1577,16 +1644,16 @@
           <w:szCs w:val="24"/>
           <w:rtl/>
         </w:rPr>
-        <w:t xml:space="preserve">האנטישמיות במאה ה-19: מדריך למידה</w:t>
-      </w:r>
-      <w:r>
-        <w:rPr>
-          <w:rFonts w:ascii="David" w:cs="David" w:eastAsia="David" w:hAnsi="David"/>
-          <w:sz w:val="24"/>
-          <w:szCs w:val="24"/>
-          <w:rtl/>
-        </w:rPr>
-        <w:t xml:space="preserve">. רעננה: האוניברסיטה הפתוחה.</w:t>
+        <w:t xml:space="preserve">שנאת ישראל: משנאת הדת לשלילת הגזע</w:t>
+      </w:r>
+      <w:r>
+        <w:rPr>
+          <w:rFonts w:ascii="David" w:cs="David" w:eastAsia="David" w:hAnsi="David"/>
+          <w:sz w:val="24"/>
+          <w:szCs w:val="24"/>
+          <w:rtl/>
+        </w:rPr>
+        <w:t xml:space="preserve">. תל אביב: עם עובד.</w:t>
       </w:r>
     </w:p>
     <w:p>
@@ -1603,7 +1670,7 @@
           <w:szCs w:val="24"/>
           <w:rtl/>
         </w:rPr>
-        <w:t xml:space="preserve">פלדמן, ד' (תש"ף). אנטישמיות ואסלאמופוביה (ד' מגן, מתרגם). בתוך ג' מירון וס' אורי (עורכים), אנטישמיות בין מושג היסטורי לשיח ציבורי, </w:t>
+        <w:t xml:space="preserve">מאר, ו' (1879). ניצחון היהדות על הגרמאניות. בתוך </w:t>
       </w:r>
       <w:r>
         <w:rPr>
@@ -1616,6 +1683,123 @@
           <w:szCs w:val="24"/>
           <w:rtl/>
         </w:rPr>
+        <w:t xml:space="preserve">מקראת הקורס האנטישמיות במאה ה-19</w:t>
+      </w:r>
+      <w:r>
+        <w:rPr>
+          <w:rFonts w:ascii="David" w:cs="David" w:eastAsia="David" w:hAnsi="David"/>
+          <w:sz w:val="24"/>
+          <w:szCs w:val="24"/>
+          <w:rtl/>
+        </w:rPr>
+        <w:t xml:space="preserve"> (עמ' 349-352). רעננה: האוניברסיטה הפתוחה.</w:t>
+      </w:r>
+    </w:p>
+    <w:p>
+      <w:pPr>
+        <w:bidi/>
+        <w:spacing w:after="240" w:line="240" w:lineRule="auto"/>
+        <w:ind w:left="720" w:hanging="720"/>
+        <w:jc w:val="right"/>
+      </w:pPr>
+      <w:r>
+        <w:rPr>
+          <w:rFonts w:ascii="David" w:cs="David" w:eastAsia="David" w:hAnsi="David"/>
+          <w:sz w:val="24"/>
+          <w:szCs w:val="24"/>
+          <w:rtl/>
+        </w:rPr>
+        <w:t xml:space="preserve">מירון, ג' (2022). </w:t>
+      </w:r>
+      <w:r>
+        <w:rPr>
+          <w:rFonts w:ascii="David" w:cs="David" w:eastAsia="David" w:hAnsi="David"/>
+          <w:b/>
+          <w:bCs/>
+          <w:i w:val="false"/>
+          <w:iCs w:val="false"/>
+          <w:sz w:val="24"/>
+          <w:szCs w:val="24"/>
+          <w:rtl/>
+        </w:rPr>
+        <w:t xml:space="preserve">האנטישמיות במאה ה-19: מדריך למידה</w:t>
+      </w:r>
+      <w:r>
+        <w:rPr>
+          <w:rFonts w:ascii="David" w:cs="David" w:eastAsia="David" w:hAnsi="David"/>
+          <w:sz w:val="24"/>
+          <w:szCs w:val="24"/>
+          <w:rtl/>
+        </w:rPr>
+        <w:t xml:space="preserve">. רעננה: האוניברסיטה הפתוחה.</w:t>
+      </w:r>
+    </w:p>
+    <w:p>
+      <w:pPr>
+        <w:bidi/>
+        <w:spacing w:after="240" w:line="240" w:lineRule="auto"/>
+        <w:ind w:left="720" w:hanging="720"/>
+        <w:jc w:val="right"/>
+      </w:pPr>
+      <w:r>
+        <w:rPr>
+          <w:rFonts w:ascii="David" w:cs="David" w:eastAsia="David" w:hAnsi="David"/>
+          <w:sz w:val="24"/>
+          <w:szCs w:val="24"/>
+          <w:rtl/>
+        </w:rPr>
+        <w:t xml:space="preserve">טרייצ'קה, ה' פ' (1879). דבר על יהדותנו. בתוך </w:t>
+      </w:r>
+      <w:r>
+        <w:rPr>
+          <w:rFonts w:ascii="David" w:cs="David" w:eastAsia="David" w:hAnsi="David"/>
+          <w:b/>
+          <w:bCs/>
+          <w:i w:val="false"/>
+          <w:iCs w:val="false"/>
+          <w:sz w:val="24"/>
+          <w:szCs w:val="24"/>
+          <w:rtl/>
+        </w:rPr>
+        <w:t xml:space="preserve">מקראת הקורס האנטישמיות במאה ה-19</w:t>
+      </w:r>
+      <w:r>
+        <w:rPr>
+          <w:rFonts w:ascii="David" w:cs="David" w:eastAsia="David" w:hAnsi="David"/>
+          <w:sz w:val="24"/>
+          <w:szCs w:val="24"/>
+          <w:rtl/>
+        </w:rPr>
+        <w:t xml:space="preserve"> (עמ' 357-360). רעננה: האוניברסיטה הפתוחה.</w:t>
+      </w:r>
+    </w:p>
+    <w:p>
+      <w:pPr>
+        <w:bidi/>
+        <w:spacing w:after="240" w:line="240" w:lineRule="auto"/>
+        <w:ind w:left="720" w:hanging="720"/>
+        <w:jc w:val="right"/>
+      </w:pPr>
+      <w:r>
+        <w:rPr>
+          <w:rFonts w:ascii="David" w:cs="David" w:eastAsia="David" w:hAnsi="David"/>
+          <w:sz w:val="24"/>
+          <w:szCs w:val="24"/>
+          <w:rtl/>
+        </w:rPr>
+        <w:t xml:space="preserve">פלדמן, ד' (תש"ף). אנטישמיות ואסלאמופוביה (ד' מגן, מתרגם). בתוך ג' מירון וס' אורי (עורכים), אנטישמיות בין מושג היסטורי לשיח ציבורי, </w:t>
+      </w:r>
+      <w:r>
+        <w:rPr>
+          <w:rFonts w:ascii="David" w:cs="David" w:eastAsia="David" w:hAnsi="David"/>
+          <w:b/>
+          <w:bCs/>
+          <w:i w:val="false"/>
+          <w:iCs w:val="false"/>
+          <w:sz w:val="24"/>
+          <w:szCs w:val="24"/>
+          <w:rtl/>
+        </w:rPr>
         <w:t xml:space="preserve">ציון</w:t>
       </w:r>
       <w:r>
@@ -1626,6 +1810,45 @@
           <w:rtl/>
         </w:rPr>
         <w:t xml:space="preserve">, פה, 295-307.</w:t>
+      </w:r>
+    </w:p>
+    <w:p>
+      <w:pPr>
+        <w:bidi/>
+        <w:spacing w:after="240" w:line="240" w:lineRule="auto"/>
+        <w:ind w:left="720" w:hanging="720"/>
+        <w:jc w:val="right"/>
+      </w:pPr>
+      <w:r>
+        <w:rPr>
+          <w:rFonts w:ascii="David" w:cs="David" w:eastAsia="David" w:hAnsi="David"/>
+          <w:sz w:val="24"/>
+          <w:szCs w:val="24"/>
+          <w:rtl/>
+        </w:rPr>
+        <w:t xml:space="preserve">שטקר, א' (1879). תביעתנו כלפי היהדות המודרנית. בתוך </w:t>
+      </w:r>
+      <w:r>
+        <w:rPr>
+          <w:rFonts w:ascii="David" w:cs="David" w:eastAsia="David" w:hAnsi="David"/>
+          <w:b/>
+          <w:bCs/>
+          <w:i w:val="false"/>
+          <w:iCs w:val="false"/>
+          <w:sz w:val="24"/>
+          <w:szCs w:val="24"/>
+          <w:rtl/>
+        </w:rPr>
+        <w:t xml:space="preserve">מקראת הקורס האנטישמיות במאה ה-19</w:t>
+      </w:r>
+      <w:r>
+        <w:rPr>
+          <w:rFonts w:ascii="David" w:cs="David" w:eastAsia="David" w:hAnsi="David"/>
+          <w:sz w:val="24"/>
+          <w:szCs w:val="24"/>
+          <w:rtl/>
+        </w:rPr>
+        <w:t xml:space="preserve"> (עמ' 345-347). רעננה: האוניברסיטה הפתוחה.</w:t>
       </w:r>
     </w:p>
     <w:p>
@@ -2123,7 +2346,44 @@
           <w:szCs w:val="24"/>
           <w:rtl w:val="false"/>
         </w:rPr>
-        <w:t xml:space="preserve">Pulzer, P. (1988). </w:t>
+        <w:t xml:space="preserve">Pulzer, P. G. J. (1964). </w:t>
+      </w:r>
+      <w:r>
+        <w:rPr>
+          <w:rFonts w:ascii="David" w:cs="David" w:eastAsia="David" w:hAnsi="David"/>
+          <w:i/>
+          <w:iCs/>
+          <w:sz w:val="24"/>
+          <w:szCs w:val="24"/>
+          <w:rtl w:val="false"/>
+        </w:rPr>
+        <w:t xml:space="preserve">The rise of political anti-Semitism in Germany and Austria</w:t>
+      </w:r>
+      <w:r>
+        <w:rPr>
+          <w:rFonts w:ascii="David" w:cs="David" w:eastAsia="David" w:hAnsi="David"/>
+          <w:sz w:val="24"/>
+          <w:szCs w:val="24"/>
+          <w:rtl w:val="false"/>
+        </w:rPr>
+        <w:t xml:space="preserve">. New York: John Wiley &amp; Sons.</w:t>
+      </w:r>
+    </w:p>
+    <w:p>
+      <w:pPr>
+        <w:bidi w:val="false"/>
+        <w:spacing w:after="240" w:line="240" w:lineRule="auto"/>
+        <w:ind w:left="720" w:hanging="720"/>
+        <w:jc w:val="left"/>
+      </w:pPr>
+      <w:r>
+        <w:rPr>
+          <w:rFonts w:ascii="David" w:cs="David" w:eastAsia="David" w:hAnsi="David"/>
+          <w:sz w:val="24"/>
+          <w:szCs w:val="24"/>
+          <w:rtl w:val="false"/>
+        </w:rPr>
+        <w:t xml:space="preserve">Pulzer, P. G. J. (1988). </w:t>
       </w:r>
       <w:r>
         <w:rPr>
@@ -2585,7 +2845,7 @@
           <w:szCs w:val="20"/>
           <w:rtl/>
         </w:rPr>
-        <w:t xml:space="preserve"> (תל אביב: מורשת וספרית פועלים, 1978), עמ' 1-28; David Engel, "Away from a Definition of Antisemitism: An Essay in the Semantics of Historical Description," in Jeremy Cohen and Moshe Rosman (eds.), </w:t>
+        <w:t xml:space="preserve">, מהדורה שנייה (תל אביב: מורשת, 1990), עמ' 1-2; David Engel, "Away from a Definition of Antisemitism: An Essay in the Semantics of Historical Description," in Jeremy Cohen and Moshe Rosman (eds.), </w:t>
       </w:r>
       <w:r>
         <w:rPr>
@@ -3319,7 +3579,7 @@
           <w:szCs w:val="20"/>
           <w:rtl/>
         </w:rPr>
-        <w:t xml:space="preserve">, עמ' 1-46.</w:t>
+        <w:t xml:space="preserve">, עמ' 1-27.</w:t>
       </w:r>
     </w:p>
   </w:footnote>
@@ -3395,7 +3655,7 @@
           <w:szCs w:val="20"/>
           <w:rtl/>
         </w:rPr>
-        <w:t xml:space="preserve">, ציון פה (תש"ף), עמ' 5-30; Engel, "Away from a Definition of Antisemitism," pp. 30-53.</w:t>
+        <w:t xml:space="preserve">, ציון פה (תש"ף), עמ' 73-94; Engel, "Away from a Definition of Antisemitism," pp. 30-53.</w:t>
       </w:r>
     </w:p>
   </w:footnote>
@@ -3609,11 +3869,227 @@
           <w:szCs w:val="20"/>
           <w:rtl w:val="false"/>
         </w:rPr>
-        <w:t xml:space="preserve">, pp. 88-105.</w:t>
+        <w:t xml:space="preserve"> (1988), pp. 88-105.</w:t>
       </w:r>
     </w:p>
   </w:footnote>
   <w:footnote w:id="19">
+    <w:p>
+      <w:pPr>
+        <w:bidi/>
+        <w:spacing w:after="40" w:line="240" w:lineRule="auto"/>
+        <w:jc w:val="both"/>
+      </w:pPr>
+      <w:r>
+        <w:rPr>
+          <w:rStyle w:val="FootnoteReference"/>
+        </w:rPr>
+        <w:footnoteRef/>
+      </w:r>
+      <w:r>
+        <w:rPr>
+          <w:rFonts w:ascii="David" w:cs="David" w:eastAsia="David" w:hAnsi="David"/>
+          <w:sz w:val="20"/>
+          <w:szCs w:val="20"/>
+        </w:rPr>
+        <w:t xml:space="preserve"> </w:t>
+      </w:r>
+      <w:r>
+        <w:rPr>
+          <w:rFonts w:ascii="David" w:cs="David" w:eastAsia="David" w:hAnsi="David"/>
+          <w:sz w:val="20"/>
+          <w:szCs w:val="20"/>
+          <w:rtl/>
+        </w:rPr>
+        <w:t xml:space="preserve">אדולף שטקר, "תביעתנו כלפי היהדות המודרנית" (1879), בתוך: </w:t>
+      </w:r>
+      <w:r>
+        <w:rPr>
+          <w:rFonts w:ascii="David" w:cs="David" w:eastAsia="David" w:hAnsi="David"/>
+          <w:b/>
+          <w:bCs/>
+          <w:i w:val="false"/>
+          <w:iCs w:val="false"/>
+          <w:sz w:val="20"/>
+          <w:szCs w:val="20"/>
+          <w:rtl/>
+        </w:rPr>
+        <w:t xml:space="preserve">מקראת הקורס האנטישמיות במאה ה-19</w:t>
+      </w:r>
+      <w:r>
+        <w:rPr>
+          <w:rFonts w:ascii="David" w:cs="David" w:eastAsia="David" w:hAnsi="David"/>
+          <w:sz w:val="20"/>
+          <w:szCs w:val="20"/>
+          <w:rtl/>
+        </w:rPr>
+        <w:t xml:space="preserve"> (רעננה: האוניברסיטה הפתוחה), עמ' 345-347.</w:t>
+      </w:r>
+    </w:p>
+  </w:footnote>
+  <w:footnote w:id="20">
+    <w:p>
+      <w:pPr>
+        <w:bidi/>
+        <w:spacing w:after="40" w:line="240" w:lineRule="auto"/>
+        <w:jc w:val="both"/>
+      </w:pPr>
+      <w:r>
+        <w:rPr>
+          <w:rStyle w:val="FootnoteReference"/>
+        </w:rPr>
+        <w:footnoteRef/>
+      </w:r>
+      <w:r>
+        <w:rPr>
+          <w:rFonts w:ascii="David" w:cs="David" w:eastAsia="David" w:hAnsi="David"/>
+          <w:sz w:val="20"/>
+          <w:szCs w:val="20"/>
+        </w:rPr>
+        <w:t xml:space="preserve"> </w:t>
+      </w:r>
+      <w:r>
+        <w:rPr>
+          <w:rFonts w:ascii="David" w:cs="David" w:eastAsia="David" w:hAnsi="David"/>
+          <w:sz w:val="20"/>
+          <w:szCs w:val="20"/>
+          <w:rtl/>
+        </w:rPr>
+        <w:t xml:space="preserve">וילהלם מאר, "ניצחון היהדות על הגרמאניות" (1879), בתוך: </w:t>
+      </w:r>
+      <w:r>
+        <w:rPr>
+          <w:rFonts w:ascii="David" w:cs="David" w:eastAsia="David" w:hAnsi="David"/>
+          <w:b/>
+          <w:bCs/>
+          <w:i w:val="false"/>
+          <w:iCs w:val="false"/>
+          <w:sz w:val="20"/>
+          <w:szCs w:val="20"/>
+          <w:rtl/>
+        </w:rPr>
+        <w:t xml:space="preserve">מקראת הקורס האנטישמיות במאה ה-19</w:t>
+      </w:r>
+      <w:r>
+        <w:rPr>
+          <w:rFonts w:ascii="David" w:cs="David" w:eastAsia="David" w:hAnsi="David"/>
+          <w:sz w:val="20"/>
+          <w:szCs w:val="20"/>
+          <w:rtl/>
+        </w:rPr>
+        <w:t xml:space="preserve"> (רעננה: האוניברסיטה הפתוחה), עמ' 349-352.</w:t>
+      </w:r>
+    </w:p>
+  </w:footnote>
+  <w:footnote w:id="21">
+    <w:p>
+      <w:pPr>
+        <w:bidi/>
+        <w:spacing w:after="40" w:line="240" w:lineRule="auto"/>
+        <w:jc w:val="both"/>
+      </w:pPr>
+      <w:r>
+        <w:rPr>
+          <w:rStyle w:val="FootnoteReference"/>
+        </w:rPr>
+        <w:footnoteRef/>
+      </w:r>
+      <w:r>
+        <w:rPr>
+          <w:rFonts w:ascii="David" w:cs="David" w:eastAsia="David" w:hAnsi="David"/>
+          <w:sz w:val="20"/>
+          <w:szCs w:val="20"/>
+        </w:rPr>
+        <w:t xml:space="preserve"> </w:t>
+      </w:r>
+      <w:r>
+        <w:rPr>
+          <w:rFonts w:ascii="David" w:cs="David" w:eastAsia="David" w:hAnsi="David"/>
+          <w:sz w:val="20"/>
+          <w:szCs w:val="20"/>
+          <w:rtl/>
+        </w:rPr>
+        <w:t xml:space="preserve">היינריך פון טרייצ'קה, "דבר על יהדותנו" (1879), בתוך: </w:t>
+      </w:r>
+      <w:r>
+        <w:rPr>
+          <w:rFonts w:ascii="David" w:cs="David" w:eastAsia="David" w:hAnsi="David"/>
+          <w:b/>
+          <w:bCs/>
+          <w:i w:val="false"/>
+          <w:iCs w:val="false"/>
+          <w:sz w:val="20"/>
+          <w:szCs w:val="20"/>
+          <w:rtl/>
+        </w:rPr>
+        <w:t xml:space="preserve">מקראת הקורס האנטישמיות במאה ה-19</w:t>
+      </w:r>
+      <w:r>
+        <w:rPr>
+          <w:rFonts w:ascii="David" w:cs="David" w:eastAsia="David" w:hAnsi="David"/>
+          <w:sz w:val="20"/>
+          <w:szCs w:val="20"/>
+          <w:rtl/>
+        </w:rPr>
+        <w:t xml:space="preserve"> (רעננה: האוניברסיטה הפתוחה), עמ' 357-360.</w:t>
+      </w:r>
+    </w:p>
+  </w:footnote>
+  <w:footnote w:id="22">
+    <w:p>
+      <w:pPr>
+        <w:bidi/>
+        <w:spacing w:after="40" w:line="240" w:lineRule="auto"/>
+        <w:jc w:val="both"/>
+      </w:pPr>
+      <w:r>
+        <w:rPr>
+          <w:rStyle w:val="FootnoteReference"/>
+        </w:rPr>
+        <w:footnoteRef/>
+      </w:r>
+      <w:r>
+        <w:rPr>
+          <w:rFonts w:ascii="David" w:cs="David" w:eastAsia="David" w:hAnsi="David"/>
+          <w:sz w:val="20"/>
+          <w:szCs w:val="20"/>
+        </w:rPr>
+        <w:t xml:space="preserve"> </w:t>
+      </w:r>
+      <w:r>
+        <w:rPr>
+          <w:rFonts w:ascii="David" w:cs="David" w:eastAsia="David" w:hAnsi="David"/>
+          <w:sz w:val="20"/>
+          <w:szCs w:val="20"/>
+          <w:rtl/>
+        </w:rPr>
+        <w:t xml:space="preserve">אויגן דירינג, "שאלת היהודים כשאלת הגזע" (1881), בתוך: </w:t>
+      </w:r>
+      <w:r>
+        <w:rPr>
+          <w:rFonts w:ascii="David" w:cs="David" w:eastAsia="David" w:hAnsi="David"/>
+          <w:b/>
+          <w:bCs/>
+          <w:i w:val="false"/>
+          <w:iCs w:val="false"/>
+          <w:sz w:val="20"/>
+          <w:szCs w:val="20"/>
+          <w:rtl/>
+        </w:rPr>
+        <w:t xml:space="preserve">מקראת הקורס האנטישמיות במאה ה-19</w:t>
+      </w:r>
+      <w:r>
+        <w:rPr>
+          <w:rFonts w:ascii="David" w:cs="David" w:eastAsia="David" w:hAnsi="David"/>
+          <w:sz w:val="20"/>
+          <w:szCs w:val="20"/>
+          <w:rtl/>
+        </w:rPr>
+        <w:t xml:space="preserve"> (רעננה: האוניברסיטה הפתוחה), עמ' 355-356.</w:t>
+      </w:r>
+    </w:p>
+  </w:footnote>
+  <w:footnote w:id="23">
     <w:p>
       <w:pPr>
         <w:bidi w:val="false"/>
@@ -3683,11 +4159,11 @@
           <w:szCs w:val="20"/>
           <w:rtl w:val="false"/>
         </w:rPr>
-        <w:t xml:space="preserve">, pp. 49-52, 92-95.</w:t>
+        <w:t xml:space="preserve"> (1988), pp. 49-52, 92-95.</w:t>
       </w:r>
     </w:p>
   </w:footnote>
-  <w:footnote w:id="20">
+  <w:footnote w:id="24">
     <w:p>
       <w:pPr>
         <w:bidi w:val="false"/>
@@ -3735,11 +4211,107 @@
           <w:szCs w:val="20"/>
           <w:rtl w:val="false"/>
         </w:rPr>
-        <w:t xml:space="preserve">, pp. 106-130.</w:t>
+        <w:t xml:space="preserve"> (1988), pp. 106-130.</w:t>
       </w:r>
     </w:p>
   </w:footnote>
-  <w:footnote w:id="21">
+  <w:footnote w:id="25">
+    <w:p>
+      <w:pPr>
+        <w:bidi/>
+        <w:spacing w:after="40" w:line="240" w:lineRule="auto"/>
+        <w:jc w:val="both"/>
+      </w:pPr>
+      <w:r>
+        <w:rPr>
+          <w:rStyle w:val="FootnoteReference"/>
+        </w:rPr>
+        <w:footnoteRef/>
+      </w:r>
+      <w:r>
+        <w:rPr>
+          <w:rFonts w:ascii="David" w:cs="David" w:eastAsia="David" w:hAnsi="David"/>
+          <w:sz w:val="20"/>
+          <w:szCs w:val="20"/>
+        </w:rPr>
+        <w:t xml:space="preserve"> </w:t>
+      </w:r>
+      <w:r>
+        <w:rPr>
+          <w:rFonts w:ascii="David" w:cs="David" w:eastAsia="David" w:hAnsi="David"/>
+          <w:sz w:val="20"/>
+          <w:szCs w:val="20"/>
+          <w:rtl/>
+        </w:rPr>
+        <w:t xml:space="preserve">"ההכרזה הפומבית על הקמת האגודה המרכזית של אזרחים גרמנים בני הדת היהודית" (26 במאי 1893), בתוך: </w:t>
+      </w:r>
+      <w:r>
+        <w:rPr>
+          <w:rFonts w:ascii="David" w:cs="David" w:eastAsia="David" w:hAnsi="David"/>
+          <w:b/>
+          <w:bCs/>
+          <w:i w:val="false"/>
+          <w:iCs w:val="false"/>
+          <w:sz w:val="20"/>
+          <w:szCs w:val="20"/>
+          <w:rtl/>
+        </w:rPr>
+        <w:t xml:space="preserve">מקראת הקורס האנטישמיות במאה ה-19</w:t>
+      </w:r>
+      <w:r>
+        <w:rPr>
+          <w:rFonts w:ascii="David" w:cs="David" w:eastAsia="David" w:hAnsi="David"/>
+          <w:sz w:val="20"/>
+          <w:szCs w:val="20"/>
+          <w:rtl/>
+        </w:rPr>
+        <w:t xml:space="preserve"> (רעננה: האוניברסיטה הפתוחה), עמ' 363; כ"ץ, </w:t>
+      </w:r>
+      <w:r>
+        <w:rPr>
+          <w:rFonts w:ascii="David" w:cs="David" w:eastAsia="David" w:hAnsi="David"/>
+          <w:b/>
+          <w:bCs/>
+          <w:i w:val="false"/>
+          <w:iCs w:val="false"/>
+          <w:sz w:val="20"/>
+          <w:szCs w:val="20"/>
+          <w:rtl/>
+        </w:rPr>
+        <w:t xml:space="preserve">שנאת ישראל</w:t>
+      </w:r>
+      <w:r>
+        <w:rPr>
+          <w:rFonts w:ascii="David" w:cs="David" w:eastAsia="David" w:hAnsi="David"/>
+          <w:sz w:val="20"/>
+          <w:szCs w:val="20"/>
+          <w:rtl/>
+        </w:rPr>
+        <w:t xml:space="preserve">, עמ' 309-320; Pulzer, </w:t>
+      </w:r>
+      <w:r>
+        <w:rPr>
+          <w:rFonts w:ascii="David" w:cs="David" w:eastAsia="David" w:hAnsi="David"/>
+          <w:i/>
+          <w:iCs/>
+          <w:sz w:val="20"/>
+          <w:szCs w:val="20"/>
+          <w:rtl/>
+        </w:rPr>
+        <w:t xml:space="preserve">The Rise of Political Anti-Semitism</w:t>
+      </w:r>
+      <w:r>
+        <w:rPr>
+          <w:rFonts w:ascii="David" w:cs="David" w:eastAsia="David" w:hAnsi="David"/>
+          <w:sz w:val="20"/>
+          <w:szCs w:val="20"/>
+          <w:rtl/>
+        </w:rPr>
+        <w:t xml:space="preserve"> (1988), pp. 121-130.</w:t>
+      </w:r>
+    </w:p>
+  </w:footnote>
+  <w:footnote w:id="26">
     <w:p>
       <w:pPr>
         <w:bidi w:val="false"/>
@@ -3767,7 +4339,7 @@
           <w:szCs w:val="20"/>
           <w:rtl/>
         </w:rPr>
-        <w:t xml:space="preserve">כ"ץ, </w:t>
+        <w:t xml:space="preserve">שולמית וולקוב, </w:t>
       </w:r>
       <w:r>
         <w:rPr>
@@ -3780,40 +4352,40 @@
           <w:szCs w:val="20"/>
           <w:rtl/>
         </w:rPr>
-        <w:t xml:space="preserve">שנאת ישראל</w:t>
-      </w:r>
-      <w:r>
-        <w:rPr>
-          <w:rFonts w:ascii="David" w:cs="David" w:eastAsia="David" w:hAnsi="David"/>
-          <w:sz w:val="20"/>
-          <w:szCs w:val="20"/>
-          <w:rtl/>
-        </w:rPr>
-        <w:t xml:space="preserve">, עמ' 309-320; Pulzer, </w:t>
-      </w:r>
-      <w:r>
-        <w:rPr>
-          <w:rFonts w:ascii="David" w:cs="David" w:eastAsia="David" w:hAnsi="David"/>
-          <w:i/>
-          <w:iCs/>
-          <w:sz w:val="20"/>
-          <w:szCs w:val="20"/>
-          <w:rtl w:val="false"/>
-        </w:rPr>
-        <w:t xml:space="preserve">The Rise of Political Anti-Semitism</w:t>
-      </w:r>
-      <w:r>
-        <w:rPr>
-          <w:rFonts w:ascii="David" w:cs="David" w:eastAsia="David" w:hAnsi="David"/>
-          <w:sz w:val="20"/>
-          <w:szCs w:val="20"/>
-          <w:rtl w:val="false"/>
-        </w:rPr>
-        <w:t xml:space="preserve">, pp. 121-130.</w:t>
+        <w:t xml:space="preserve">במעגל המכושף: יהודים, אנטישמים וגרמנים אחרים</w:t>
+      </w:r>
+      <w:r>
+        <w:rPr>
+          <w:rFonts w:ascii="David" w:cs="David" w:eastAsia="David" w:hAnsi="David"/>
+          <w:sz w:val="20"/>
+          <w:szCs w:val="20"/>
+          <w:rtl/>
+        </w:rPr>
+        <w:t xml:space="preserve"> (תל אביב: עם עובד, 2002), עמ' 71-98; Shulamit Volkov, "Antisemitism as a Cultural Code: Reflections on the History and Historiography of Antisemitism in Imperial Germany," </w:t>
+      </w:r>
+      <w:r>
+        <w:rPr>
+          <w:rFonts w:ascii="David" w:cs="David" w:eastAsia="David" w:hAnsi="David"/>
+          <w:i/>
+          <w:iCs/>
+          <w:sz w:val="20"/>
+          <w:szCs w:val="20"/>
+          <w:rtl w:val="false"/>
+        </w:rPr>
+        <w:t xml:space="preserve">Leo Baeck Institute Year Book</w:t>
+      </w:r>
+      <w:r>
+        <w:rPr>
+          <w:rFonts w:ascii="David" w:cs="David" w:eastAsia="David" w:hAnsi="David"/>
+          <w:sz w:val="20"/>
+          <w:szCs w:val="20"/>
+          <w:rtl w:val="false"/>
+        </w:rPr>
+        <w:t xml:space="preserve"> 23 (1978), pp. 25-46.</w:t>
       </w:r>
     </w:p>
   </w:footnote>
-  <w:footnote w:id="22">
+  <w:footnote w:id="27">
     <w:p>
       <w:pPr>
         <w:bidi w:val="false"/>
@@ -3841,7 +4413,7 @@
           <w:szCs w:val="20"/>
           <w:rtl/>
         </w:rPr>
-        <w:t xml:space="preserve">שולמית וולקוב, </w:t>
+        <w:t xml:space="preserve">גיא מירון, </w:t>
       </w:r>
       <w:r>
         <w:rPr>
@@ -3854,114 +4426,40 @@
           <w:szCs w:val="20"/>
           <w:rtl/>
         </w:rPr>
-        <w:t xml:space="preserve">במעגל המכושף: יהודים, אנטישמים וגרמנים אחרים</w:t>
-      </w:r>
-      <w:r>
-        <w:rPr>
-          <w:rFonts w:ascii="David" w:cs="David" w:eastAsia="David" w:hAnsi="David"/>
-          <w:sz w:val="20"/>
-          <w:szCs w:val="20"/>
-          <w:rtl/>
-        </w:rPr>
-        <w:t xml:space="preserve"> (תל אביב: עם עובד, 2002), עמ' 71-98; Shulamit Volkov, "Antisemitism as a Cultural Code: Reflections on the History and Historiography of Antisemitism in Imperial Germany," </w:t>
-      </w:r>
-      <w:r>
-        <w:rPr>
-          <w:rFonts w:ascii="David" w:cs="David" w:eastAsia="David" w:hAnsi="David"/>
-          <w:i/>
-          <w:iCs/>
-          <w:sz w:val="20"/>
-          <w:szCs w:val="20"/>
-          <w:rtl w:val="false"/>
-        </w:rPr>
-        <w:t xml:space="preserve">Leo Baeck Institute Year Book</w:t>
-      </w:r>
-      <w:r>
-        <w:rPr>
-          <w:rFonts w:ascii="David" w:cs="David" w:eastAsia="David" w:hAnsi="David"/>
-          <w:sz w:val="20"/>
-          <w:szCs w:val="20"/>
-          <w:rtl w:val="false"/>
-        </w:rPr>
-        <w:t xml:space="preserve"> 23 (1978), pp. 25-46.</w:t>
+        <w:t xml:space="preserve">האנטישמיות במאה ה-19: מדריך למידה</w:t>
+      </w:r>
+      <w:r>
+        <w:rPr>
+          <w:rFonts w:ascii="David" w:cs="David" w:eastAsia="David" w:hAnsi="David"/>
+          <w:sz w:val="20"/>
+          <w:szCs w:val="20"/>
+          <w:rtl/>
+        </w:rPr>
+        <w:t xml:space="preserve"> (רעננה: האוניברסיטה הפתוחה, 2022), עמ' 54-56; Peter G. J. Pulzer, </w:t>
+      </w:r>
+      <w:r>
+        <w:rPr>
+          <w:rFonts w:ascii="David" w:cs="David" w:eastAsia="David" w:hAnsi="David"/>
+          <w:i/>
+          <w:iCs/>
+          <w:sz w:val="20"/>
+          <w:szCs w:val="20"/>
+          <w:rtl w:val="false"/>
+        </w:rPr>
+        <w:t xml:space="preserve">The Rise of Political Anti-Semitism in Germany and Austria</w:t>
+      </w:r>
+      <w:r>
+        <w:rPr>
+          <w:rFonts w:ascii="David" w:cs="David" w:eastAsia="David" w:hAnsi="David"/>
+          <w:sz w:val="20"/>
+          <w:szCs w:val="20"/>
+          <w:rtl w:val="false"/>
+        </w:rPr>
+        <w:t xml:space="preserve"> (New York: John Wiley &amp; Sons, 1964), pp. 122-137.</w:t>
       </w:r>
     </w:p>
   </w:footnote>
-  <w:footnote w:id="23">
-    <w:p>
-      <w:pPr>
-        <w:bidi/>
-        <w:spacing w:after="40" w:line="240" w:lineRule="auto"/>
-        <w:jc w:val="both"/>
-      </w:pPr>
-      <w:r>
-        <w:rPr>
-          <w:rStyle w:val="FootnoteReference"/>
-        </w:rPr>
-        <w:footnoteRef/>
-      </w:r>
-      <w:r>
-        <w:rPr>
-          <w:rFonts w:ascii="David" w:cs="David" w:eastAsia="David" w:hAnsi="David"/>
-          <w:sz w:val="20"/>
-          <w:szCs w:val="20"/>
-        </w:rPr>
-        <w:t xml:space="preserve"> </w:t>
-      </w:r>
-      <w:r>
-        <w:rPr>
-          <w:rFonts w:ascii="David" w:cs="David" w:eastAsia="David" w:hAnsi="David"/>
-          <w:sz w:val="20"/>
-          <w:szCs w:val="20"/>
-          <w:rtl/>
-        </w:rPr>
-        <w:t xml:space="preserve">גיא מירון, </w:t>
-      </w:r>
-      <w:r>
-        <w:rPr>
-          <w:rFonts w:ascii="David" w:cs="David" w:eastAsia="David" w:hAnsi="David"/>
-          <w:b/>
-          <w:bCs/>
-          <w:i w:val="false"/>
-          <w:iCs w:val="false"/>
-          <w:sz w:val="20"/>
-          <w:szCs w:val="20"/>
-          <w:rtl/>
-        </w:rPr>
-        <w:t xml:space="preserve">האנטישמיות במאה ה-19: מדריך למידה</w:t>
-      </w:r>
-      <w:r>
-        <w:rPr>
-          <w:rFonts w:ascii="David" w:cs="David" w:eastAsia="David" w:hAnsi="David"/>
-          <w:sz w:val="20"/>
-          <w:szCs w:val="20"/>
-          <w:rtl/>
-        </w:rPr>
-        <w:t xml:space="preserve"> (רעננה: האוניברסיטה הפתוחה, 2022), עמ' 54-56; Pulzer, </w:t>
-      </w:r>
-      <w:r>
-        <w:rPr>
-          <w:rFonts w:ascii="David" w:cs="David" w:eastAsia="David" w:hAnsi="David"/>
-          <w:i/>
-          <w:iCs/>
-          <w:sz w:val="20"/>
-          <w:szCs w:val="20"/>
-          <w:rtl/>
-        </w:rPr>
-        <w:t xml:space="preserve">The Rise of Political Anti-Semitism</w:t>
-      </w:r>
-      <w:r>
-        <w:rPr>
-          <w:rFonts w:ascii="David" w:cs="David" w:eastAsia="David" w:hAnsi="David"/>
-          <w:sz w:val="20"/>
-          <w:szCs w:val="20"/>
-          <w:rtl/>
-        </w:rPr>
-        <w:t xml:space="preserve">, pp. 148-155.</w:t>
-      </w:r>
-    </w:p>
-  </w:footnote>
-  <w:footnote w:id="24">
+  <w:footnote w:id="28">
     <w:p>
       <w:pPr>
         <w:bidi w:val="false"/>
@@ -4013,7 +4511,7 @@
       </w:r>
     </w:p>
   </w:footnote>
-  <w:footnote w:id="25">
+  <w:footnote w:id="29">
     <w:p>
       <w:pPr>
         <w:bidi w:val="false"/>
@@ -4063,7 +4561,27 @@
           <w:szCs w:val="20"/>
           <w:rtl/>
         </w:rPr>
-        <w:t xml:space="preserve">, עמ' 56-59; Wistrich, </w:t>
+        <w:t xml:space="preserve">, עמ' 56-59; Pulzer, </w:t>
+      </w:r>
+      <w:r>
+        <w:rPr>
+          <w:rFonts w:ascii="David" w:cs="David" w:eastAsia="David" w:hAnsi="David"/>
+          <w:i/>
+          <w:iCs/>
+          <w:sz w:val="20"/>
+          <w:szCs w:val="20"/>
+          <w:rtl w:val="false"/>
+        </w:rPr>
+        <w:t xml:space="preserve">The Rise of Political Anti-Semitism</w:t>
+      </w:r>
+      <w:r>
+        <w:rPr>
+          <w:rFonts w:ascii="David" w:cs="David" w:eastAsia="David" w:hAnsi="David"/>
+          <w:sz w:val="20"/>
+          <w:szCs w:val="20"/>
+          <w:rtl w:val="false"/>
+        </w:rPr>
+        <w:t xml:space="preserve"> (1964), pp. 156-183; Wistrich, </w:t>
       </w:r>
       <w:r>
         <w:rPr>
@@ -4087,7 +4605,7 @@
       </w:r>
     </w:p>
   </w:footnote>
-  <w:footnote w:id="26">
+  <w:footnote w:id="30">
     <w:p>
       <w:pPr>
         <w:bidi w:val="false"/>
@@ -4161,7 +4679,7 @@
       </w:r>
     </w:p>
   </w:footnote>
-  <w:footnote w:id="27">
+  <w:footnote w:id="31">
     <w:p>
       <w:pPr>
         <w:bidi w:val="false"/>
@@ -4231,11 +4749,11 @@
           <w:szCs w:val="20"/>
           <w:rtl w:val="false"/>
         </w:rPr>
-        <w:t xml:space="preserve"> (Berkeley: University of California Press, 1998), pp. 89-95.</w:t>
+        <w:t xml:space="preserve"> (Berkeley: University of California Press, 1998), pp. 91-95.</w:t>
       </w:r>
     </w:p>
   </w:footnote>
-  <w:footnote w:id="28">
+  <w:footnote w:id="32">
     <w:p>
       <w:pPr>
         <w:bidi w:val="false"/>
@@ -4307,7 +4825,7 @@
       </w:r>
     </w:p>
   </w:footnote>
-  <w:footnote w:id="29">
+  <w:footnote w:id="33">
     <w:p>
       <w:pPr>
         <w:bidi/>
@@ -4381,7 +4899,7 @@
       </w:r>
     </w:p>
   </w:footnote>
-  <w:footnote w:id="30">
+  <w:footnote w:id="34">
     <w:p>
       <w:pPr>
         <w:bidi w:val="false"/>
@@ -4453,7 +4971,7 @@
       </w:r>
     </w:p>
   </w:footnote>
-  <w:footnote w:id="31">
+  <w:footnote w:id="35">
     <w:p>
       <w:pPr>
         <w:bidi w:val="false"/>
@@ -4525,7 +5043,7 @@
       </w:r>
     </w:p>
   </w:footnote>
-  <w:footnote w:id="32">
+  <w:footnote w:id="36">
     <w:p>
       <w:pPr>
         <w:bidi w:val="false"/>
@@ -4573,7 +5091,7 @@
           <w:szCs w:val="20"/>
           <w:rtl w:val="false"/>
         </w:rPr>
-        <w:t xml:space="preserve">, pp. 104-106; Michael R. Marrus, </w:t>
+        <w:t xml:space="preserve">, pp. 102-103, 111-112; Michael R. Marrus, </w:t>
       </w:r>
       <w:r>
         <w:rPr>
@@ -4597,7 +5115,7 @@
       </w:r>
     </w:p>
   </w:footnote>
-  <w:footnote w:id="33">
+  <w:footnote w:id="37">
     <w:p>
       <w:pPr>
         <w:bidi w:val="false"/>
@@ -4671,7 +5189,7 @@
       </w:r>
     </w:p>
   </w:footnote>
-  <w:footnote w:id="34">
+  <w:footnote w:id="38">
     <w:p>
       <w:pPr>
         <w:bidi w:val="false"/>
@@ -4739,11 +5257,11 @@
           <w:szCs w:val="20"/>
           <w:rtl w:val="false"/>
         </w:rPr>
-        <w:t xml:space="preserve">, pp. 47-57.</w:t>
+        <w:t xml:space="preserve"> (1988), pp. 47-57.</w:t>
       </w:r>
     </w:p>
   </w:footnote>
-  <w:footnote w:id="35">
+  <w:footnote w:id="39">
     <w:p>
       <w:pPr>
         <w:bidi w:val="false"/>
@@ -4833,7 +5351,7 @@
           <w:szCs w:val="20"/>
           <w:rtl w:val="false"/>
         </w:rPr>
-        <w:t xml:space="preserve">, pp. 47-57.</w:t>
+        <w:t xml:space="preserve"> (1988), pp. 47-57.</w:t>
       </w:r>
     </w:p>
   </w:footnote>

</xml_diff>